<commit_message>
Remove attribution notes from acceptance test remarks
Co-Authored-By: Claude Opus 5.5 <noreply@anthropic.com>
Claude-Session: https://claude.ai/code/session_01DhfrxujFdtSZWrLQm5rNqB
</commit_message>
<xml_diff>
--- a/Замечания_приемочные_испытания.docx
+++ b/Замечания_приемочные_испытания.docx
@@ -1301,7 +1301,7 @@
                 <w:sz w:val="22"/>
                 <w:szCs w:val="22"/>
               </w:rPr>
-              <w:t xml:space="preserve">Запасные части для UIC: поставлен обратный клапан М12 вместо М16 (со слов Якова).</w:t>
+              <w:t xml:space="preserve">Запасные части для UIC: поставлен обратный клапан М12 вместо М16.</w:t>
             </w:r>
           </w:p>
         </w:tc>
@@ -4842,7 +4842,7 @@
           <w:sz w:val="22"/>
           <w:szCs w:val="22"/>
         </w:rPr>
-        <w:t xml:space="preserve">– материальные потоки соответствуют P&amp;ID (со слов Никиты);</w:t>
+        <w:t xml:space="preserve">– материальные потоки соответствуют P&amp;ID;</w:t>
       </w:r>
     </w:p>
     <w:p>
@@ -4856,7 +4856,7 @@
           <w:sz w:val="22"/>
           <w:szCs w:val="22"/>
         </w:rPr>
-        <w:t xml:space="preserve">– обвязка чиллеров (со слов Якова).</w:t>
+        <w:t xml:space="preserve">– обвязка чиллеров.</w:t>
       </w:r>
     </w:p>
     <w:p>

</xml_diff>

<commit_message>
Final revision of acceptance test remarks: add new items and photos
Co-Authored-By: Claude Opus 5.5 <noreply@anthropic.com>
Claude-Session: https://claude.ai/code/session_01DhfrxujFdtSZWrLQm5rNqB
</commit_message>
<xml_diff>
--- a/Замечания_приемочные_испытания.docx
+++ b/Замечания_приемочные_испытания.docx
@@ -2207,37 +2207,127 @@
         </w:trPr>
         <w:tc>
           <w:tcPr>
-            <w:tcW w:type="dxa" w:w="9638"/>
-            <w:gridSpan w:val="4"/>
-            <w:tcBorders>
-              <w:top w:val="single" w:color="808080" w:sz="4"/>
-              <w:left w:val="single" w:color="808080" w:sz="4"/>
-              <w:bottom w:val="single" w:color="808080" w:sz="4"/>
-              <w:right w:val="single" w:color="808080" w:sz="4"/>
-            </w:tcBorders>
-            <w:shd w:fill="F2F2F2" w:color="auto" w:val="clear"/>
-            <w:tcMar>
-              <w:top w:type="dxa" w:w="60"/>
-              <w:left w:type="dxa" w:w="100"/>
-              <w:bottom w:type="dxa" w:w="60"/>
-              <w:right w:type="dxa" w:w="100"/>
-            </w:tcMar>
-            <w:vAlign w:val="top"/>
-          </w:tcPr>
-          <w:p>
-            <w:pPr>
-              <w:keepNext/>
-              <w:spacing w:after="40" w:before="40"/>
-            </w:pPr>
-            <w:r>
-              <w:rPr>
-                <w:rFonts w:ascii="Times New Roman" w:cs="Times New Roman" w:eastAsia="Times New Roman" w:hAnsi="Times New Roman"/>
-                <w:b/>
-                <w:bCs/>
-                <w:sz w:val="22"/>
-                <w:szCs w:val="22"/>
-              </w:rPr>
-              <w:t xml:space="preserve">4. Обвязка трубопроводов</w:t>
+            <w:tcW w:type="dxa" w:w="700"/>
+            <w:tcBorders>
+              <w:top w:val="single" w:color="808080" w:sz="4"/>
+              <w:left w:val="single" w:color="808080" w:sz="4"/>
+              <w:bottom w:val="single" w:color="808080" w:sz="4"/>
+              <w:right w:val="single" w:color="808080" w:sz="4"/>
+            </w:tcBorders>
+            <w:tcMar>
+              <w:top w:type="dxa" w:w="60"/>
+              <w:left w:type="dxa" w:w="100"/>
+              <w:bottom w:type="dxa" w:w="60"/>
+              <w:right w:type="dxa" w:w="100"/>
+            </w:tcMar>
+            <w:vAlign w:val="top"/>
+          </w:tcPr>
+          <w:p>
+            <w:pPr>
+              <w:spacing w:after="40" w:before="40"/>
+              <w:jc w:val="center"/>
+            </w:pPr>
+            <w:r>
+              <w:rPr>
+                <w:rFonts w:ascii="Times New Roman" w:cs="Times New Roman" w:eastAsia="Times New Roman" w:hAnsi="Times New Roman"/>
+                <w:sz w:val="22"/>
+                <w:szCs w:val="22"/>
+              </w:rPr>
+              <w:t xml:space="preserve">3.6</w:t>
+            </w:r>
+          </w:p>
+        </w:tc>
+        <w:tc>
+          <w:tcPr>
+            <w:tcW w:type="dxa" w:w="6138"/>
+            <w:tcBorders>
+              <w:top w:val="single" w:color="808080" w:sz="4"/>
+              <w:left w:val="single" w:color="808080" w:sz="4"/>
+              <w:bottom w:val="single" w:color="808080" w:sz="4"/>
+              <w:right w:val="single" w:color="808080" w:sz="4"/>
+            </w:tcBorders>
+            <w:tcMar>
+              <w:top w:type="dxa" w:w="60"/>
+              <w:left w:type="dxa" w:w="100"/>
+              <w:bottom w:type="dxa" w:w="60"/>
+              <w:right w:type="dxa" w:w="100"/>
+            </w:tcMar>
+            <w:vAlign w:val="top"/>
+          </w:tcPr>
+          <w:p>
+            <w:pPr>
+              <w:spacing w:after="40" w:before="40"/>
+            </w:pPr>
+            <w:r>
+              <w:rPr>
+                <w:rFonts w:ascii="Times New Roman" w:cs="Times New Roman" w:eastAsia="Times New Roman" w:hAnsi="Times New Roman"/>
+                <w:sz w:val="22"/>
+                <w:szCs w:val="22"/>
+              </w:rPr>
+              <w:t xml:space="preserve">Не загнуты лепестки стопорных шайб.</w:t>
+            </w:r>
+          </w:p>
+        </w:tc>
+        <w:tc>
+          <w:tcPr>
+            <w:tcW w:type="dxa" w:w="1000"/>
+            <w:tcBorders>
+              <w:top w:val="single" w:color="808080" w:sz="4"/>
+              <w:left w:val="single" w:color="808080" w:sz="4"/>
+              <w:bottom w:val="single" w:color="808080" w:sz="4"/>
+              <w:right w:val="single" w:color="808080" w:sz="4"/>
+            </w:tcBorders>
+            <w:tcMar>
+              <w:top w:type="dxa" w:w="60"/>
+              <w:left w:type="dxa" w:w="100"/>
+              <w:bottom w:type="dxa" w:w="60"/>
+              <w:right w:type="dxa" w:w="100"/>
+            </w:tcMar>
+            <w:vAlign w:val="top"/>
+          </w:tcPr>
+          <w:p>
+            <w:pPr>
+              <w:spacing w:after="40" w:before="40"/>
+              <w:jc w:val="center"/>
+            </w:pPr>
+            <w:r>
+              <w:rPr>
+                <w:rFonts w:ascii="Times New Roman" w:cs="Times New Roman" w:eastAsia="Times New Roman" w:hAnsi="Times New Roman"/>
+                <w:sz w:val="22"/>
+                <w:szCs w:val="22"/>
+              </w:rPr>
+              <w:t xml:space="preserve">Фото 2</w:t>
+            </w:r>
+          </w:p>
+        </w:tc>
+        <w:tc>
+          <w:tcPr>
+            <w:tcW w:type="dxa" w:w="1800"/>
+            <w:tcBorders>
+              <w:top w:val="single" w:color="808080" w:sz="4"/>
+              <w:left w:val="single" w:color="808080" w:sz="4"/>
+              <w:bottom w:val="single" w:color="808080" w:sz="4"/>
+              <w:right w:val="single" w:color="808080" w:sz="4"/>
+            </w:tcBorders>
+            <w:tcMar>
+              <w:top w:type="dxa" w:w="60"/>
+              <w:left w:type="dxa" w:w="100"/>
+              <w:bottom w:type="dxa" w:w="60"/>
+              <w:right w:type="dxa" w:w="100"/>
+            </w:tcMar>
+            <w:vAlign w:val="top"/>
+          </w:tcPr>
+          <w:p>
+            <w:pPr>
+              <w:spacing w:after="40" w:before="40"/>
+            </w:pPr>
+            <w:r>
+              <w:rPr>
+                <w:rFonts w:ascii="Times New Roman" w:cs="Times New Roman" w:eastAsia="Times New Roman" w:hAnsi="Times New Roman"/>
+                <w:sz w:val="22"/>
+                <w:szCs w:val="22"/>
+              </w:rPr>
+              <w:t xml:space="preserve"/>
             </w:r>
           </w:p>
         </w:tc>
@@ -2274,7 +2364,7 @@
                 <w:sz w:val="22"/>
                 <w:szCs w:val="22"/>
               </w:rPr>
-              <w:t xml:space="preserve">4.1</w:t>
+              <w:t xml:space="preserve">3.7</w:t>
             </w:r>
           </w:p>
         </w:tc>
@@ -2305,7 +2395,7 @@
                 <w:sz w:val="22"/>
                 <w:szCs w:val="22"/>
               </w:rPr>
-              <w:t xml:space="preserve">Трубопровод теплоносителя проложен некорректно: теплоноситель должен подаваться снизу вверх, а после флоуметра поток идёт сверху вниз.</w:t>
+              <w:t xml:space="preserve">Колба затворной жидкости конфликтует с фланцем — подключить к ней подвод жидкости невозможно. На остальных насосах аналогичный конфликт (колбы не установлены).</w:t>
             </w:r>
           </w:p>
         </w:tc>
@@ -2337,7 +2427,7 @@
                 <w:sz w:val="22"/>
                 <w:szCs w:val="22"/>
               </w:rPr>
-              <w:t xml:space="preserve">Фото 2</w:t>
+              <w:t xml:space="preserve">Фото 3</w:t>
             </w:r>
           </w:p>
         </w:tc>
@@ -2379,114 +2469,37 @@
         </w:trPr>
         <w:tc>
           <w:tcPr>
-            <w:tcW w:type="dxa" w:w="700"/>
-            <w:tcBorders>
-              <w:top w:val="single" w:color="808080" w:sz="4"/>
-              <w:left w:val="single" w:color="808080" w:sz="4"/>
-              <w:bottom w:val="single" w:color="808080" w:sz="4"/>
-              <w:right w:val="single" w:color="808080" w:sz="4"/>
-            </w:tcBorders>
-            <w:tcMar>
-              <w:top w:type="dxa" w:w="60"/>
-              <w:left w:type="dxa" w:w="100"/>
-              <w:bottom w:type="dxa" w:w="60"/>
-              <w:right w:type="dxa" w:w="100"/>
-            </w:tcMar>
-            <w:vAlign w:val="top"/>
-          </w:tcPr>
-          <w:p>
-            <w:pPr>
-              <w:spacing w:after="40" w:before="40"/>
-              <w:jc w:val="center"/>
-            </w:pPr>
-            <w:r>
-              <w:rPr>
-                <w:rFonts w:ascii="Times New Roman" w:cs="Times New Roman" w:eastAsia="Times New Roman" w:hAnsi="Times New Roman"/>
-                <w:sz w:val="22"/>
-                <w:szCs w:val="22"/>
-              </w:rPr>
-              <w:t xml:space="preserve">4.2</w:t>
-            </w:r>
-          </w:p>
-        </w:tc>
-        <w:tc>
-          <w:tcPr>
-            <w:tcW w:type="dxa" w:w="6138"/>
-            <w:tcBorders>
-              <w:top w:val="single" w:color="808080" w:sz="4"/>
-              <w:left w:val="single" w:color="808080" w:sz="4"/>
-              <w:bottom w:val="single" w:color="808080" w:sz="4"/>
-              <w:right w:val="single" w:color="808080" w:sz="4"/>
-            </w:tcBorders>
-            <w:tcMar>
-              <w:top w:type="dxa" w:w="60"/>
-              <w:left w:type="dxa" w:w="100"/>
-              <w:bottom w:type="dxa" w:w="60"/>
-              <w:right w:type="dxa" w:w="100"/>
-            </w:tcMar>
-            <w:vAlign w:val="top"/>
-          </w:tcPr>
-          <w:p>
-            <w:pPr>
-              <w:spacing w:after="40" w:before="40"/>
-            </w:pPr>
-            <w:r>
-              <w:rPr>
-                <w:rFonts w:ascii="Times New Roman" w:cs="Times New Roman" w:eastAsia="Times New Roman" w:hAnsi="Times New Roman"/>
-                <w:sz w:val="22"/>
-                <w:szCs w:val="22"/>
-              </w:rPr>
-              <w:t xml:space="preserve">Отсутствуют трубопроводы теплоносителя на кранах и обратных клапанах: BV-001, BV-002, BV-008, BV-011, BV-012, BV-014, BV-015, BV-016, BV-104, BV-106, CV-001, CV-002, CV-004, CV-005, TV-002, TV-003, TV-004, TV-005, HV-002, HV-003, кран на PG-004.</w:t>
-            </w:r>
-          </w:p>
-        </w:tc>
-        <w:tc>
-          <w:tcPr>
-            <w:tcW w:type="dxa" w:w="1000"/>
-            <w:tcBorders>
-              <w:top w:val="single" w:color="808080" w:sz="4"/>
-              <w:left w:val="single" w:color="808080" w:sz="4"/>
-              <w:bottom w:val="single" w:color="808080" w:sz="4"/>
-              <w:right w:val="single" w:color="808080" w:sz="4"/>
-            </w:tcBorders>
-            <w:tcMar>
-              <w:top w:type="dxa" w:w="60"/>
-              <w:left w:type="dxa" w:w="100"/>
-              <w:bottom w:type="dxa" w:w="60"/>
-              <w:right w:type="dxa" w:w="100"/>
-            </w:tcMar>
-            <w:vAlign w:val="top"/>
-          </w:tcPr>
-          <w:p/>
-        </w:tc>
-        <w:tc>
-          <w:tcPr>
-            <w:tcW w:type="dxa" w:w="1800"/>
-            <w:tcBorders>
-              <w:top w:val="single" w:color="808080" w:sz="4"/>
-              <w:left w:val="single" w:color="808080" w:sz="4"/>
-              <w:bottom w:val="single" w:color="808080" w:sz="4"/>
-              <w:right w:val="single" w:color="808080" w:sz="4"/>
-            </w:tcBorders>
-            <w:tcMar>
-              <w:top w:type="dxa" w:w="60"/>
-              <w:left w:type="dxa" w:w="100"/>
-              <w:bottom w:type="dxa" w:w="60"/>
-              <w:right w:type="dxa" w:w="100"/>
-            </w:tcMar>
-            <w:vAlign w:val="top"/>
-          </w:tcPr>
-          <w:p>
-            <w:pPr>
-              <w:spacing w:after="40" w:before="40"/>
-            </w:pPr>
-            <w:r>
-              <w:rPr>
-                <w:rFonts w:ascii="Times New Roman" w:cs="Times New Roman" w:eastAsia="Times New Roman" w:hAnsi="Times New Roman"/>
-                <w:sz w:val="22"/>
-                <w:szCs w:val="22"/>
-              </w:rPr>
-              <w:t xml:space="preserve"/>
+            <w:tcW w:type="dxa" w:w="9638"/>
+            <w:gridSpan w:val="4"/>
+            <w:tcBorders>
+              <w:top w:val="single" w:color="808080" w:sz="4"/>
+              <w:left w:val="single" w:color="808080" w:sz="4"/>
+              <w:bottom w:val="single" w:color="808080" w:sz="4"/>
+              <w:right w:val="single" w:color="808080" w:sz="4"/>
+            </w:tcBorders>
+            <w:shd w:fill="F2F2F2" w:color="auto" w:val="clear"/>
+            <w:tcMar>
+              <w:top w:type="dxa" w:w="60"/>
+              <w:left w:type="dxa" w:w="100"/>
+              <w:bottom w:type="dxa" w:w="60"/>
+              <w:right w:type="dxa" w:w="100"/>
+            </w:tcMar>
+            <w:vAlign w:val="top"/>
+          </w:tcPr>
+          <w:p>
+            <w:pPr>
+              <w:keepNext/>
+              <w:spacing w:after="40" w:before="40"/>
+            </w:pPr>
+            <w:r>
+              <w:rPr>
+                <w:rFonts w:ascii="Times New Roman" w:cs="Times New Roman" w:eastAsia="Times New Roman" w:hAnsi="Times New Roman"/>
+                <w:b/>
+                <w:bCs/>
+                <w:sz w:val="22"/>
+                <w:szCs w:val="22"/>
+              </w:rPr>
+              <w:t xml:space="preserve">4. Обвязка трубопроводов</w:t>
             </w:r>
           </w:p>
         </w:tc>
@@ -2523,7 +2536,7 @@
                 <w:sz w:val="22"/>
                 <w:szCs w:val="22"/>
               </w:rPr>
-              <w:t xml:space="preserve">4.3</w:t>
+              <w:t xml:space="preserve">4.1</w:t>
             </w:r>
           </w:p>
         </w:tc>
@@ -2554,7 +2567,7 @@
                 <w:sz w:val="22"/>
                 <w:szCs w:val="22"/>
               </w:rPr>
-              <w:t xml:space="preserve">Отсутствуют подключения теплоносителя насоса Р-101.</w:t>
+              <w:t xml:space="preserve">Трубопровод теплоносителя проложен некорректно: теплоноситель должен подаваться снизу вверх, а после флоуметра поток идёт сверху вниз.</w:t>
             </w:r>
           </w:p>
         </w:tc>
@@ -2586,7 +2599,7 @@
                 <w:sz w:val="22"/>
                 <w:szCs w:val="22"/>
               </w:rPr>
-              <w:t xml:space="preserve">Фото 3</w:t>
+              <w:t xml:space="preserve">Фото 4</w:t>
             </w:r>
           </w:p>
         </w:tc>
@@ -2654,7 +2667,7 @@
                 <w:sz w:val="22"/>
                 <w:szCs w:val="22"/>
               </w:rPr>
-              <w:t xml:space="preserve">4.4</w:t>
+              <w:t xml:space="preserve">4.2</w:t>
             </w:r>
           </w:p>
         </w:tc>
@@ -2685,7 +2698,7 @@
                 <w:sz w:val="22"/>
                 <w:szCs w:val="22"/>
               </w:rPr>
-              <w:t xml:space="preserve">Отсутствуют подключения теплоносителя на выходе pre-heater 1-го контура.</w:t>
+              <w:t xml:space="preserve">Отсутствуют трубопроводы теплоносителя на кранах и обратных клапанах: BV-001, BV-002, BV-008, BV-011, BV-012, BV-014, BV-015, BV-016, BV-104, BV-106, CV-001, CV-002, CV-004, CV-005, TV-002, TV-003, TV-004, TV-005, HV-002, HV-003, кран на PG-004.</w:t>
             </w:r>
           </w:p>
         </w:tc>
@@ -2706,20 +2719,7 @@
             </w:tcMar>
             <w:vAlign w:val="top"/>
           </w:tcPr>
-          <w:p>
-            <w:pPr>
-              <w:spacing w:after="40" w:before="40"/>
-              <w:jc w:val="center"/>
-            </w:pPr>
-            <w:r>
-              <w:rPr>
-                <w:rFonts w:ascii="Times New Roman" w:cs="Times New Roman" w:eastAsia="Times New Roman" w:hAnsi="Times New Roman"/>
-                <w:sz w:val="22"/>
-                <w:szCs w:val="22"/>
-              </w:rPr>
-              <w:t xml:space="preserve">Фото 4</w:t>
-            </w:r>
-          </w:p>
+          <w:p/>
         </w:tc>
         <w:tc>
           <w:tcPr>
@@ -2785,7 +2785,7 @@
                 <w:sz w:val="22"/>
                 <w:szCs w:val="22"/>
               </w:rPr>
-              <w:t xml:space="preserve">4.5</w:t>
+              <w:t xml:space="preserve">4.3</w:t>
             </w:r>
           </w:p>
         </w:tc>
@@ -2816,7 +2816,7 @@
                 <w:sz w:val="22"/>
                 <w:szCs w:val="22"/>
               </w:rPr>
-              <w:t xml:space="preserve">Отсутствует кран дренажного слива после насоса Р-101.</w:t>
+              <w:t xml:space="preserve">Отсутствуют подключения теплоносителя насоса Р-101.</w:t>
             </w:r>
           </w:p>
         </w:tc>
@@ -2916,7 +2916,7 @@
                 <w:sz w:val="22"/>
                 <w:szCs w:val="22"/>
               </w:rPr>
-              <w:t xml:space="preserve">4.6</w:t>
+              <w:t xml:space="preserve">4.4</w:t>
             </w:r>
           </w:p>
         </w:tc>
@@ -2947,7 +2947,7 @@
                 <w:sz w:val="22"/>
                 <w:szCs w:val="22"/>
               </w:rPr>
-              <w:t xml:space="preserve">Исправить фланец на кране BV-008 (слив тяжёлой фракции 1-й ступени).</w:t>
+              <w:t xml:space="preserve">Отсутствуют подключения теплоносителя на выходе pre-heater 1-го контура.</w:t>
             </w:r>
           </w:p>
         </w:tc>
@@ -3047,7 +3047,7 @@
                 <w:sz w:val="22"/>
                 <w:szCs w:val="22"/>
               </w:rPr>
-              <w:t xml:space="preserve">4.7</w:t>
+              <w:t xml:space="preserve">4.5</w:t>
             </w:r>
           </w:p>
         </w:tc>
@@ -3078,7 +3078,7 @@
                 <w:sz w:val="22"/>
                 <w:szCs w:val="22"/>
               </w:rPr>
-              <w:t xml:space="preserve">Отсутствуют шайбы на фланцевом соединении.</w:t>
+              <w:t xml:space="preserve">Отсутствует кран дренажного слива после насоса Р-101.</w:t>
             </w:r>
           </w:p>
         </w:tc>
@@ -3178,7 +3178,7 @@
                 <w:sz w:val="22"/>
                 <w:szCs w:val="22"/>
               </w:rPr>
-              <w:t xml:space="preserve">4.8</w:t>
+              <w:t xml:space="preserve">4.6</w:t>
             </w:r>
           </w:p>
         </w:tc>
@@ -3209,7 +3209,7 @@
                 <w:sz w:val="22"/>
                 <w:szCs w:val="22"/>
               </w:rPr>
-              <w:t xml:space="preserve">Отсутствуют два болта после флоуметра.</w:t>
+              <w:t xml:space="preserve">Исправить фланец на кране BV-008 (слив тяжёлой фракции 1-й ступени).</w:t>
             </w:r>
           </w:p>
         </w:tc>
@@ -3283,37 +3283,127 @@
         </w:trPr>
         <w:tc>
           <w:tcPr>
-            <w:tcW w:type="dxa" w:w="9638"/>
-            <w:gridSpan w:val="4"/>
-            <w:tcBorders>
-              <w:top w:val="single" w:color="808080" w:sz="4"/>
-              <w:left w:val="single" w:color="808080" w:sz="4"/>
-              <w:bottom w:val="single" w:color="808080" w:sz="4"/>
-              <w:right w:val="single" w:color="808080" w:sz="4"/>
-            </w:tcBorders>
-            <w:shd w:fill="F2F2F2" w:color="auto" w:val="clear"/>
-            <w:tcMar>
-              <w:top w:type="dxa" w:w="60"/>
-              <w:left w:type="dxa" w:w="100"/>
-              <w:bottom w:type="dxa" w:w="60"/>
-              <w:right w:type="dxa" w:w="100"/>
-            </w:tcMar>
-            <w:vAlign w:val="top"/>
-          </w:tcPr>
-          <w:p>
-            <w:pPr>
-              <w:keepNext/>
-              <w:spacing w:after="40" w:before="40"/>
-            </w:pPr>
-            <w:r>
-              <w:rPr>
-                <w:rFonts w:ascii="Times New Roman" w:cs="Times New Roman" w:eastAsia="Times New Roman" w:hAnsi="Times New Roman"/>
-                <w:b/>
-                <w:bCs/>
-                <w:sz w:val="22"/>
-                <w:szCs w:val="22"/>
-              </w:rPr>
-              <w:t xml:space="preserve">5. Электрооборудование</w:t>
+            <w:tcW w:type="dxa" w:w="700"/>
+            <w:tcBorders>
+              <w:top w:val="single" w:color="808080" w:sz="4"/>
+              <w:left w:val="single" w:color="808080" w:sz="4"/>
+              <w:bottom w:val="single" w:color="808080" w:sz="4"/>
+              <w:right w:val="single" w:color="808080" w:sz="4"/>
+            </w:tcBorders>
+            <w:tcMar>
+              <w:top w:type="dxa" w:w="60"/>
+              <w:left w:type="dxa" w:w="100"/>
+              <w:bottom w:type="dxa" w:w="60"/>
+              <w:right w:type="dxa" w:w="100"/>
+            </w:tcMar>
+            <w:vAlign w:val="top"/>
+          </w:tcPr>
+          <w:p>
+            <w:pPr>
+              <w:spacing w:after="40" w:before="40"/>
+              <w:jc w:val="center"/>
+            </w:pPr>
+            <w:r>
+              <w:rPr>
+                <w:rFonts w:ascii="Times New Roman" w:cs="Times New Roman" w:eastAsia="Times New Roman" w:hAnsi="Times New Roman"/>
+                <w:sz w:val="22"/>
+                <w:szCs w:val="22"/>
+              </w:rPr>
+              <w:t xml:space="preserve">4.7</w:t>
+            </w:r>
+          </w:p>
+        </w:tc>
+        <w:tc>
+          <w:tcPr>
+            <w:tcW w:type="dxa" w:w="6138"/>
+            <w:tcBorders>
+              <w:top w:val="single" w:color="808080" w:sz="4"/>
+              <w:left w:val="single" w:color="808080" w:sz="4"/>
+              <w:bottom w:val="single" w:color="808080" w:sz="4"/>
+              <w:right w:val="single" w:color="808080" w:sz="4"/>
+            </w:tcBorders>
+            <w:tcMar>
+              <w:top w:type="dxa" w:w="60"/>
+              <w:left w:type="dxa" w:w="100"/>
+              <w:bottom w:type="dxa" w:w="60"/>
+              <w:right w:type="dxa" w:w="100"/>
+            </w:tcMar>
+            <w:vAlign w:val="top"/>
+          </w:tcPr>
+          <w:p>
+            <w:pPr>
+              <w:spacing w:after="40" w:before="40"/>
+            </w:pPr>
+            <w:r>
+              <w:rPr>
+                <w:rFonts w:ascii="Times New Roman" w:cs="Times New Roman" w:eastAsia="Times New Roman" w:hAnsi="Times New Roman"/>
+                <w:sz w:val="22"/>
+                <w:szCs w:val="22"/>
+              </w:rPr>
+              <w:t xml:space="preserve">Отсутствуют шайбы на фланцевом соединении.</w:t>
+            </w:r>
+          </w:p>
+        </w:tc>
+        <w:tc>
+          <w:tcPr>
+            <w:tcW w:type="dxa" w:w="1000"/>
+            <w:tcBorders>
+              <w:top w:val="single" w:color="808080" w:sz="4"/>
+              <w:left w:val="single" w:color="808080" w:sz="4"/>
+              <w:bottom w:val="single" w:color="808080" w:sz="4"/>
+              <w:right w:val="single" w:color="808080" w:sz="4"/>
+            </w:tcBorders>
+            <w:tcMar>
+              <w:top w:type="dxa" w:w="60"/>
+              <w:left w:type="dxa" w:w="100"/>
+              <w:bottom w:type="dxa" w:w="60"/>
+              <w:right w:type="dxa" w:w="100"/>
+            </w:tcMar>
+            <w:vAlign w:val="top"/>
+          </w:tcPr>
+          <w:p>
+            <w:pPr>
+              <w:spacing w:after="40" w:before="40"/>
+              <w:jc w:val="center"/>
+            </w:pPr>
+            <w:r>
+              <w:rPr>
+                <w:rFonts w:ascii="Times New Roman" w:cs="Times New Roman" w:eastAsia="Times New Roman" w:hAnsi="Times New Roman"/>
+                <w:sz w:val="22"/>
+                <w:szCs w:val="22"/>
+              </w:rPr>
+              <w:t xml:space="preserve">Фото 9</w:t>
+            </w:r>
+          </w:p>
+        </w:tc>
+        <w:tc>
+          <w:tcPr>
+            <w:tcW w:type="dxa" w:w="1800"/>
+            <w:tcBorders>
+              <w:top w:val="single" w:color="808080" w:sz="4"/>
+              <w:left w:val="single" w:color="808080" w:sz="4"/>
+              <w:bottom w:val="single" w:color="808080" w:sz="4"/>
+              <w:right w:val="single" w:color="808080" w:sz="4"/>
+            </w:tcBorders>
+            <w:tcMar>
+              <w:top w:type="dxa" w:w="60"/>
+              <w:left w:type="dxa" w:w="100"/>
+              <w:bottom w:type="dxa" w:w="60"/>
+              <w:right w:type="dxa" w:w="100"/>
+            </w:tcMar>
+            <w:vAlign w:val="top"/>
+          </w:tcPr>
+          <w:p>
+            <w:pPr>
+              <w:spacing w:after="40" w:before="40"/>
+            </w:pPr>
+            <w:r>
+              <w:rPr>
+                <w:rFonts w:ascii="Times New Roman" w:cs="Times New Roman" w:eastAsia="Times New Roman" w:hAnsi="Times New Roman"/>
+                <w:sz w:val="22"/>
+                <w:szCs w:val="22"/>
+              </w:rPr>
+              <w:t xml:space="preserve"/>
             </w:r>
           </w:p>
         </w:tc>
@@ -3350,7 +3440,7 @@
                 <w:sz w:val="22"/>
                 <w:szCs w:val="22"/>
               </w:rPr>
-              <w:t xml:space="preserve">5.1</w:t>
+              <w:t xml:space="preserve">4.8</w:t>
             </w:r>
           </w:p>
         </w:tc>
@@ -3381,7 +3471,7 @@
                 <w:sz w:val="22"/>
                 <w:szCs w:val="22"/>
               </w:rPr>
-              <w:t xml:space="preserve">Бронированные кабели закреплены не полностью (не закреплена броня кабелей).</w:t>
+              <w:t xml:space="preserve">Отсутствуют два болта после флоуметра.</w:t>
             </w:r>
           </w:p>
         </w:tc>
@@ -3413,7 +3503,7 @@
                 <w:sz w:val="22"/>
                 <w:szCs w:val="22"/>
               </w:rPr>
-              <w:t xml:space="preserve">Фото 9</w:t>
+              <w:t xml:space="preserve">Фото 10</w:t>
             </w:r>
           </w:p>
         </w:tc>
@@ -3481,7 +3571,7 @@
                 <w:sz w:val="22"/>
                 <w:szCs w:val="22"/>
               </w:rPr>
-              <w:t xml:space="preserve">5.2</w:t>
+              <w:t xml:space="preserve">4.9</w:t>
             </w:r>
           </w:p>
         </w:tc>
@@ -3512,7 +3602,7 @@
                 <w:sz w:val="22"/>
                 <w:szCs w:val="22"/>
               </w:rPr>
-              <w:t xml:space="preserve">Кабели в лотках не изолированы от окружающей среды — не обеспечено Ex-исполнение.</w:t>
+              <w:t xml:space="preserve">Заменить прямой отвод на отвод 90° для устранения конфликта трубопроводов.</w:t>
             </w:r>
           </w:p>
         </w:tc>
@@ -3533,7 +3623,20 @@
             </w:tcMar>
             <w:vAlign w:val="top"/>
           </w:tcPr>
-          <w:p/>
+          <w:p>
+            <w:pPr>
+              <w:spacing w:after="40" w:before="40"/>
+              <w:jc w:val="center"/>
+            </w:pPr>
+            <w:r>
+              <w:rPr>
+                <w:rFonts w:ascii="Times New Roman" w:cs="Times New Roman" w:eastAsia="Times New Roman" w:hAnsi="Times New Roman"/>
+                <w:sz w:val="22"/>
+                <w:szCs w:val="22"/>
+              </w:rPr>
+              <w:t xml:space="preserve">Фото 11</w:t>
+            </w:r>
+          </w:p>
         </w:tc>
         <w:tc>
           <w:tcPr>
@@ -3599,7 +3702,7 @@
                 <w:sz w:val="22"/>
                 <w:szCs w:val="22"/>
               </w:rPr>
-              <w:t xml:space="preserve">5.3</w:t>
+              <w:t xml:space="preserve">4.10</w:t>
             </w:r>
           </w:p>
         </w:tc>
@@ -3630,7 +3733,7 @@
                 <w:sz w:val="22"/>
                 <w:szCs w:val="22"/>
               </w:rPr>
-              <w:t xml:space="preserve">Отсутствует заземление корпуса.</w:t>
+              <w:t xml:space="preserve">На части фланцевых соединений установлены резиновые прокладки вместо PTFE.</w:t>
             </w:r>
           </w:p>
         </w:tc>
@@ -3651,7 +3754,20 @@
             </w:tcMar>
             <w:vAlign w:val="top"/>
           </w:tcPr>
-          <w:p/>
+          <w:p>
+            <w:pPr>
+              <w:spacing w:after="40" w:before="40"/>
+              <w:jc w:val="center"/>
+            </w:pPr>
+            <w:r>
+              <w:rPr>
+                <w:rFonts w:ascii="Times New Roman" w:cs="Times New Roman" w:eastAsia="Times New Roman" w:hAnsi="Times New Roman"/>
+                <w:sz w:val="22"/>
+                <w:szCs w:val="22"/>
+              </w:rPr>
+              <w:t xml:space="preserve">Фото 12</w:t>
+            </w:r>
+          </w:p>
         </w:tc>
         <w:tc>
           <w:tcPr>
@@ -3717,7 +3833,7 @@
                 <w:sz w:val="22"/>
                 <w:szCs w:val="22"/>
               </w:rPr>
-              <w:t xml:space="preserve">5.4</w:t>
+              <w:t xml:space="preserve">4.11</w:t>
             </w:r>
           </w:p>
         </w:tc>
@@ -3748,7 +3864,7 @@
                 <w:sz w:val="22"/>
                 <w:szCs w:val="22"/>
               </w:rPr>
-              <w:t xml:space="preserve">Перебит кабель датчика температуры — нарушена изоляция.</w:t>
+              <w:t xml:space="preserve">Гибкие подводки установлены со скручиванием, что недопустимо.</w:t>
             </w:r>
           </w:p>
         </w:tc>
@@ -3780,21 +3896,21 @@
                 <w:sz w:val="22"/>
                 <w:szCs w:val="22"/>
               </w:rPr>
-              <w:t xml:space="preserve">Фото 10</w:t>
-            </w:r>
-          </w:p>
-          <w:p>
-            <w:pPr>
-              <w:spacing w:after="40" w:before="40"/>
-              <w:jc w:val="center"/>
-            </w:pPr>
-            <w:r>
-              <w:rPr>
-                <w:rFonts w:ascii="Times New Roman" w:cs="Times New Roman" w:eastAsia="Times New Roman" w:hAnsi="Times New Roman"/>
-                <w:sz w:val="22"/>
-                <w:szCs w:val="22"/>
-              </w:rPr>
-              <w:t xml:space="preserve">Фото 11</w:t>
+              <w:t xml:space="preserve">Фото 13</w:t>
+            </w:r>
+          </w:p>
+          <w:p>
+            <w:pPr>
+              <w:spacing w:after="40" w:before="40"/>
+              <w:jc w:val="center"/>
+            </w:pPr>
+            <w:r>
+              <w:rPr>
+                <w:rFonts w:ascii="Times New Roman" w:cs="Times New Roman" w:eastAsia="Times New Roman" w:hAnsi="Times New Roman"/>
+                <w:sz w:val="22"/>
+                <w:szCs w:val="22"/>
+              </w:rPr>
+              <w:t xml:space="preserve">Фото 14</w:t>
             </w:r>
           </w:p>
         </w:tc>
@@ -3836,6 +3952,47 @@
         </w:trPr>
         <w:tc>
           <w:tcPr>
+            <w:tcW w:type="dxa" w:w="9638"/>
+            <w:gridSpan w:val="4"/>
+            <w:tcBorders>
+              <w:top w:val="single" w:color="808080" w:sz="4"/>
+              <w:left w:val="single" w:color="808080" w:sz="4"/>
+              <w:bottom w:val="single" w:color="808080" w:sz="4"/>
+              <w:right w:val="single" w:color="808080" w:sz="4"/>
+            </w:tcBorders>
+            <w:shd w:fill="F2F2F2" w:color="auto" w:val="clear"/>
+            <w:tcMar>
+              <w:top w:type="dxa" w:w="60"/>
+              <w:left w:type="dxa" w:w="100"/>
+              <w:bottom w:type="dxa" w:w="60"/>
+              <w:right w:type="dxa" w:w="100"/>
+            </w:tcMar>
+            <w:vAlign w:val="top"/>
+          </w:tcPr>
+          <w:p>
+            <w:pPr>
+              <w:keepNext/>
+              <w:spacing w:after="40" w:before="40"/>
+            </w:pPr>
+            <w:r>
+              <w:rPr>
+                <w:rFonts w:ascii="Times New Roman" w:cs="Times New Roman" w:eastAsia="Times New Roman" w:hAnsi="Times New Roman"/>
+                <w:b/>
+                <w:bCs/>
+                <w:sz w:val="22"/>
+                <w:szCs w:val="22"/>
+              </w:rPr>
+              <w:t xml:space="preserve">5. Электрооборудование и КИП</w:t>
+            </w:r>
+          </w:p>
+        </w:tc>
+      </w:tr>
+      <w:tr>
+        <w:trPr>
+          <w:cantSplit/>
+        </w:trPr>
+        <w:tc>
+          <w:tcPr>
             <w:tcW w:type="dxa" w:w="700"/>
             <w:tcBorders>
               <w:top w:val="single" w:color="808080" w:sz="4"/>
@@ -3862,6 +4019,518 @@
                 <w:sz w:val="22"/>
                 <w:szCs w:val="22"/>
               </w:rPr>
+              <w:t xml:space="preserve">5.1</w:t>
+            </w:r>
+          </w:p>
+        </w:tc>
+        <w:tc>
+          <w:tcPr>
+            <w:tcW w:type="dxa" w:w="6138"/>
+            <w:tcBorders>
+              <w:top w:val="single" w:color="808080" w:sz="4"/>
+              <w:left w:val="single" w:color="808080" w:sz="4"/>
+              <w:bottom w:val="single" w:color="808080" w:sz="4"/>
+              <w:right w:val="single" w:color="808080" w:sz="4"/>
+            </w:tcBorders>
+            <w:tcMar>
+              <w:top w:type="dxa" w:w="60"/>
+              <w:left w:type="dxa" w:w="100"/>
+              <w:bottom w:type="dxa" w:w="60"/>
+              <w:right w:type="dxa" w:w="100"/>
+            </w:tcMar>
+            <w:vAlign w:val="top"/>
+          </w:tcPr>
+          <w:p>
+            <w:pPr>
+              <w:spacing w:after="40" w:before="40"/>
+            </w:pPr>
+            <w:r>
+              <w:rPr>
+                <w:rFonts w:ascii="Times New Roman" w:cs="Times New Roman" w:eastAsia="Times New Roman" w:hAnsi="Times New Roman"/>
+                <w:sz w:val="22"/>
+                <w:szCs w:val="22"/>
+              </w:rPr>
+              <w:t xml:space="preserve">Бронированные кабели закреплены не полностью (не закреплена броня кабелей).</w:t>
+            </w:r>
+          </w:p>
+        </w:tc>
+        <w:tc>
+          <w:tcPr>
+            <w:tcW w:type="dxa" w:w="1000"/>
+            <w:tcBorders>
+              <w:top w:val="single" w:color="808080" w:sz="4"/>
+              <w:left w:val="single" w:color="808080" w:sz="4"/>
+              <w:bottom w:val="single" w:color="808080" w:sz="4"/>
+              <w:right w:val="single" w:color="808080" w:sz="4"/>
+            </w:tcBorders>
+            <w:tcMar>
+              <w:top w:type="dxa" w:w="60"/>
+              <w:left w:type="dxa" w:w="100"/>
+              <w:bottom w:type="dxa" w:w="60"/>
+              <w:right w:type="dxa" w:w="100"/>
+            </w:tcMar>
+            <w:vAlign w:val="top"/>
+          </w:tcPr>
+          <w:p>
+            <w:pPr>
+              <w:spacing w:after="40" w:before="40"/>
+              <w:jc w:val="center"/>
+            </w:pPr>
+            <w:r>
+              <w:rPr>
+                <w:rFonts w:ascii="Times New Roman" w:cs="Times New Roman" w:eastAsia="Times New Roman" w:hAnsi="Times New Roman"/>
+                <w:sz w:val="22"/>
+                <w:szCs w:val="22"/>
+              </w:rPr>
+              <w:t xml:space="preserve">Фото 15</w:t>
+            </w:r>
+          </w:p>
+        </w:tc>
+        <w:tc>
+          <w:tcPr>
+            <w:tcW w:type="dxa" w:w="1800"/>
+            <w:tcBorders>
+              <w:top w:val="single" w:color="808080" w:sz="4"/>
+              <w:left w:val="single" w:color="808080" w:sz="4"/>
+              <w:bottom w:val="single" w:color="808080" w:sz="4"/>
+              <w:right w:val="single" w:color="808080" w:sz="4"/>
+            </w:tcBorders>
+            <w:tcMar>
+              <w:top w:type="dxa" w:w="60"/>
+              <w:left w:type="dxa" w:w="100"/>
+              <w:bottom w:type="dxa" w:w="60"/>
+              <w:right w:type="dxa" w:w="100"/>
+            </w:tcMar>
+            <w:vAlign w:val="top"/>
+          </w:tcPr>
+          <w:p>
+            <w:pPr>
+              <w:spacing w:after="40" w:before="40"/>
+            </w:pPr>
+            <w:r>
+              <w:rPr>
+                <w:rFonts w:ascii="Times New Roman" w:cs="Times New Roman" w:eastAsia="Times New Roman" w:hAnsi="Times New Roman"/>
+                <w:sz w:val="22"/>
+                <w:szCs w:val="22"/>
+              </w:rPr>
+              <w:t xml:space="preserve"/>
+            </w:r>
+          </w:p>
+        </w:tc>
+      </w:tr>
+      <w:tr>
+        <w:trPr>
+          <w:cantSplit/>
+        </w:trPr>
+        <w:tc>
+          <w:tcPr>
+            <w:tcW w:type="dxa" w:w="700"/>
+            <w:tcBorders>
+              <w:top w:val="single" w:color="808080" w:sz="4"/>
+              <w:left w:val="single" w:color="808080" w:sz="4"/>
+              <w:bottom w:val="single" w:color="808080" w:sz="4"/>
+              <w:right w:val="single" w:color="808080" w:sz="4"/>
+            </w:tcBorders>
+            <w:tcMar>
+              <w:top w:type="dxa" w:w="60"/>
+              <w:left w:type="dxa" w:w="100"/>
+              <w:bottom w:type="dxa" w:w="60"/>
+              <w:right w:type="dxa" w:w="100"/>
+            </w:tcMar>
+            <w:vAlign w:val="top"/>
+          </w:tcPr>
+          <w:p>
+            <w:pPr>
+              <w:spacing w:after="40" w:before="40"/>
+              <w:jc w:val="center"/>
+            </w:pPr>
+            <w:r>
+              <w:rPr>
+                <w:rFonts w:ascii="Times New Roman" w:cs="Times New Roman" w:eastAsia="Times New Roman" w:hAnsi="Times New Roman"/>
+                <w:sz w:val="22"/>
+                <w:szCs w:val="22"/>
+              </w:rPr>
+              <w:t xml:space="preserve">5.2</w:t>
+            </w:r>
+          </w:p>
+        </w:tc>
+        <w:tc>
+          <w:tcPr>
+            <w:tcW w:type="dxa" w:w="6138"/>
+            <w:tcBorders>
+              <w:top w:val="single" w:color="808080" w:sz="4"/>
+              <w:left w:val="single" w:color="808080" w:sz="4"/>
+              <w:bottom w:val="single" w:color="808080" w:sz="4"/>
+              <w:right w:val="single" w:color="808080" w:sz="4"/>
+            </w:tcBorders>
+            <w:tcMar>
+              <w:top w:type="dxa" w:w="60"/>
+              <w:left w:type="dxa" w:w="100"/>
+              <w:bottom w:type="dxa" w:w="60"/>
+              <w:right w:type="dxa" w:w="100"/>
+            </w:tcMar>
+            <w:vAlign w:val="top"/>
+          </w:tcPr>
+          <w:p>
+            <w:pPr>
+              <w:spacing w:after="40" w:before="40"/>
+            </w:pPr>
+            <w:r>
+              <w:rPr>
+                <w:rFonts w:ascii="Times New Roman" w:cs="Times New Roman" w:eastAsia="Times New Roman" w:hAnsi="Times New Roman"/>
+                <w:sz w:val="22"/>
+                <w:szCs w:val="22"/>
+              </w:rPr>
+              <w:t xml:space="preserve">Кабели в лотках не изолированы от окружающей среды — не обеспечено Ex-исполнение.</w:t>
+            </w:r>
+          </w:p>
+        </w:tc>
+        <w:tc>
+          <w:tcPr>
+            <w:tcW w:type="dxa" w:w="1000"/>
+            <w:tcBorders>
+              <w:top w:val="single" w:color="808080" w:sz="4"/>
+              <w:left w:val="single" w:color="808080" w:sz="4"/>
+              <w:bottom w:val="single" w:color="808080" w:sz="4"/>
+              <w:right w:val="single" w:color="808080" w:sz="4"/>
+            </w:tcBorders>
+            <w:tcMar>
+              <w:top w:type="dxa" w:w="60"/>
+              <w:left w:type="dxa" w:w="100"/>
+              <w:bottom w:type="dxa" w:w="60"/>
+              <w:right w:type="dxa" w:w="100"/>
+            </w:tcMar>
+            <w:vAlign w:val="top"/>
+          </w:tcPr>
+          <w:p/>
+        </w:tc>
+        <w:tc>
+          <w:tcPr>
+            <w:tcW w:type="dxa" w:w="1800"/>
+            <w:tcBorders>
+              <w:top w:val="single" w:color="808080" w:sz="4"/>
+              <w:left w:val="single" w:color="808080" w:sz="4"/>
+              <w:bottom w:val="single" w:color="808080" w:sz="4"/>
+              <w:right w:val="single" w:color="808080" w:sz="4"/>
+            </w:tcBorders>
+            <w:tcMar>
+              <w:top w:type="dxa" w:w="60"/>
+              <w:left w:type="dxa" w:w="100"/>
+              <w:bottom w:type="dxa" w:w="60"/>
+              <w:right w:type="dxa" w:w="100"/>
+            </w:tcMar>
+            <w:vAlign w:val="top"/>
+          </w:tcPr>
+          <w:p>
+            <w:pPr>
+              <w:spacing w:after="40" w:before="40"/>
+            </w:pPr>
+            <w:r>
+              <w:rPr>
+                <w:rFonts w:ascii="Times New Roman" w:cs="Times New Roman" w:eastAsia="Times New Roman" w:hAnsi="Times New Roman"/>
+                <w:sz w:val="22"/>
+                <w:szCs w:val="22"/>
+              </w:rPr>
+              <w:t xml:space="preserve"/>
+            </w:r>
+          </w:p>
+        </w:tc>
+      </w:tr>
+      <w:tr>
+        <w:trPr>
+          <w:cantSplit/>
+        </w:trPr>
+        <w:tc>
+          <w:tcPr>
+            <w:tcW w:type="dxa" w:w="700"/>
+            <w:tcBorders>
+              <w:top w:val="single" w:color="808080" w:sz="4"/>
+              <w:left w:val="single" w:color="808080" w:sz="4"/>
+              <w:bottom w:val="single" w:color="808080" w:sz="4"/>
+              <w:right w:val="single" w:color="808080" w:sz="4"/>
+            </w:tcBorders>
+            <w:tcMar>
+              <w:top w:type="dxa" w:w="60"/>
+              <w:left w:type="dxa" w:w="100"/>
+              <w:bottom w:type="dxa" w:w="60"/>
+              <w:right w:type="dxa" w:w="100"/>
+            </w:tcMar>
+            <w:vAlign w:val="top"/>
+          </w:tcPr>
+          <w:p>
+            <w:pPr>
+              <w:spacing w:after="40" w:before="40"/>
+              <w:jc w:val="center"/>
+            </w:pPr>
+            <w:r>
+              <w:rPr>
+                <w:rFonts w:ascii="Times New Roman" w:cs="Times New Roman" w:eastAsia="Times New Roman" w:hAnsi="Times New Roman"/>
+                <w:sz w:val="22"/>
+                <w:szCs w:val="22"/>
+              </w:rPr>
+              <w:t xml:space="preserve">5.3</w:t>
+            </w:r>
+          </w:p>
+        </w:tc>
+        <w:tc>
+          <w:tcPr>
+            <w:tcW w:type="dxa" w:w="6138"/>
+            <w:tcBorders>
+              <w:top w:val="single" w:color="808080" w:sz="4"/>
+              <w:left w:val="single" w:color="808080" w:sz="4"/>
+              <w:bottom w:val="single" w:color="808080" w:sz="4"/>
+              <w:right w:val="single" w:color="808080" w:sz="4"/>
+            </w:tcBorders>
+            <w:tcMar>
+              <w:top w:type="dxa" w:w="60"/>
+              <w:left w:type="dxa" w:w="100"/>
+              <w:bottom w:type="dxa" w:w="60"/>
+              <w:right w:type="dxa" w:w="100"/>
+            </w:tcMar>
+            <w:vAlign w:val="top"/>
+          </w:tcPr>
+          <w:p>
+            <w:pPr>
+              <w:spacing w:after="40" w:before="40"/>
+            </w:pPr>
+            <w:r>
+              <w:rPr>
+                <w:rFonts w:ascii="Times New Roman" w:cs="Times New Roman" w:eastAsia="Times New Roman" w:hAnsi="Times New Roman"/>
+                <w:sz w:val="22"/>
+                <w:szCs w:val="22"/>
+              </w:rPr>
+              <w:t xml:space="preserve">Отсутствует заземление корпуса.</w:t>
+            </w:r>
+          </w:p>
+        </w:tc>
+        <w:tc>
+          <w:tcPr>
+            <w:tcW w:type="dxa" w:w="1000"/>
+            <w:tcBorders>
+              <w:top w:val="single" w:color="808080" w:sz="4"/>
+              <w:left w:val="single" w:color="808080" w:sz="4"/>
+              <w:bottom w:val="single" w:color="808080" w:sz="4"/>
+              <w:right w:val="single" w:color="808080" w:sz="4"/>
+            </w:tcBorders>
+            <w:tcMar>
+              <w:top w:type="dxa" w:w="60"/>
+              <w:left w:type="dxa" w:w="100"/>
+              <w:bottom w:type="dxa" w:w="60"/>
+              <w:right w:type="dxa" w:w="100"/>
+            </w:tcMar>
+            <w:vAlign w:val="top"/>
+          </w:tcPr>
+          <w:p/>
+        </w:tc>
+        <w:tc>
+          <w:tcPr>
+            <w:tcW w:type="dxa" w:w="1800"/>
+            <w:tcBorders>
+              <w:top w:val="single" w:color="808080" w:sz="4"/>
+              <w:left w:val="single" w:color="808080" w:sz="4"/>
+              <w:bottom w:val="single" w:color="808080" w:sz="4"/>
+              <w:right w:val="single" w:color="808080" w:sz="4"/>
+            </w:tcBorders>
+            <w:tcMar>
+              <w:top w:type="dxa" w:w="60"/>
+              <w:left w:type="dxa" w:w="100"/>
+              <w:bottom w:type="dxa" w:w="60"/>
+              <w:right w:type="dxa" w:w="100"/>
+            </w:tcMar>
+            <w:vAlign w:val="top"/>
+          </w:tcPr>
+          <w:p>
+            <w:pPr>
+              <w:spacing w:after="40" w:before="40"/>
+            </w:pPr>
+            <w:r>
+              <w:rPr>
+                <w:rFonts w:ascii="Times New Roman" w:cs="Times New Roman" w:eastAsia="Times New Roman" w:hAnsi="Times New Roman"/>
+                <w:sz w:val="22"/>
+                <w:szCs w:val="22"/>
+              </w:rPr>
+              <w:t xml:space="preserve"/>
+            </w:r>
+          </w:p>
+        </w:tc>
+      </w:tr>
+      <w:tr>
+        <w:trPr>
+          <w:cantSplit/>
+        </w:trPr>
+        <w:tc>
+          <w:tcPr>
+            <w:tcW w:type="dxa" w:w="700"/>
+            <w:tcBorders>
+              <w:top w:val="single" w:color="808080" w:sz="4"/>
+              <w:left w:val="single" w:color="808080" w:sz="4"/>
+              <w:bottom w:val="single" w:color="808080" w:sz="4"/>
+              <w:right w:val="single" w:color="808080" w:sz="4"/>
+            </w:tcBorders>
+            <w:tcMar>
+              <w:top w:type="dxa" w:w="60"/>
+              <w:left w:type="dxa" w:w="100"/>
+              <w:bottom w:type="dxa" w:w="60"/>
+              <w:right w:type="dxa" w:w="100"/>
+            </w:tcMar>
+            <w:vAlign w:val="top"/>
+          </w:tcPr>
+          <w:p>
+            <w:pPr>
+              <w:spacing w:after="40" w:before="40"/>
+              <w:jc w:val="center"/>
+            </w:pPr>
+            <w:r>
+              <w:rPr>
+                <w:rFonts w:ascii="Times New Roman" w:cs="Times New Roman" w:eastAsia="Times New Roman" w:hAnsi="Times New Roman"/>
+                <w:sz w:val="22"/>
+                <w:szCs w:val="22"/>
+              </w:rPr>
+              <w:t xml:space="preserve">5.4</w:t>
+            </w:r>
+          </w:p>
+        </w:tc>
+        <w:tc>
+          <w:tcPr>
+            <w:tcW w:type="dxa" w:w="6138"/>
+            <w:tcBorders>
+              <w:top w:val="single" w:color="808080" w:sz="4"/>
+              <w:left w:val="single" w:color="808080" w:sz="4"/>
+              <w:bottom w:val="single" w:color="808080" w:sz="4"/>
+              <w:right w:val="single" w:color="808080" w:sz="4"/>
+            </w:tcBorders>
+            <w:tcMar>
+              <w:top w:type="dxa" w:w="60"/>
+              <w:left w:type="dxa" w:w="100"/>
+              <w:bottom w:type="dxa" w:w="60"/>
+              <w:right w:type="dxa" w:w="100"/>
+            </w:tcMar>
+            <w:vAlign w:val="top"/>
+          </w:tcPr>
+          <w:p>
+            <w:pPr>
+              <w:spacing w:after="40" w:before="40"/>
+            </w:pPr>
+            <w:r>
+              <w:rPr>
+                <w:rFonts w:ascii="Times New Roman" w:cs="Times New Roman" w:eastAsia="Times New Roman" w:hAnsi="Times New Roman"/>
+                <w:sz w:val="22"/>
+                <w:szCs w:val="22"/>
+              </w:rPr>
+              <w:t xml:space="preserve">Перебит кабель датчика температуры — нарушена изоляция.</w:t>
+            </w:r>
+          </w:p>
+        </w:tc>
+        <w:tc>
+          <w:tcPr>
+            <w:tcW w:type="dxa" w:w="1000"/>
+            <w:tcBorders>
+              <w:top w:val="single" w:color="808080" w:sz="4"/>
+              <w:left w:val="single" w:color="808080" w:sz="4"/>
+              <w:bottom w:val="single" w:color="808080" w:sz="4"/>
+              <w:right w:val="single" w:color="808080" w:sz="4"/>
+            </w:tcBorders>
+            <w:tcMar>
+              <w:top w:type="dxa" w:w="60"/>
+              <w:left w:type="dxa" w:w="100"/>
+              <w:bottom w:type="dxa" w:w="60"/>
+              <w:right w:type="dxa" w:w="100"/>
+            </w:tcMar>
+            <w:vAlign w:val="top"/>
+          </w:tcPr>
+          <w:p>
+            <w:pPr>
+              <w:spacing w:after="40" w:before="40"/>
+              <w:jc w:val="center"/>
+            </w:pPr>
+            <w:r>
+              <w:rPr>
+                <w:rFonts w:ascii="Times New Roman" w:cs="Times New Roman" w:eastAsia="Times New Roman" w:hAnsi="Times New Roman"/>
+                <w:sz w:val="22"/>
+                <w:szCs w:val="22"/>
+              </w:rPr>
+              <w:t xml:space="preserve">Фото 16</w:t>
+            </w:r>
+          </w:p>
+          <w:p>
+            <w:pPr>
+              <w:spacing w:after="40" w:before="40"/>
+              <w:jc w:val="center"/>
+            </w:pPr>
+            <w:r>
+              <w:rPr>
+                <w:rFonts w:ascii="Times New Roman" w:cs="Times New Roman" w:eastAsia="Times New Roman" w:hAnsi="Times New Roman"/>
+                <w:sz w:val="22"/>
+                <w:szCs w:val="22"/>
+              </w:rPr>
+              <w:t xml:space="preserve">Фото 17</w:t>
+            </w:r>
+          </w:p>
+        </w:tc>
+        <w:tc>
+          <w:tcPr>
+            <w:tcW w:type="dxa" w:w="1800"/>
+            <w:tcBorders>
+              <w:top w:val="single" w:color="808080" w:sz="4"/>
+              <w:left w:val="single" w:color="808080" w:sz="4"/>
+              <w:bottom w:val="single" w:color="808080" w:sz="4"/>
+              <w:right w:val="single" w:color="808080" w:sz="4"/>
+            </w:tcBorders>
+            <w:tcMar>
+              <w:top w:type="dxa" w:w="60"/>
+              <w:left w:type="dxa" w:w="100"/>
+              <w:bottom w:type="dxa" w:w="60"/>
+              <w:right w:type="dxa" w:w="100"/>
+            </w:tcMar>
+            <w:vAlign w:val="top"/>
+          </w:tcPr>
+          <w:p>
+            <w:pPr>
+              <w:spacing w:after="40" w:before="40"/>
+            </w:pPr>
+            <w:r>
+              <w:rPr>
+                <w:rFonts w:ascii="Times New Roman" w:cs="Times New Roman" w:eastAsia="Times New Roman" w:hAnsi="Times New Roman"/>
+                <w:sz w:val="22"/>
+                <w:szCs w:val="22"/>
+              </w:rPr>
+              <w:t xml:space="preserve"/>
+            </w:r>
+          </w:p>
+        </w:tc>
+      </w:tr>
+      <w:tr>
+        <w:trPr>
+          <w:cantSplit/>
+        </w:trPr>
+        <w:tc>
+          <w:tcPr>
+            <w:tcW w:type="dxa" w:w="700"/>
+            <w:tcBorders>
+              <w:top w:val="single" w:color="808080" w:sz="4"/>
+              <w:left w:val="single" w:color="808080" w:sz="4"/>
+              <w:bottom w:val="single" w:color="808080" w:sz="4"/>
+              <w:right w:val="single" w:color="808080" w:sz="4"/>
+            </w:tcBorders>
+            <w:tcMar>
+              <w:top w:type="dxa" w:w="60"/>
+              <w:left w:type="dxa" w:w="100"/>
+              <w:bottom w:type="dxa" w:w="60"/>
+              <w:right w:type="dxa" w:w="100"/>
+            </w:tcMar>
+            <w:vAlign w:val="top"/>
+          </w:tcPr>
+          <w:p>
+            <w:pPr>
+              <w:spacing w:after="40" w:before="40"/>
+              <w:jc w:val="center"/>
+            </w:pPr>
+            <w:r>
+              <w:rPr>
+                <w:rFonts w:ascii="Times New Roman" w:cs="Times New Roman" w:eastAsia="Times New Roman" w:hAnsi="Times New Roman"/>
+                <w:sz w:val="22"/>
+                <w:szCs w:val="22"/>
+              </w:rPr>
               <w:t xml:space="preserve">5.5</w:t>
             </w:r>
           </w:p>
@@ -3925,7 +4594,138 @@
                 <w:sz w:val="22"/>
                 <w:szCs w:val="22"/>
               </w:rPr>
-              <w:t xml:space="preserve">Фото 12</w:t>
+              <w:t xml:space="preserve">Фото 18</w:t>
+            </w:r>
+          </w:p>
+        </w:tc>
+        <w:tc>
+          <w:tcPr>
+            <w:tcW w:type="dxa" w:w="1800"/>
+            <w:tcBorders>
+              <w:top w:val="single" w:color="808080" w:sz="4"/>
+              <w:left w:val="single" w:color="808080" w:sz="4"/>
+              <w:bottom w:val="single" w:color="808080" w:sz="4"/>
+              <w:right w:val="single" w:color="808080" w:sz="4"/>
+            </w:tcBorders>
+            <w:tcMar>
+              <w:top w:type="dxa" w:w="60"/>
+              <w:left w:type="dxa" w:w="100"/>
+              <w:bottom w:type="dxa" w:w="60"/>
+              <w:right w:type="dxa" w:w="100"/>
+            </w:tcMar>
+            <w:vAlign w:val="top"/>
+          </w:tcPr>
+          <w:p>
+            <w:pPr>
+              <w:spacing w:after="40" w:before="40"/>
+            </w:pPr>
+            <w:r>
+              <w:rPr>
+                <w:rFonts w:ascii="Times New Roman" w:cs="Times New Roman" w:eastAsia="Times New Roman" w:hAnsi="Times New Roman"/>
+                <w:sz w:val="22"/>
+                <w:szCs w:val="22"/>
+              </w:rPr>
+              <w:t xml:space="preserve"/>
+            </w:r>
+          </w:p>
+        </w:tc>
+      </w:tr>
+      <w:tr>
+        <w:trPr>
+          <w:cantSplit/>
+        </w:trPr>
+        <w:tc>
+          <w:tcPr>
+            <w:tcW w:type="dxa" w:w="700"/>
+            <w:tcBorders>
+              <w:top w:val="single" w:color="808080" w:sz="4"/>
+              <w:left w:val="single" w:color="808080" w:sz="4"/>
+              <w:bottom w:val="single" w:color="808080" w:sz="4"/>
+              <w:right w:val="single" w:color="808080" w:sz="4"/>
+            </w:tcBorders>
+            <w:tcMar>
+              <w:top w:type="dxa" w:w="60"/>
+              <w:left w:type="dxa" w:w="100"/>
+              <w:bottom w:type="dxa" w:w="60"/>
+              <w:right w:type="dxa" w:w="100"/>
+            </w:tcMar>
+            <w:vAlign w:val="top"/>
+          </w:tcPr>
+          <w:p>
+            <w:pPr>
+              <w:spacing w:after="40" w:before="40"/>
+              <w:jc w:val="center"/>
+            </w:pPr>
+            <w:r>
+              <w:rPr>
+                <w:rFonts w:ascii="Times New Roman" w:cs="Times New Roman" w:eastAsia="Times New Roman" w:hAnsi="Times New Roman"/>
+                <w:sz w:val="22"/>
+                <w:szCs w:val="22"/>
+              </w:rPr>
+              <w:t xml:space="preserve">5.6</w:t>
+            </w:r>
+          </w:p>
+        </w:tc>
+        <w:tc>
+          <w:tcPr>
+            <w:tcW w:type="dxa" w:w="6138"/>
+            <w:tcBorders>
+              <w:top w:val="single" w:color="808080" w:sz="4"/>
+              <w:left w:val="single" w:color="808080" w:sz="4"/>
+              <w:bottom w:val="single" w:color="808080" w:sz="4"/>
+              <w:right w:val="single" w:color="808080" w:sz="4"/>
+            </w:tcBorders>
+            <w:tcMar>
+              <w:top w:type="dxa" w:w="60"/>
+              <w:left w:type="dxa" w:w="100"/>
+              <w:bottom w:type="dxa" w:w="60"/>
+              <w:right w:type="dxa" w:w="100"/>
+            </w:tcMar>
+            <w:vAlign w:val="top"/>
+          </w:tcPr>
+          <w:p>
+            <w:pPr>
+              <w:spacing w:after="40" w:before="40"/>
+            </w:pPr>
+            <w:r>
+              <w:rPr>
+                <w:rFonts w:ascii="Times New Roman" w:cs="Times New Roman" w:eastAsia="Times New Roman" w:hAnsi="Times New Roman"/>
+                <w:sz w:val="22"/>
+                <w:szCs w:val="22"/>
+              </w:rPr>
+              <w:t xml:space="preserve">Отсутствует маркировка на датчиках Пирани.</w:t>
+            </w:r>
+          </w:p>
+        </w:tc>
+        <w:tc>
+          <w:tcPr>
+            <w:tcW w:type="dxa" w:w="1000"/>
+            <w:tcBorders>
+              <w:top w:val="single" w:color="808080" w:sz="4"/>
+              <w:left w:val="single" w:color="808080" w:sz="4"/>
+              <w:bottom w:val="single" w:color="808080" w:sz="4"/>
+              <w:right w:val="single" w:color="808080" w:sz="4"/>
+            </w:tcBorders>
+            <w:tcMar>
+              <w:top w:type="dxa" w:w="60"/>
+              <w:left w:type="dxa" w:w="100"/>
+              <w:bottom w:type="dxa" w:w="60"/>
+              <w:right w:type="dxa" w:w="100"/>
+            </w:tcMar>
+            <w:vAlign w:val="top"/>
+          </w:tcPr>
+          <w:p>
+            <w:pPr>
+              <w:spacing w:after="40" w:before="40"/>
+              <w:jc w:val="center"/>
+            </w:pPr>
+            <w:r>
+              <w:rPr>
+                <w:rFonts w:ascii="Times New Roman" w:cs="Times New Roman" w:eastAsia="Times New Roman" w:hAnsi="Times New Roman"/>
+                <w:sz w:val="22"/>
+                <w:szCs w:val="22"/>
+              </w:rPr>
+              <w:t xml:space="preserve">Фото 19</w:t>
             </w:r>
           </w:p>
         </w:tc>
@@ -5061,9 +5861,9 @@
             <w:r>
               <w:drawing>
                 <wp:inline distT="0" distB="0" distL="0" distR="0">
-                  <wp:extent cx="2000250" cy="2667000"/>
+                  <wp:extent cx="2009775" cy="2667000"/>
                   <wp:effectExtent t="0" r="0" b="0" l="0"/>
-                  <wp:docPr id="1" name="foto3" descr="Поток теплоносителя после флоуметра идёт сверху вниз" title="Фото 2"/>
+                  <wp:docPr id="1" name="foto13" descr="Не загнуты лепестки стопорных шайб" title="Фото 2"/>
                   <wp:cNvGraphicFramePr>
                     <a:graphicFrameLocks xmlns:a="http://schemas.openxmlformats.org/drawingml/2006/main" noChangeAspect="1"/>
                   </wp:cNvGraphicFramePr>
@@ -5086,7 +5886,7 @@
                         <pic:spPr bwMode="auto">
                           <a:xfrm>
                             <a:off x="0" y="0"/>
-                            <a:ext cx="2000250" cy="2667000"/>
+                            <a:ext cx="2009775" cy="2667000"/>
                           </a:xfrm>
                           <a:prstGeom prst="rect">
                             <a:avLst/>
@@ -5120,7 +5920,7 @@
                 <w:sz w:val="20"/>
                 <w:szCs w:val="20"/>
               </w:rPr>
-              <w:t xml:space="preserve">Поток теплоносителя после флоуметра идёт сверху вниз (п. 4.1)</w:t>
+              <w:t xml:space="preserve">Не загнуты лепестки стопорных шайб (п. 3.6)</w:t>
             </w:r>
           </w:p>
         </w:tc>
@@ -5155,7 +5955,7 @@
                 <wp:inline distT="0" distB="0" distL="0" distR="0">
                   <wp:extent cx="2000250" cy="2667000"/>
                   <wp:effectExtent t="0" r="0" b="0" l="0"/>
-                  <wp:docPr id="1" name="foto4" descr="Отсутствуют подключения теплоносителя насоса Р-101" title="Фото 3"/>
+                  <wp:docPr id="1" name="foto15" descr="Конфликт колбы затворной жидкости с фланцем" title="Фото 3"/>
                   <wp:cNvGraphicFramePr>
                     <a:graphicFrameLocks xmlns:a="http://schemas.openxmlformats.org/drawingml/2006/main" noChangeAspect="1"/>
                   </wp:cNvGraphicFramePr>
@@ -5212,7 +6012,7 @@
                 <w:sz w:val="20"/>
                 <w:szCs w:val="20"/>
               </w:rPr>
-              <w:t xml:space="preserve">Отсутствуют подключения теплоносителя насоса Р-101 (п. 4.3)</w:t>
+              <w:t xml:space="preserve">Конфликт колбы затворной жидкости с фланцем (п. 3.7)</w:t>
             </w:r>
           </w:p>
         </w:tc>
@@ -5242,7 +6042,7 @@
                 <wp:inline distT="0" distB="0" distL="0" distR="0">
                   <wp:extent cx="2000250" cy="2667000"/>
                   <wp:effectExtent t="0" r="0" b="0" l="0"/>
-                  <wp:docPr id="1" name="foto7" descr="Отсутствуют подключения теплоносителя на выходе pre-heater 1-го контура" title="Фото 4"/>
+                  <wp:docPr id="1" name="foto3" descr="Поток теплоносителя после флоуметра идёт сверху вниз" title="Фото 4"/>
                   <wp:cNvGraphicFramePr>
                     <a:graphicFrameLocks xmlns:a="http://schemas.openxmlformats.org/drawingml/2006/main" noChangeAspect="1"/>
                   </wp:cNvGraphicFramePr>
@@ -5299,7 +6099,7 @@
                 <w:sz w:val="20"/>
                 <w:szCs w:val="20"/>
               </w:rPr>
-              <w:t xml:space="preserve">Отсутствуют подключения теплоносителя на выходе pre-heater 1-го контура (п. 4.4)</w:t>
+              <w:t xml:space="preserve">Поток теплоносителя после флоуметра идёт сверху вниз (п. 4.1)</w:t>
             </w:r>
           </w:p>
         </w:tc>
@@ -5334,7 +6134,7 @@
                 <wp:inline distT="0" distB="0" distL="0" distR="0">
                   <wp:extent cx="2000250" cy="2667000"/>
                   <wp:effectExtent t="0" r="0" b="0" l="0"/>
-                  <wp:docPr id="1" name="foto5" descr="Отсутствует кран дренажного слива после насоса Р-101" title="Фото 5"/>
+                  <wp:docPr id="1" name="foto4" descr="Отсутствуют подключения теплоносителя насоса Р-101" title="Фото 5"/>
                   <wp:cNvGraphicFramePr>
                     <a:graphicFrameLocks xmlns:a="http://schemas.openxmlformats.org/drawingml/2006/main" noChangeAspect="1"/>
                   </wp:cNvGraphicFramePr>
@@ -5391,7 +6191,7 @@
                 <w:sz w:val="20"/>
                 <w:szCs w:val="20"/>
               </w:rPr>
-              <w:t xml:space="preserve">Отсутствует кран дренажного слива после насоса Р-101 (п. 4.5)</w:t>
+              <w:t xml:space="preserve">Отсутствуют подключения теплоносителя насоса Р-101 (п. 4.3)</w:t>
             </w:r>
           </w:p>
         </w:tc>
@@ -5421,7 +6221,7 @@
                 <wp:inline distT="0" distB="0" distL="0" distR="0">
                   <wp:extent cx="2000250" cy="2667000"/>
                   <wp:effectExtent t="0" r="0" b="0" l="0"/>
-                  <wp:docPr id="1" name="foto1" descr="Фланец на кране BV-008 (слив тяжёлой фракции 1-й ступени)" title="Фото 6"/>
+                  <wp:docPr id="1" name="foto7" descr="Отсутствуют подключения теплоносителя на выходе pre-heater 1-го контура" title="Фото 6"/>
                   <wp:cNvGraphicFramePr>
                     <a:graphicFrameLocks xmlns:a="http://schemas.openxmlformats.org/drawingml/2006/main" noChangeAspect="1"/>
                   </wp:cNvGraphicFramePr>
@@ -5478,7 +6278,7 @@
                 <w:sz w:val="20"/>
                 <w:szCs w:val="20"/>
               </w:rPr>
-              <w:t xml:space="preserve">Фланец на кране BV-008 (слив тяжёлой фракции 1-й ступени) (п. 4.6)</w:t>
+              <w:t xml:space="preserve">Отсутствуют подключения теплоносителя на выходе pre-heater 1-го контура (п. 4.4)</w:t>
             </w:r>
           </w:p>
         </w:tc>
@@ -5511,9 +6311,9 @@
             <w:r>
               <w:drawing>
                 <wp:inline distT="0" distB="0" distL="0" distR="0">
-                  <wp:extent cx="2762250" cy="2066925"/>
+                  <wp:extent cx="2000250" cy="2667000"/>
                   <wp:effectExtent t="0" r="0" b="0" l="0"/>
-                  <wp:docPr id="1" name="foto2" descr="Отсутствуют шайбы на фланцевом соединении" title="Фото 7"/>
+                  <wp:docPr id="1" name="foto5" descr="Отсутствует кран дренажного слива после насоса Р-101" title="Фото 7"/>
                   <wp:cNvGraphicFramePr>
                     <a:graphicFrameLocks xmlns:a="http://schemas.openxmlformats.org/drawingml/2006/main" noChangeAspect="1"/>
                   </wp:cNvGraphicFramePr>
@@ -5536,7 +6336,7 @@
                         <pic:spPr bwMode="auto">
                           <a:xfrm>
                             <a:off x="0" y="0"/>
-                            <a:ext cx="2762250" cy="2066925"/>
+                            <a:ext cx="2000250" cy="2667000"/>
                           </a:xfrm>
                           <a:prstGeom prst="rect">
                             <a:avLst/>
@@ -5570,7 +6370,7 @@
                 <w:sz w:val="20"/>
                 <w:szCs w:val="20"/>
               </w:rPr>
-              <w:t xml:space="preserve">Отсутствуют шайбы на фланцевом соединении (п. 4.7)</w:t>
+              <w:t xml:space="preserve">Отсутствует кран дренажного слива после насоса Р-101 (п. 4.5)</w:t>
             </w:r>
           </w:p>
         </w:tc>
@@ -5600,7 +6400,7 @@
                 <wp:inline distT="0" distB="0" distL="0" distR="0">
                   <wp:extent cx="2000250" cy="2667000"/>
                   <wp:effectExtent t="0" r="0" b="0" l="0"/>
-                  <wp:docPr id="1" name="foto6" descr="Отсутствуют два болта после флоуметра" title="Фото 8"/>
+                  <wp:docPr id="1" name="foto1" descr="Фланец на кране BV-008 (слив тяжёлой фракции 1-й ступени)" title="Фото 8"/>
                   <wp:cNvGraphicFramePr>
                     <a:graphicFrameLocks xmlns:a="http://schemas.openxmlformats.org/drawingml/2006/main" noChangeAspect="1"/>
                   </wp:cNvGraphicFramePr>
@@ -5657,7 +6457,7 @@
                 <w:sz w:val="20"/>
                 <w:szCs w:val="20"/>
               </w:rPr>
-              <w:t xml:space="preserve">Отсутствуют два болта после флоуметра (п. 4.8)</w:t>
+              <w:t xml:space="preserve">Фланец на кране BV-008 (слив тяжёлой фракции 1-й ступени) (п. 4.6)</w:t>
             </w:r>
           </w:p>
         </w:tc>
@@ -5690,9 +6490,9 @@
             <w:r>
               <w:drawing>
                 <wp:inline distT="0" distB="0" distL="0" distR="0">
-                  <wp:extent cx="2762250" cy="1552575"/>
+                  <wp:extent cx="2762250" cy="2066925"/>
                   <wp:effectExtent t="0" r="0" b="0" l="0"/>
-                  <wp:docPr id="1" name="foto8" descr="Не закреплена броня кабелей" title="Фото 9"/>
+                  <wp:docPr id="1" name="foto2" descr="Отсутствуют шайбы на фланцевом соединении" title="Фото 9"/>
                   <wp:cNvGraphicFramePr>
                     <a:graphicFrameLocks xmlns:a="http://schemas.openxmlformats.org/drawingml/2006/main" noChangeAspect="1"/>
                   </wp:cNvGraphicFramePr>
@@ -5715,7 +6515,7 @@
                         <pic:spPr bwMode="auto">
                           <a:xfrm>
                             <a:off x="0" y="0"/>
-                            <a:ext cx="2762250" cy="1552575"/>
+                            <a:ext cx="2762250" cy="2066925"/>
                           </a:xfrm>
                           <a:prstGeom prst="rect">
                             <a:avLst/>
@@ -5749,7 +6549,7 @@
                 <w:sz w:val="20"/>
                 <w:szCs w:val="20"/>
               </w:rPr>
-              <w:t xml:space="preserve">Не закреплена броня кабелей (п. 5.1)</w:t>
+              <w:t xml:space="preserve">Отсутствуют шайбы на фланцевом соединении (п. 4.7)</w:t>
             </w:r>
           </w:p>
         </w:tc>
@@ -5777,9 +6577,9 @@
             <w:r>
               <w:drawing>
                 <wp:inline distT="0" distB="0" distL="0" distR="0">
-                  <wp:extent cx="2762250" cy="1552575"/>
+                  <wp:extent cx="2000250" cy="2667000"/>
                   <wp:effectExtent t="0" r="0" b="0" l="0"/>
-                  <wp:docPr id="1" name="foto9" descr="Перебит кабель датчика температуры" title="Фото 10"/>
+                  <wp:docPr id="1" name="foto6" descr="Отсутствуют два болта после флоуметра" title="Фото 10"/>
                   <wp:cNvGraphicFramePr>
                     <a:graphicFrameLocks xmlns:a="http://schemas.openxmlformats.org/drawingml/2006/main" noChangeAspect="1"/>
                   </wp:cNvGraphicFramePr>
@@ -5802,7 +6602,7 @@
                         <pic:spPr bwMode="auto">
                           <a:xfrm>
                             <a:off x="0" y="0"/>
-                            <a:ext cx="2762250" cy="1552575"/>
+                            <a:ext cx="2000250" cy="2667000"/>
                           </a:xfrm>
                           <a:prstGeom prst="rect">
                             <a:avLst/>
@@ -5836,7 +6636,7 @@
                 <w:sz w:val="20"/>
                 <w:szCs w:val="20"/>
               </w:rPr>
-              <w:t xml:space="preserve">Перебит кабель датчика температуры (п. 5.4)</w:t>
+              <w:t xml:space="preserve">Отсутствуют два болта после флоуметра (п. 4.8)</w:t>
             </w:r>
           </w:p>
         </w:tc>
@@ -5869,9 +6669,9 @@
             <w:r>
               <w:drawing>
                 <wp:inline distT="0" distB="0" distL="0" distR="0">
-                  <wp:extent cx="2762250" cy="1552575"/>
+                  <wp:extent cx="2000250" cy="2667000"/>
                   <wp:effectExtent t="0" r="0" b="0" l="0"/>
-                  <wp:docPr id="1" name="foto10" descr="Место повреждения кабеля датчика температуры" title="Фото 11"/>
+                  <wp:docPr id="1" name="foto14" descr="Прямой отвод — конфликт трубопроводов" title="Фото 11"/>
                   <wp:cNvGraphicFramePr>
                     <a:graphicFrameLocks xmlns:a="http://schemas.openxmlformats.org/drawingml/2006/main" noChangeAspect="1"/>
                   </wp:cNvGraphicFramePr>
@@ -5894,7 +6694,7 @@
                         <pic:spPr bwMode="auto">
                           <a:xfrm>
                             <a:off x="0" y="0"/>
-                            <a:ext cx="2762250" cy="1552575"/>
+                            <a:ext cx="2000250" cy="2667000"/>
                           </a:xfrm>
                           <a:prstGeom prst="rect">
                             <a:avLst/>
@@ -5928,7 +6728,7 @@
                 <w:sz w:val="20"/>
                 <w:szCs w:val="20"/>
               </w:rPr>
-              <w:t xml:space="preserve">Место повреждения кабеля датчика температуры (п. 5.4)</w:t>
+              <w:t xml:space="preserve">Прямой отвод — конфликт трубопроводов (п. 4.9)</w:t>
             </w:r>
           </w:p>
         </w:tc>
@@ -5956,9 +6756,9 @@
             <w:r>
               <w:drawing>
                 <wp:inline distT="0" distB="0" distL="0" distR="0">
-                  <wp:extent cx="1504950" cy="2667000"/>
+                  <wp:extent cx="2762250" cy="2066925"/>
                   <wp:effectExtent t="0" r="0" b="0" l="0"/>
-                  <wp:docPr id="1" name="foto12" descr="Не закреплены трубы кабельной разводки" title="Фото 12"/>
+                  <wp:docPr id="1" name="foto17" descr="Резиновые прокладки вместо PTFE" title="Фото 12"/>
                   <wp:cNvGraphicFramePr>
                     <a:graphicFrameLocks xmlns:a="http://schemas.openxmlformats.org/drawingml/2006/main" noChangeAspect="1"/>
                   </wp:cNvGraphicFramePr>
@@ -5981,6 +6781,543 @@
                         <pic:spPr bwMode="auto">
                           <a:xfrm>
                             <a:off x="0" y="0"/>
+                            <a:ext cx="2762250" cy="2066925"/>
+                          </a:xfrm>
+                          <a:prstGeom prst="rect">
+                            <a:avLst/>
+                          </a:prstGeom>
+                        </pic:spPr>
+                      </pic:pic>
+                    </a:graphicData>
+                  </a:graphic>
+                </wp:inline>
+              </w:drawing>
+            </w:r>
+          </w:p>
+          <w:p>
+            <w:pPr>
+              <w:spacing w:before="60"/>
+              <w:jc w:val="center"/>
+            </w:pPr>
+            <w:r>
+              <w:rPr>
+                <w:rFonts w:ascii="Times New Roman" w:cs="Times New Roman" w:eastAsia="Times New Roman" w:hAnsi="Times New Roman"/>
+                <w:b/>
+                <w:bCs/>
+                <w:sz w:val="20"/>
+                <w:szCs w:val="20"/>
+              </w:rPr>
+              <w:t xml:space="preserve">Фото 12. </w:t>
+            </w:r>
+            <w:r>
+              <w:rPr>
+                <w:rFonts w:ascii="Times New Roman" w:cs="Times New Roman" w:eastAsia="Times New Roman" w:hAnsi="Times New Roman"/>
+                <w:sz w:val="20"/>
+                <w:szCs w:val="20"/>
+              </w:rPr>
+              <w:t xml:space="preserve">Резиновые прокладки вместо PTFE (п. 4.10)</w:t>
+            </w:r>
+          </w:p>
+        </w:tc>
+      </w:tr>
+      <w:tr>
+        <w:trPr>
+          <w:cantSplit/>
+        </w:trPr>
+        <w:tc>
+          <w:tcPr>
+            <w:tcW w:type="dxa" w:w="4819"/>
+            <w:tcBorders>
+              <w:top w:val="none" w:color="FFFFFF" w:sz="0"/>
+              <w:left w:val="none" w:color="FFFFFF" w:sz="0"/>
+              <w:bottom w:val="none" w:color="FFFFFF" w:sz="0"/>
+              <w:right w:val="none" w:color="FFFFFF" w:sz="0"/>
+            </w:tcBorders>
+            <w:tcMar>
+              <w:top w:type="dxa" w:w="80"/>
+              <w:left w:type="dxa" w:w="80"/>
+              <w:bottom w:type="dxa" w:w="160"/>
+              <w:right w:type="dxa" w:w="80"/>
+            </w:tcMar>
+            <w:vAlign w:val="bottom"/>
+          </w:tcPr>
+          <w:p>
+            <w:pPr>
+              <w:jc w:val="center"/>
+            </w:pPr>
+            <w:r>
+              <w:drawing>
+                <wp:inline distT="0" distB="0" distL="0" distR="0">
+                  <wp:extent cx="2000250" cy="2667000"/>
+                  <wp:effectExtent t="0" r="0" b="0" l="0"/>
+                  <wp:docPr id="1" name="foto18" descr="Скручивание гибкой подводки" title="Фото 13"/>
+                  <wp:cNvGraphicFramePr>
+                    <a:graphicFrameLocks xmlns:a="http://schemas.openxmlformats.org/drawingml/2006/main" noChangeAspect="1"/>
+                  </wp:cNvGraphicFramePr>
+                  <a:graphic xmlns:a="http://schemas.openxmlformats.org/drawingml/2006/main">
+                    <a:graphicData uri="http://schemas.openxmlformats.org/drawingml/2006/picture">
+                      <pic:pic xmlns:pic="http://schemas.openxmlformats.org/drawingml/2006/picture">
+                        <pic:nvPicPr>
+                          <pic:cNvPr id="0" name="" descr=""/>
+                          <pic:cNvPicPr>
+                            <a:picLocks noChangeAspect="1" noChangeArrowheads="1"/>
+                          </pic:cNvPicPr>
+                        </pic:nvPicPr>
+                        <pic:blipFill>
+                          <a:blip r:embed="rId20" cstate="none"/>
+                          <a:srcRect/>
+                          <a:stretch>
+                            <a:fillRect/>
+                          </a:stretch>
+                        </pic:blipFill>
+                        <pic:spPr bwMode="auto">
+                          <a:xfrm>
+                            <a:off x="0" y="0"/>
+                            <a:ext cx="2000250" cy="2667000"/>
+                          </a:xfrm>
+                          <a:prstGeom prst="rect">
+                            <a:avLst/>
+                          </a:prstGeom>
+                        </pic:spPr>
+                      </pic:pic>
+                    </a:graphicData>
+                  </a:graphic>
+                </wp:inline>
+              </w:drawing>
+            </w:r>
+          </w:p>
+          <w:p>
+            <w:pPr>
+              <w:spacing w:before="60"/>
+              <w:jc w:val="center"/>
+            </w:pPr>
+            <w:r>
+              <w:rPr>
+                <w:rFonts w:ascii="Times New Roman" w:cs="Times New Roman" w:eastAsia="Times New Roman" w:hAnsi="Times New Roman"/>
+                <w:b/>
+                <w:bCs/>
+                <w:sz w:val="20"/>
+                <w:szCs w:val="20"/>
+              </w:rPr>
+              <w:t xml:space="preserve">Фото 13. </w:t>
+            </w:r>
+            <w:r>
+              <w:rPr>
+                <w:rFonts w:ascii="Times New Roman" w:cs="Times New Roman" w:eastAsia="Times New Roman" w:hAnsi="Times New Roman"/>
+                <w:sz w:val="20"/>
+                <w:szCs w:val="20"/>
+              </w:rPr>
+              <w:t xml:space="preserve">Скручивание гибкой подводки (п. 4.11)</w:t>
+            </w:r>
+          </w:p>
+        </w:tc>
+        <w:tc>
+          <w:tcPr>
+            <w:tcW w:type="dxa" w:w="4819"/>
+            <w:tcBorders>
+              <w:top w:val="none" w:color="FFFFFF" w:sz="0"/>
+              <w:left w:val="none" w:color="FFFFFF" w:sz="0"/>
+              <w:bottom w:val="none" w:color="FFFFFF" w:sz="0"/>
+              <w:right w:val="none" w:color="FFFFFF" w:sz="0"/>
+            </w:tcBorders>
+            <w:tcMar>
+              <w:top w:type="dxa" w:w="80"/>
+              <w:left w:type="dxa" w:w="80"/>
+              <w:bottom w:type="dxa" w:w="160"/>
+              <w:right w:type="dxa" w:w="80"/>
+            </w:tcMar>
+            <w:vAlign w:val="bottom"/>
+          </w:tcPr>
+          <w:p>
+            <w:pPr>
+              <w:jc w:val="center"/>
+            </w:pPr>
+            <w:r>
+              <w:drawing>
+                <wp:inline distT="0" distB="0" distL="0" distR="0">
+                  <wp:extent cx="2000250" cy="2667000"/>
+                  <wp:effectExtent t="0" r="0" b="0" l="0"/>
+                  <wp:docPr id="1" name="foto19" descr="Скручивание гибкой подводки" title="Фото 14"/>
+                  <wp:cNvGraphicFramePr>
+                    <a:graphicFrameLocks xmlns:a="http://schemas.openxmlformats.org/drawingml/2006/main" noChangeAspect="1"/>
+                  </wp:cNvGraphicFramePr>
+                  <a:graphic xmlns:a="http://schemas.openxmlformats.org/drawingml/2006/main">
+                    <a:graphicData uri="http://schemas.openxmlformats.org/drawingml/2006/picture">
+                      <pic:pic xmlns:pic="http://schemas.openxmlformats.org/drawingml/2006/picture">
+                        <pic:nvPicPr>
+                          <pic:cNvPr id="0" name="" descr=""/>
+                          <pic:cNvPicPr>
+                            <a:picLocks noChangeAspect="1" noChangeArrowheads="1"/>
+                          </pic:cNvPicPr>
+                        </pic:nvPicPr>
+                        <pic:blipFill>
+                          <a:blip r:embed="rId21" cstate="none"/>
+                          <a:srcRect/>
+                          <a:stretch>
+                            <a:fillRect/>
+                          </a:stretch>
+                        </pic:blipFill>
+                        <pic:spPr bwMode="auto">
+                          <a:xfrm>
+                            <a:off x="0" y="0"/>
+                            <a:ext cx="2000250" cy="2667000"/>
+                          </a:xfrm>
+                          <a:prstGeom prst="rect">
+                            <a:avLst/>
+                          </a:prstGeom>
+                        </pic:spPr>
+                      </pic:pic>
+                    </a:graphicData>
+                  </a:graphic>
+                </wp:inline>
+              </w:drawing>
+            </w:r>
+          </w:p>
+          <w:p>
+            <w:pPr>
+              <w:spacing w:before="60"/>
+              <w:jc w:val="center"/>
+            </w:pPr>
+            <w:r>
+              <w:rPr>
+                <w:rFonts w:ascii="Times New Roman" w:cs="Times New Roman" w:eastAsia="Times New Roman" w:hAnsi="Times New Roman"/>
+                <w:b/>
+                <w:bCs/>
+                <w:sz w:val="20"/>
+                <w:szCs w:val="20"/>
+              </w:rPr>
+              <w:t xml:space="preserve">Фото 14. </w:t>
+            </w:r>
+            <w:r>
+              <w:rPr>
+                <w:rFonts w:ascii="Times New Roman" w:cs="Times New Roman" w:eastAsia="Times New Roman" w:hAnsi="Times New Roman"/>
+                <w:sz w:val="20"/>
+                <w:szCs w:val="20"/>
+              </w:rPr>
+              <w:t xml:space="preserve">Скручивание гибкой подводки (п. 4.11)</w:t>
+            </w:r>
+          </w:p>
+        </w:tc>
+      </w:tr>
+      <w:tr>
+        <w:trPr>
+          <w:cantSplit/>
+        </w:trPr>
+        <w:tc>
+          <w:tcPr>
+            <w:tcW w:type="dxa" w:w="4819"/>
+            <w:tcBorders>
+              <w:top w:val="none" w:color="FFFFFF" w:sz="0"/>
+              <w:left w:val="none" w:color="FFFFFF" w:sz="0"/>
+              <w:bottom w:val="none" w:color="FFFFFF" w:sz="0"/>
+              <w:right w:val="none" w:color="FFFFFF" w:sz="0"/>
+            </w:tcBorders>
+            <w:tcMar>
+              <w:top w:type="dxa" w:w="80"/>
+              <w:left w:type="dxa" w:w="80"/>
+              <w:bottom w:type="dxa" w:w="160"/>
+              <w:right w:type="dxa" w:w="80"/>
+            </w:tcMar>
+            <w:vAlign w:val="bottom"/>
+          </w:tcPr>
+          <w:p>
+            <w:pPr>
+              <w:jc w:val="center"/>
+            </w:pPr>
+            <w:r>
+              <w:drawing>
+                <wp:inline distT="0" distB="0" distL="0" distR="0">
+                  <wp:extent cx="2762250" cy="1552575"/>
+                  <wp:effectExtent t="0" r="0" b="0" l="0"/>
+                  <wp:docPr id="1" name="foto8" descr="Не закреплена броня кабелей" title="Фото 15"/>
+                  <wp:cNvGraphicFramePr>
+                    <a:graphicFrameLocks xmlns:a="http://schemas.openxmlformats.org/drawingml/2006/main" noChangeAspect="1"/>
+                  </wp:cNvGraphicFramePr>
+                  <a:graphic xmlns:a="http://schemas.openxmlformats.org/drawingml/2006/main">
+                    <a:graphicData uri="http://schemas.openxmlformats.org/drawingml/2006/picture">
+                      <pic:pic xmlns:pic="http://schemas.openxmlformats.org/drawingml/2006/picture">
+                        <pic:nvPicPr>
+                          <pic:cNvPr id="0" name="" descr=""/>
+                          <pic:cNvPicPr>
+                            <a:picLocks noChangeAspect="1" noChangeArrowheads="1"/>
+                          </pic:cNvPicPr>
+                        </pic:nvPicPr>
+                        <pic:blipFill>
+                          <a:blip r:embed="rId22" cstate="none"/>
+                          <a:srcRect/>
+                          <a:stretch>
+                            <a:fillRect/>
+                          </a:stretch>
+                        </pic:blipFill>
+                        <pic:spPr bwMode="auto">
+                          <a:xfrm>
+                            <a:off x="0" y="0"/>
+                            <a:ext cx="2762250" cy="1552575"/>
+                          </a:xfrm>
+                          <a:prstGeom prst="rect">
+                            <a:avLst/>
+                          </a:prstGeom>
+                        </pic:spPr>
+                      </pic:pic>
+                    </a:graphicData>
+                  </a:graphic>
+                </wp:inline>
+              </w:drawing>
+            </w:r>
+          </w:p>
+          <w:p>
+            <w:pPr>
+              <w:spacing w:before="60"/>
+              <w:jc w:val="center"/>
+            </w:pPr>
+            <w:r>
+              <w:rPr>
+                <w:rFonts w:ascii="Times New Roman" w:cs="Times New Roman" w:eastAsia="Times New Roman" w:hAnsi="Times New Roman"/>
+                <w:b/>
+                <w:bCs/>
+                <w:sz w:val="20"/>
+                <w:szCs w:val="20"/>
+              </w:rPr>
+              <w:t xml:space="preserve">Фото 15. </w:t>
+            </w:r>
+            <w:r>
+              <w:rPr>
+                <w:rFonts w:ascii="Times New Roman" w:cs="Times New Roman" w:eastAsia="Times New Roman" w:hAnsi="Times New Roman"/>
+                <w:sz w:val="20"/>
+                <w:szCs w:val="20"/>
+              </w:rPr>
+              <w:t xml:space="preserve">Не закреплена броня кабелей (п. 5.1)</w:t>
+            </w:r>
+          </w:p>
+        </w:tc>
+        <w:tc>
+          <w:tcPr>
+            <w:tcW w:type="dxa" w:w="4819"/>
+            <w:tcBorders>
+              <w:top w:val="none" w:color="FFFFFF" w:sz="0"/>
+              <w:left w:val="none" w:color="FFFFFF" w:sz="0"/>
+              <w:bottom w:val="none" w:color="FFFFFF" w:sz="0"/>
+              <w:right w:val="none" w:color="FFFFFF" w:sz="0"/>
+            </w:tcBorders>
+            <w:tcMar>
+              <w:top w:type="dxa" w:w="80"/>
+              <w:left w:type="dxa" w:w="80"/>
+              <w:bottom w:type="dxa" w:w="160"/>
+              <w:right w:type="dxa" w:w="80"/>
+            </w:tcMar>
+            <w:vAlign w:val="bottom"/>
+          </w:tcPr>
+          <w:p>
+            <w:pPr>
+              <w:jc w:val="center"/>
+            </w:pPr>
+            <w:r>
+              <w:drawing>
+                <wp:inline distT="0" distB="0" distL="0" distR="0">
+                  <wp:extent cx="2762250" cy="1552575"/>
+                  <wp:effectExtent t="0" r="0" b="0" l="0"/>
+                  <wp:docPr id="1" name="foto9" descr="Перебит кабель датчика температуры" title="Фото 16"/>
+                  <wp:cNvGraphicFramePr>
+                    <a:graphicFrameLocks xmlns:a="http://schemas.openxmlformats.org/drawingml/2006/main" noChangeAspect="1"/>
+                  </wp:cNvGraphicFramePr>
+                  <a:graphic xmlns:a="http://schemas.openxmlformats.org/drawingml/2006/main">
+                    <a:graphicData uri="http://schemas.openxmlformats.org/drawingml/2006/picture">
+                      <pic:pic xmlns:pic="http://schemas.openxmlformats.org/drawingml/2006/picture">
+                        <pic:nvPicPr>
+                          <pic:cNvPr id="0" name="" descr=""/>
+                          <pic:cNvPicPr>
+                            <a:picLocks noChangeAspect="1" noChangeArrowheads="1"/>
+                          </pic:cNvPicPr>
+                        </pic:nvPicPr>
+                        <pic:blipFill>
+                          <a:blip r:embed="rId23" cstate="none"/>
+                          <a:srcRect/>
+                          <a:stretch>
+                            <a:fillRect/>
+                          </a:stretch>
+                        </pic:blipFill>
+                        <pic:spPr bwMode="auto">
+                          <a:xfrm>
+                            <a:off x="0" y="0"/>
+                            <a:ext cx="2762250" cy="1552575"/>
+                          </a:xfrm>
+                          <a:prstGeom prst="rect">
+                            <a:avLst/>
+                          </a:prstGeom>
+                        </pic:spPr>
+                      </pic:pic>
+                    </a:graphicData>
+                  </a:graphic>
+                </wp:inline>
+              </w:drawing>
+            </w:r>
+          </w:p>
+          <w:p>
+            <w:pPr>
+              <w:spacing w:before="60"/>
+              <w:jc w:val="center"/>
+            </w:pPr>
+            <w:r>
+              <w:rPr>
+                <w:rFonts w:ascii="Times New Roman" w:cs="Times New Roman" w:eastAsia="Times New Roman" w:hAnsi="Times New Roman"/>
+                <w:b/>
+                <w:bCs/>
+                <w:sz w:val="20"/>
+                <w:szCs w:val="20"/>
+              </w:rPr>
+              <w:t xml:space="preserve">Фото 16. </w:t>
+            </w:r>
+            <w:r>
+              <w:rPr>
+                <w:rFonts w:ascii="Times New Roman" w:cs="Times New Roman" w:eastAsia="Times New Roman" w:hAnsi="Times New Roman"/>
+                <w:sz w:val="20"/>
+                <w:szCs w:val="20"/>
+              </w:rPr>
+              <w:t xml:space="preserve">Перебит кабель датчика температуры (п. 5.4)</w:t>
+            </w:r>
+          </w:p>
+        </w:tc>
+      </w:tr>
+      <w:tr>
+        <w:trPr>
+          <w:cantSplit/>
+        </w:trPr>
+        <w:tc>
+          <w:tcPr>
+            <w:tcW w:type="dxa" w:w="4819"/>
+            <w:tcBorders>
+              <w:top w:val="none" w:color="FFFFFF" w:sz="0"/>
+              <w:left w:val="none" w:color="FFFFFF" w:sz="0"/>
+              <w:bottom w:val="none" w:color="FFFFFF" w:sz="0"/>
+              <w:right w:val="none" w:color="FFFFFF" w:sz="0"/>
+            </w:tcBorders>
+            <w:tcMar>
+              <w:top w:type="dxa" w:w="80"/>
+              <w:left w:type="dxa" w:w="80"/>
+              <w:bottom w:type="dxa" w:w="160"/>
+              <w:right w:type="dxa" w:w="80"/>
+            </w:tcMar>
+            <w:vAlign w:val="bottom"/>
+          </w:tcPr>
+          <w:p>
+            <w:pPr>
+              <w:jc w:val="center"/>
+            </w:pPr>
+            <w:r>
+              <w:drawing>
+                <wp:inline distT="0" distB="0" distL="0" distR="0">
+                  <wp:extent cx="2762250" cy="1552575"/>
+                  <wp:effectExtent t="0" r="0" b="0" l="0"/>
+                  <wp:docPr id="1" name="foto10" descr="Место повреждения кабеля датчика температуры" title="Фото 17"/>
+                  <wp:cNvGraphicFramePr>
+                    <a:graphicFrameLocks xmlns:a="http://schemas.openxmlformats.org/drawingml/2006/main" noChangeAspect="1"/>
+                  </wp:cNvGraphicFramePr>
+                  <a:graphic xmlns:a="http://schemas.openxmlformats.org/drawingml/2006/main">
+                    <a:graphicData uri="http://schemas.openxmlformats.org/drawingml/2006/picture">
+                      <pic:pic xmlns:pic="http://schemas.openxmlformats.org/drawingml/2006/picture">
+                        <pic:nvPicPr>
+                          <pic:cNvPr id="0" name="" descr=""/>
+                          <pic:cNvPicPr>
+                            <a:picLocks noChangeAspect="1" noChangeArrowheads="1"/>
+                          </pic:cNvPicPr>
+                        </pic:nvPicPr>
+                        <pic:blipFill>
+                          <a:blip r:embed="rId24" cstate="none"/>
+                          <a:srcRect/>
+                          <a:stretch>
+                            <a:fillRect/>
+                          </a:stretch>
+                        </pic:blipFill>
+                        <pic:spPr bwMode="auto">
+                          <a:xfrm>
+                            <a:off x="0" y="0"/>
+                            <a:ext cx="2762250" cy="1552575"/>
+                          </a:xfrm>
+                          <a:prstGeom prst="rect">
+                            <a:avLst/>
+                          </a:prstGeom>
+                        </pic:spPr>
+                      </pic:pic>
+                    </a:graphicData>
+                  </a:graphic>
+                </wp:inline>
+              </w:drawing>
+            </w:r>
+          </w:p>
+          <w:p>
+            <w:pPr>
+              <w:spacing w:before="60"/>
+              <w:jc w:val="center"/>
+            </w:pPr>
+            <w:r>
+              <w:rPr>
+                <w:rFonts w:ascii="Times New Roman" w:cs="Times New Roman" w:eastAsia="Times New Roman" w:hAnsi="Times New Roman"/>
+                <w:b/>
+                <w:bCs/>
+                <w:sz w:val="20"/>
+                <w:szCs w:val="20"/>
+              </w:rPr>
+              <w:t xml:space="preserve">Фото 17. </w:t>
+            </w:r>
+            <w:r>
+              <w:rPr>
+                <w:rFonts w:ascii="Times New Roman" w:cs="Times New Roman" w:eastAsia="Times New Roman" w:hAnsi="Times New Roman"/>
+                <w:sz w:val="20"/>
+                <w:szCs w:val="20"/>
+              </w:rPr>
+              <w:t xml:space="preserve">Место повреждения кабеля датчика температуры (п. 5.4)</w:t>
+            </w:r>
+          </w:p>
+        </w:tc>
+        <w:tc>
+          <w:tcPr>
+            <w:tcW w:type="dxa" w:w="4819"/>
+            <w:tcBorders>
+              <w:top w:val="none" w:color="FFFFFF" w:sz="0"/>
+              <w:left w:val="none" w:color="FFFFFF" w:sz="0"/>
+              <w:bottom w:val="none" w:color="FFFFFF" w:sz="0"/>
+              <w:right w:val="none" w:color="FFFFFF" w:sz="0"/>
+            </w:tcBorders>
+            <w:tcMar>
+              <w:top w:type="dxa" w:w="80"/>
+              <w:left w:type="dxa" w:w="80"/>
+              <w:bottom w:type="dxa" w:w="160"/>
+              <w:right w:type="dxa" w:w="80"/>
+            </w:tcMar>
+            <w:vAlign w:val="bottom"/>
+          </w:tcPr>
+          <w:p>
+            <w:pPr>
+              <w:jc w:val="center"/>
+            </w:pPr>
+            <w:r>
+              <w:drawing>
+                <wp:inline distT="0" distB="0" distL="0" distR="0">
+                  <wp:extent cx="1504950" cy="2667000"/>
+                  <wp:effectExtent t="0" r="0" b="0" l="0"/>
+                  <wp:docPr id="1" name="foto12" descr="Не закреплены трубы кабельной разводки" title="Фото 18"/>
+                  <wp:cNvGraphicFramePr>
+                    <a:graphicFrameLocks xmlns:a="http://schemas.openxmlformats.org/drawingml/2006/main" noChangeAspect="1"/>
+                  </wp:cNvGraphicFramePr>
+                  <a:graphic xmlns:a="http://schemas.openxmlformats.org/drawingml/2006/main">
+                    <a:graphicData uri="http://schemas.openxmlformats.org/drawingml/2006/picture">
+                      <pic:pic xmlns:pic="http://schemas.openxmlformats.org/drawingml/2006/picture">
+                        <pic:nvPicPr>
+                          <pic:cNvPr id="0" name="" descr=""/>
+                          <pic:cNvPicPr>
+                            <a:picLocks noChangeAspect="1" noChangeArrowheads="1"/>
+                          </pic:cNvPicPr>
+                        </pic:nvPicPr>
+                        <pic:blipFill>
+                          <a:blip r:embed="rId25" cstate="none"/>
+                          <a:srcRect/>
+                          <a:stretch>
+                            <a:fillRect/>
+                          </a:stretch>
+                        </pic:blipFill>
+                        <pic:spPr bwMode="auto">
+                          <a:xfrm>
+                            <a:off x="0" y="0"/>
                             <a:ext cx="1504950" cy="2667000"/>
                           </a:xfrm>
                           <a:prstGeom prst="rect">
@@ -6007,7 +7344,7 @@
                 <w:sz w:val="20"/>
                 <w:szCs w:val="20"/>
               </w:rPr>
-              <w:t xml:space="preserve">Фото 12. </w:t>
+              <w:t xml:space="preserve">Фото 18. </w:t>
             </w:r>
             <w:r>
               <w:rPr>
@@ -6016,6 +7353,114 @@
                 <w:szCs w:val="20"/>
               </w:rPr>
               <w:t xml:space="preserve">Не закреплены трубы кабельной разводки (п. 5.5)</w:t>
+            </w:r>
+          </w:p>
+        </w:tc>
+      </w:tr>
+      <w:tr>
+        <w:trPr>
+          <w:cantSplit/>
+        </w:trPr>
+        <w:tc>
+          <w:tcPr>
+            <w:tcW w:type="dxa" w:w="4819"/>
+            <w:tcBorders>
+              <w:top w:val="none" w:color="FFFFFF" w:sz="0"/>
+              <w:left w:val="none" w:color="FFFFFF" w:sz="0"/>
+              <w:bottom w:val="none" w:color="FFFFFF" w:sz="0"/>
+              <w:right w:val="none" w:color="FFFFFF" w:sz="0"/>
+            </w:tcBorders>
+            <w:tcMar>
+              <w:top w:type="dxa" w:w="80"/>
+              <w:left w:type="dxa" w:w="80"/>
+              <w:bottom w:type="dxa" w:w="160"/>
+              <w:right w:type="dxa" w:w="80"/>
+            </w:tcMar>
+            <w:vAlign w:val="bottom"/>
+          </w:tcPr>
+          <w:p>
+            <w:pPr>
+              <w:jc w:val="center"/>
+            </w:pPr>
+            <w:r>
+              <w:drawing>
+                <wp:inline distT="0" distB="0" distL="0" distR="0">
+                  <wp:extent cx="2000250" cy="2667000"/>
+                  <wp:effectExtent t="0" r="0" b="0" l="0"/>
+                  <wp:docPr id="1" name="foto16" descr="Отсутствует маркировка на датчиках Пирани" title="Фото 19"/>
+                  <wp:cNvGraphicFramePr>
+                    <a:graphicFrameLocks xmlns:a="http://schemas.openxmlformats.org/drawingml/2006/main" noChangeAspect="1"/>
+                  </wp:cNvGraphicFramePr>
+                  <a:graphic xmlns:a="http://schemas.openxmlformats.org/drawingml/2006/main">
+                    <a:graphicData uri="http://schemas.openxmlformats.org/drawingml/2006/picture">
+                      <pic:pic xmlns:pic="http://schemas.openxmlformats.org/drawingml/2006/picture">
+                        <pic:nvPicPr>
+                          <pic:cNvPr id="0" name="" descr=""/>
+                          <pic:cNvPicPr>
+                            <a:picLocks noChangeAspect="1" noChangeArrowheads="1"/>
+                          </pic:cNvPicPr>
+                        </pic:nvPicPr>
+                        <pic:blipFill>
+                          <a:blip r:embed="rId26" cstate="none"/>
+                          <a:srcRect/>
+                          <a:stretch>
+                            <a:fillRect/>
+                          </a:stretch>
+                        </pic:blipFill>
+                        <pic:spPr bwMode="auto">
+                          <a:xfrm>
+                            <a:off x="0" y="0"/>
+                            <a:ext cx="2000250" cy="2667000"/>
+                          </a:xfrm>
+                          <a:prstGeom prst="rect">
+                            <a:avLst/>
+                          </a:prstGeom>
+                        </pic:spPr>
+                      </pic:pic>
+                    </a:graphicData>
+                  </a:graphic>
+                </wp:inline>
+              </w:drawing>
+            </w:r>
+          </w:p>
+          <w:p>
+            <w:pPr>
+              <w:spacing w:before="60"/>
+              <w:jc w:val="center"/>
+            </w:pPr>
+            <w:r>
+              <w:rPr>
+                <w:rFonts w:ascii="Times New Roman" w:cs="Times New Roman" w:eastAsia="Times New Roman" w:hAnsi="Times New Roman"/>
+                <w:b/>
+                <w:bCs/>
+                <w:sz w:val="20"/>
+                <w:szCs w:val="20"/>
+              </w:rPr>
+              <w:t xml:space="preserve">Фото 19. </w:t>
+            </w:r>
+            <w:r>
+              <w:rPr>
+                <w:rFonts w:ascii="Times New Roman" w:cs="Times New Roman" w:eastAsia="Times New Roman" w:hAnsi="Times New Roman"/>
+                <w:sz w:val="20"/>
+                <w:szCs w:val="20"/>
+              </w:rPr>
+              <w:t xml:space="preserve">Отсутствует маркировка на датчиках Пирани (п. 5.6)</w:t>
+            </w:r>
+          </w:p>
+        </w:tc>
+        <w:tc>
+          <w:tcPr>
+            <w:tcW w:type="dxa" w:w="4819"/>
+            <w:tcBorders>
+              <w:top w:val="none" w:color="FFFFFF" w:sz="0"/>
+              <w:left w:val="none" w:color="FFFFFF" w:sz="0"/>
+              <w:bottom w:val="none" w:color="FFFFFF" w:sz="0"/>
+              <w:right w:val="none" w:color="FFFFFF" w:sz="0"/>
+            </w:tcBorders>
+          </w:tcPr>
+          <w:p>
+            <w:r>
+              <w:t xml:space="preserve"/>
             </w:r>
           </w:p>
         </w:tc>

</xml_diff>

<commit_message>
Acceptance test remarks: move missing FAT documentation into main remarks table
Co-Authored-By: Claude Opus 5.5 <noreply@anthropic.com>
Claude-Session: https://claude.ai/code/session_01DhfrxujFdtSZWrLQm5rNqB
</commit_message>
<xml_diff>
--- a/Замечания_приемочные_испытания.docx
+++ b/Замечания_приемочные_испытания.docx
@@ -6678,80 +6678,33 @@
           </w:p>
         </w:tc>
       </w:tr>
-    </w:tbl>
-    <w:p>
-      <w:pPr>
-        <w:keepNext/>
-        <w:spacing w:after="60" w:before="360"/>
-      </w:pPr>
-      <w:r>
-        <w:rPr>
-          <w:rFonts w:ascii="Times New Roman" w:cs="Times New Roman" w:eastAsia="Times New Roman" w:hAnsi="Times New Roman"/>
-          <w:b/>
-          <w:bCs/>
-          <w:sz w:val="24"/>
-          <w:szCs w:val="24"/>
-        </w:rPr>
-        <w:t xml:space="preserve">Недостающая документация по программе FAT</w:t>
-      </w:r>
-    </w:p>
-    <w:p>
-      <w:pPr>
-        <w:keepNext/>
-        <w:spacing w:after="120" w:before="40"/>
-      </w:pPr>
-      <w:r>
-        <w:rPr>
-          <w:rFonts w:ascii="Times New Roman" w:cs="Times New Roman" w:eastAsia="Times New Roman" w:hAnsi="Times New Roman"/>
-          <w:sz w:val="22"/>
-          <w:szCs w:val="22"/>
-        </w:rPr>
-        <w:t xml:space="preserve">Документы, запрошенные в разделе 1 программы очной приёмки (FAT) и не вошедшие в комплект, предъявленный поставщиком. Номера пунктов приведены по программе.</w:t>
-      </w:r>
-    </w:p>
-    <w:tbl>
-      <w:tblPr>
-        <w:tblW w:type="dxa" w:w="9638"/>
-        <w:tblBorders>
-          <w:top w:val="single" w:color="auto" w:sz="4"/>
-          <w:left w:val="single" w:color="auto" w:sz="4"/>
-          <w:bottom w:val="single" w:color="auto" w:sz="4"/>
-          <w:right w:val="single" w:color="auto" w:sz="4"/>
-          <w:insideH w:val="single" w:color="auto" w:sz="4"/>
-          <w:insideV w:val="single" w:color="auto" w:sz="4"/>
-        </w:tblBorders>
-      </w:tblPr>
-      <w:tblGrid>
-        <w:gridCol w:w="1500"/>
-        <w:gridCol w:w="6038"/>
-        <w:gridCol w:w="2100"/>
-      </w:tblGrid>
       <w:tr>
         <w:trPr>
-          <w:tblHeader/>
+          <w:cantSplit/>
         </w:trPr>
         <w:tc>
           <w:tcPr>
-            <w:tcW w:type="dxa" w:w="1500"/>
-            <w:tcBorders>
-              <w:top w:val="single" w:color="808080" w:sz="4"/>
-              <w:left w:val="single" w:color="808080" w:sz="4"/>
-              <w:bottom w:val="single" w:color="808080" w:sz="4"/>
-              <w:right w:val="single" w:color="808080" w:sz="4"/>
-            </w:tcBorders>
-            <w:shd w:fill="D9D9D9" w:color="auto" w:val="clear"/>
-            <w:tcMar>
-              <w:top w:type="dxa" w:w="60"/>
-              <w:left w:type="dxa" w:w="100"/>
-              <w:bottom w:type="dxa" w:w="60"/>
-              <w:right w:type="dxa" w:w="100"/>
-            </w:tcMar>
-            <w:vAlign w:val="center"/>
-          </w:tcPr>
-          <w:p>
-            <w:pPr>
-              <w:spacing w:after="40" w:before="40"/>
-              <w:jc w:val="center"/>
+            <w:tcW w:type="dxa" w:w="9638"/>
+            <w:gridSpan w:val="4"/>
+            <w:tcBorders>
+              <w:top w:val="single" w:color="808080" w:sz="4"/>
+              <w:left w:val="single" w:color="808080" w:sz="4"/>
+              <w:bottom w:val="single" w:color="808080" w:sz="4"/>
+              <w:right w:val="single" w:color="808080" w:sz="4"/>
+            </w:tcBorders>
+            <w:shd w:fill="F2F2F2" w:color="auto" w:val="clear"/>
+            <w:tcMar>
+              <w:top w:type="dxa" w:w="60"/>
+              <w:left w:type="dxa" w:w="100"/>
+              <w:bottom w:type="dxa" w:w="60"/>
+              <w:right w:type="dxa" w:w="100"/>
+            </w:tcMar>
+            <w:vAlign w:val="top"/>
+          </w:tcPr>
+          <w:p>
+            <w:pPr>
+              <w:keepNext/>
+              <w:spacing w:after="40" w:before="40"/>
             </w:pPr>
             <w:r>
               <w:rPr>
@@ -6761,77 +6714,7 @@
                 <w:sz w:val="22"/>
                 <w:szCs w:val="22"/>
               </w:rPr>
-              <w:t xml:space="preserve">Пункт программы</w:t>
-            </w:r>
-          </w:p>
-        </w:tc>
-        <w:tc>
-          <w:tcPr>
-            <w:tcW w:type="dxa" w:w="6038"/>
-            <w:tcBorders>
-              <w:top w:val="single" w:color="808080" w:sz="4"/>
-              <w:left w:val="single" w:color="808080" w:sz="4"/>
-              <w:bottom w:val="single" w:color="808080" w:sz="4"/>
-              <w:right w:val="single" w:color="808080" w:sz="4"/>
-            </w:tcBorders>
-            <w:shd w:fill="D9D9D9" w:color="auto" w:val="clear"/>
-            <w:tcMar>
-              <w:top w:type="dxa" w:w="60"/>
-              <w:left w:type="dxa" w:w="100"/>
-              <w:bottom w:type="dxa" w:w="60"/>
-              <w:right w:type="dxa" w:w="100"/>
-            </w:tcMar>
-            <w:vAlign w:val="center"/>
-          </w:tcPr>
-          <w:p>
-            <w:pPr>
-              <w:spacing w:after="40" w:before="40"/>
-              <w:jc w:val="center"/>
-            </w:pPr>
-            <w:r>
-              <w:rPr>
-                <w:rFonts w:ascii="Times New Roman" w:cs="Times New Roman" w:eastAsia="Times New Roman" w:hAnsi="Times New Roman"/>
-                <w:b/>
-                <w:bCs/>
-                <w:sz w:val="22"/>
-                <w:szCs w:val="22"/>
-              </w:rPr>
-              <w:t xml:space="preserve">Недостающий документ</w:t>
-            </w:r>
-          </w:p>
-        </w:tc>
-        <w:tc>
-          <w:tcPr>
-            <w:tcW w:type="dxa" w:w="2100"/>
-            <w:tcBorders>
-              <w:top w:val="single" w:color="808080" w:sz="4"/>
-              <w:left w:val="single" w:color="808080" w:sz="4"/>
-              <w:bottom w:val="single" w:color="808080" w:sz="4"/>
-              <w:right w:val="single" w:color="808080" w:sz="4"/>
-            </w:tcBorders>
-            <w:shd w:fill="D9D9D9" w:color="auto" w:val="clear"/>
-            <w:tcMar>
-              <w:top w:type="dxa" w:w="60"/>
-              <w:left w:type="dxa" w:w="100"/>
-              <w:bottom w:type="dxa" w:w="60"/>
-              <w:right w:type="dxa" w:w="100"/>
-            </w:tcMar>
-            <w:vAlign w:val="center"/>
-          </w:tcPr>
-          <w:p>
-            <w:pPr>
-              <w:spacing w:after="40" w:before="40"/>
-              <w:jc w:val="center"/>
-            </w:pPr>
-            <w:r>
-              <w:rPr>
-                <w:rFonts w:ascii="Times New Roman" w:cs="Times New Roman" w:eastAsia="Times New Roman" w:hAnsi="Times New Roman"/>
-                <w:b/>
-                <w:bCs/>
-                <w:sz w:val="22"/>
-                <w:szCs w:val="22"/>
-              </w:rPr>
-              <w:t xml:space="preserve">Отметка о предоставлении</w:t>
+              <w:t xml:space="preserve">8. Недостающая документация по программе FAT (документы раздела 1 программы, не вошедшие в предъявленный комплект)</w:t>
             </w:r>
           </w:p>
         </w:tc>
@@ -6842,70 +6725,89 @@
         </w:trPr>
         <w:tc>
           <w:tcPr>
-            <w:tcW w:type="dxa" w:w="1500"/>
-            <w:tcBorders>
-              <w:top w:val="single" w:color="808080" w:sz="4"/>
-              <w:left w:val="single" w:color="808080" w:sz="4"/>
-              <w:bottom w:val="single" w:color="808080" w:sz="4"/>
-              <w:right w:val="single" w:color="808080" w:sz="4"/>
-            </w:tcBorders>
-            <w:tcMar>
-              <w:top w:type="dxa" w:w="60"/>
-              <w:left w:type="dxa" w:w="100"/>
-              <w:bottom w:type="dxa" w:w="60"/>
-              <w:right w:type="dxa" w:w="100"/>
-            </w:tcMar>
-            <w:vAlign w:val="top"/>
-          </w:tcPr>
-          <w:p>
-            <w:pPr>
-              <w:spacing w:after="40" w:before="40"/>
-              <w:jc w:val="center"/>
-            </w:pPr>
-            <w:r>
-              <w:rPr>
-                <w:rFonts w:ascii="Times New Roman" w:cs="Times New Roman" w:eastAsia="Times New Roman" w:hAnsi="Times New Roman"/>
-                <w:sz w:val="22"/>
-                <w:szCs w:val="22"/>
-              </w:rPr>
-              <w:t xml:space="preserve">1</w:t>
-            </w:r>
-          </w:p>
-        </w:tc>
-        <w:tc>
-          <w:tcPr>
-            <w:tcW w:type="dxa" w:w="6038"/>
-            <w:tcBorders>
-              <w:top w:val="single" w:color="808080" w:sz="4"/>
-              <w:left w:val="single" w:color="808080" w:sz="4"/>
-              <w:bottom w:val="single" w:color="808080" w:sz="4"/>
-              <w:right w:val="single" w:color="808080" w:sz="4"/>
-            </w:tcBorders>
-            <w:tcMar>
-              <w:top w:type="dxa" w:w="60"/>
-              <w:left w:type="dxa" w:w="100"/>
-              <w:bottom w:type="dxa" w:w="60"/>
-              <w:right w:type="dxa" w:w="100"/>
-            </w:tcMar>
-            <w:vAlign w:val="top"/>
-          </w:tcPr>
-          <w:p>
-            <w:pPr>
-              <w:spacing w:after="40" w:before="40"/>
-            </w:pPr>
-            <w:r>
-              <w:rPr>
-                <w:rFonts w:ascii="Times New Roman" w:cs="Times New Roman" w:eastAsia="Times New Roman" w:hAnsi="Times New Roman"/>
-                <w:sz w:val="22"/>
-                <w:szCs w:val="22"/>
-              </w:rPr>
-              <w:t xml:space="preserve">Чертёж байпасных трубных вставок вместо E-101 и E-201</w:t>
-            </w:r>
-          </w:p>
-        </w:tc>
-        <w:tc>
-          <w:tcPr>
-            <w:tcW w:type="dxa" w:w="2100"/>
+            <w:tcW w:type="dxa" w:w="700"/>
+            <w:tcBorders>
+              <w:top w:val="single" w:color="808080" w:sz="4"/>
+              <w:left w:val="single" w:color="808080" w:sz="4"/>
+              <w:bottom w:val="single" w:color="808080" w:sz="4"/>
+              <w:right w:val="single" w:color="808080" w:sz="4"/>
+            </w:tcBorders>
+            <w:tcMar>
+              <w:top w:type="dxa" w:w="60"/>
+              <w:left w:type="dxa" w:w="100"/>
+              <w:bottom w:type="dxa" w:w="60"/>
+              <w:right w:type="dxa" w:w="100"/>
+            </w:tcMar>
+            <w:vAlign w:val="top"/>
+          </w:tcPr>
+          <w:p>
+            <w:pPr>
+              <w:spacing w:after="40" w:before="40"/>
+              <w:jc w:val="center"/>
+            </w:pPr>
+            <w:r>
+              <w:rPr>
+                <w:rFonts w:ascii="Times New Roman" w:cs="Times New Roman" w:eastAsia="Times New Roman" w:hAnsi="Times New Roman"/>
+                <w:sz w:val="22"/>
+                <w:szCs w:val="22"/>
+              </w:rPr>
+              <w:t xml:space="preserve">8.1</w:t>
+            </w:r>
+          </w:p>
+        </w:tc>
+        <w:tc>
+          <w:tcPr>
+            <w:tcW w:type="dxa" w:w="6138"/>
+            <w:tcBorders>
+              <w:top w:val="single" w:color="808080" w:sz="4"/>
+              <w:left w:val="single" w:color="808080" w:sz="4"/>
+              <w:bottom w:val="single" w:color="808080" w:sz="4"/>
+              <w:right w:val="single" w:color="808080" w:sz="4"/>
+            </w:tcBorders>
+            <w:tcMar>
+              <w:top w:type="dxa" w:w="60"/>
+              <w:left w:type="dxa" w:w="100"/>
+              <w:bottom w:type="dxa" w:w="60"/>
+              <w:right w:type="dxa" w:w="100"/>
+            </w:tcMar>
+            <w:vAlign w:val="top"/>
+          </w:tcPr>
+          <w:p>
+            <w:pPr>
+              <w:spacing w:after="40" w:before="40"/>
+            </w:pPr>
+            <w:r>
+              <w:rPr>
+                <w:rFonts w:ascii="Times New Roman" w:cs="Times New Roman" w:eastAsia="Times New Roman" w:hAnsi="Times New Roman"/>
+                <w:sz w:val="22"/>
+                <w:szCs w:val="22"/>
+              </w:rPr>
+              <w:t xml:space="preserve">Чертёж байпасных трубных вставок вместо E-101 и E-201 (п. 1 программы FAT)</w:t>
+            </w:r>
+          </w:p>
+        </w:tc>
+        <w:tc>
+          <w:tcPr>
+            <w:tcW w:type="dxa" w:w="1000"/>
+            <w:tcBorders>
+              <w:top w:val="single" w:color="808080" w:sz="4"/>
+              <w:left w:val="single" w:color="808080" w:sz="4"/>
+              <w:bottom w:val="single" w:color="808080" w:sz="4"/>
+              <w:right w:val="single" w:color="808080" w:sz="4"/>
+            </w:tcBorders>
+            <w:tcMar>
+              <w:top w:type="dxa" w:w="60"/>
+              <w:left w:type="dxa" w:w="100"/>
+              <w:bottom w:type="dxa" w:w="60"/>
+              <w:right w:type="dxa" w:w="100"/>
+            </w:tcMar>
+            <w:vAlign w:val="top"/>
+          </w:tcPr>
+          <w:p/>
+        </w:tc>
+        <w:tc>
+          <w:tcPr>
+            <w:tcW w:type="dxa" w:w="1800"/>
             <w:tcBorders>
               <w:top w:val="single" w:color="808080" w:sz="4"/>
               <w:left w:val="single" w:color="808080" w:sz="4"/>
@@ -6941,70 +6843,89 @@
         </w:trPr>
         <w:tc>
           <w:tcPr>
-            <w:tcW w:type="dxa" w:w="1500"/>
-            <w:tcBorders>
-              <w:top w:val="single" w:color="808080" w:sz="4"/>
-              <w:left w:val="single" w:color="808080" w:sz="4"/>
-              <w:bottom w:val="single" w:color="808080" w:sz="4"/>
-              <w:right w:val="single" w:color="808080" w:sz="4"/>
-            </w:tcBorders>
-            <w:tcMar>
-              <w:top w:type="dxa" w:w="60"/>
-              <w:left w:type="dxa" w:w="100"/>
-              <w:bottom w:type="dxa" w:w="60"/>
-              <w:right w:type="dxa" w:w="100"/>
-            </w:tcMar>
-            <w:vAlign w:val="top"/>
-          </w:tcPr>
-          <w:p>
-            <w:pPr>
-              <w:spacing w:after="40" w:before="40"/>
-              <w:jc w:val="center"/>
-            </w:pPr>
-            <w:r>
-              <w:rPr>
-                <w:rFonts w:ascii="Times New Roman" w:cs="Times New Roman" w:eastAsia="Times New Roman" w:hAnsi="Times New Roman"/>
-                <w:sz w:val="22"/>
-                <w:szCs w:val="22"/>
-              </w:rPr>
-              <w:t xml:space="preserve">2</w:t>
-            </w:r>
-          </w:p>
-        </w:tc>
-        <w:tc>
-          <w:tcPr>
-            <w:tcW w:type="dxa" w:w="6038"/>
-            <w:tcBorders>
-              <w:top w:val="single" w:color="808080" w:sz="4"/>
-              <w:left w:val="single" w:color="808080" w:sz="4"/>
-              <w:bottom w:val="single" w:color="808080" w:sz="4"/>
-              <w:right w:val="single" w:color="808080" w:sz="4"/>
-            </w:tcBorders>
-            <w:tcMar>
-              <w:top w:type="dxa" w:w="60"/>
-              <w:left w:type="dxa" w:w="100"/>
-              <w:bottom w:type="dxa" w:w="60"/>
-              <w:right w:type="dxa" w:w="100"/>
-            </w:tcMar>
-            <w:vAlign w:val="top"/>
-          </w:tcPr>
-          <w:p>
-            <w:pPr>
-              <w:spacing w:after="40" w:before="40"/>
-            </w:pPr>
-            <w:r>
-              <w:rPr>
-                <w:rFonts w:ascii="Times New Roman" w:cs="Times New Roman" w:eastAsia="Times New Roman" w:hAnsi="Times New Roman"/>
-                <w:sz w:val="22"/>
-                <w:szCs w:val="22"/>
-              </w:rPr>
-              <w:t xml:space="preserve">Упаковочный лист и перечень ЗИП</w:t>
-            </w:r>
-          </w:p>
-        </w:tc>
-        <w:tc>
-          <w:tcPr>
-            <w:tcW w:type="dxa" w:w="2100"/>
+            <w:tcW w:type="dxa" w:w="700"/>
+            <w:tcBorders>
+              <w:top w:val="single" w:color="808080" w:sz="4"/>
+              <w:left w:val="single" w:color="808080" w:sz="4"/>
+              <w:bottom w:val="single" w:color="808080" w:sz="4"/>
+              <w:right w:val="single" w:color="808080" w:sz="4"/>
+            </w:tcBorders>
+            <w:tcMar>
+              <w:top w:type="dxa" w:w="60"/>
+              <w:left w:type="dxa" w:w="100"/>
+              <w:bottom w:type="dxa" w:w="60"/>
+              <w:right w:type="dxa" w:w="100"/>
+            </w:tcMar>
+            <w:vAlign w:val="top"/>
+          </w:tcPr>
+          <w:p>
+            <w:pPr>
+              <w:spacing w:after="40" w:before="40"/>
+              <w:jc w:val="center"/>
+            </w:pPr>
+            <w:r>
+              <w:rPr>
+                <w:rFonts w:ascii="Times New Roman" w:cs="Times New Roman" w:eastAsia="Times New Roman" w:hAnsi="Times New Roman"/>
+                <w:sz w:val="22"/>
+                <w:szCs w:val="22"/>
+              </w:rPr>
+              <w:t xml:space="preserve">8.2</w:t>
+            </w:r>
+          </w:p>
+        </w:tc>
+        <w:tc>
+          <w:tcPr>
+            <w:tcW w:type="dxa" w:w="6138"/>
+            <w:tcBorders>
+              <w:top w:val="single" w:color="808080" w:sz="4"/>
+              <w:left w:val="single" w:color="808080" w:sz="4"/>
+              <w:bottom w:val="single" w:color="808080" w:sz="4"/>
+              <w:right w:val="single" w:color="808080" w:sz="4"/>
+            </w:tcBorders>
+            <w:tcMar>
+              <w:top w:type="dxa" w:w="60"/>
+              <w:left w:type="dxa" w:w="100"/>
+              <w:bottom w:type="dxa" w:w="60"/>
+              <w:right w:type="dxa" w:w="100"/>
+            </w:tcMar>
+            <w:vAlign w:val="top"/>
+          </w:tcPr>
+          <w:p>
+            <w:pPr>
+              <w:spacing w:after="40" w:before="40"/>
+            </w:pPr>
+            <w:r>
+              <w:rPr>
+                <w:rFonts w:ascii="Times New Roman" w:cs="Times New Roman" w:eastAsia="Times New Roman" w:hAnsi="Times New Roman"/>
+                <w:sz w:val="22"/>
+                <w:szCs w:val="22"/>
+              </w:rPr>
+              <w:t xml:space="preserve">Упаковочный лист и перечень ЗИП (п. 2 программы FAT)</w:t>
+            </w:r>
+          </w:p>
+        </w:tc>
+        <w:tc>
+          <w:tcPr>
+            <w:tcW w:type="dxa" w:w="1000"/>
+            <w:tcBorders>
+              <w:top w:val="single" w:color="808080" w:sz="4"/>
+              <w:left w:val="single" w:color="808080" w:sz="4"/>
+              <w:bottom w:val="single" w:color="808080" w:sz="4"/>
+              <w:right w:val="single" w:color="808080" w:sz="4"/>
+            </w:tcBorders>
+            <w:tcMar>
+              <w:top w:type="dxa" w:w="60"/>
+              <w:left w:type="dxa" w:w="100"/>
+              <w:bottom w:type="dxa" w:w="60"/>
+              <w:right w:type="dxa" w:w="100"/>
+            </w:tcMar>
+            <w:vAlign w:val="top"/>
+          </w:tcPr>
+          <w:p/>
+        </w:tc>
+        <w:tc>
+          <w:tcPr>
+            <w:tcW w:type="dxa" w:w="1800"/>
             <w:tcBorders>
               <w:top w:val="single" w:color="808080" w:sz="4"/>
               <w:left w:val="single" w:color="808080" w:sz="4"/>
@@ -7040,70 +6961,89 @@
         </w:trPr>
         <w:tc>
           <w:tcPr>
-            <w:tcW w:type="dxa" w:w="1500"/>
-            <w:tcBorders>
-              <w:top w:val="single" w:color="808080" w:sz="4"/>
-              <w:left w:val="single" w:color="808080" w:sz="4"/>
-              <w:bottom w:val="single" w:color="808080" w:sz="4"/>
-              <w:right w:val="single" w:color="808080" w:sz="4"/>
-            </w:tcBorders>
-            <w:tcMar>
-              <w:top w:type="dxa" w:w="60"/>
-              <w:left w:type="dxa" w:w="100"/>
-              <w:bottom w:type="dxa" w:w="60"/>
-              <w:right w:type="dxa" w:w="100"/>
-            </w:tcMar>
-            <w:vAlign w:val="top"/>
-          </w:tcPr>
-          <w:p>
-            <w:pPr>
-              <w:spacing w:after="40" w:before="40"/>
-              <w:jc w:val="center"/>
-            </w:pPr>
-            <w:r>
-              <w:rPr>
-                <w:rFonts w:ascii="Times New Roman" w:cs="Times New Roman" w:eastAsia="Times New Roman" w:hAnsi="Times New Roman"/>
-                <w:sz w:val="22"/>
-                <w:szCs w:val="22"/>
-              </w:rPr>
-              <w:t xml:space="preserve">3</w:t>
-            </w:r>
-          </w:p>
-        </w:tc>
-        <w:tc>
-          <w:tcPr>
-            <w:tcW w:type="dxa" w:w="6038"/>
-            <w:tcBorders>
-              <w:top w:val="single" w:color="808080" w:sz="4"/>
-              <w:left w:val="single" w:color="808080" w:sz="4"/>
-              <w:bottom w:val="single" w:color="808080" w:sz="4"/>
-              <w:right w:val="single" w:color="808080" w:sz="4"/>
-            </w:tcBorders>
-            <w:tcMar>
-              <w:top w:type="dxa" w:w="60"/>
-              <w:left w:type="dxa" w:w="100"/>
-              <w:bottom w:type="dxa" w:w="60"/>
-              <w:right w:type="dxa" w:w="100"/>
-            </w:tcMar>
-            <w:vAlign w:val="top"/>
-          </w:tcPr>
-          <w:p>
-            <w:pPr>
-              <w:spacing w:after="40" w:before="40"/>
-            </w:pPr>
-            <w:r>
-              <w:rPr>
-                <w:rFonts w:ascii="Times New Roman" w:cs="Times New Roman" w:eastAsia="Times New Roman" w:hAnsi="Times New Roman"/>
-                <w:sz w:val="22"/>
-                <w:szCs w:val="22"/>
-              </w:rPr>
-              <w:t xml:space="preserve">Чертёж и спецификация ротора и скребковой системы E-102 и E-202, сертификат на материал скребков</w:t>
-            </w:r>
-          </w:p>
-        </w:tc>
-        <w:tc>
-          <w:tcPr>
-            <w:tcW w:type="dxa" w:w="2100"/>
+            <w:tcW w:type="dxa" w:w="700"/>
+            <w:tcBorders>
+              <w:top w:val="single" w:color="808080" w:sz="4"/>
+              <w:left w:val="single" w:color="808080" w:sz="4"/>
+              <w:bottom w:val="single" w:color="808080" w:sz="4"/>
+              <w:right w:val="single" w:color="808080" w:sz="4"/>
+            </w:tcBorders>
+            <w:tcMar>
+              <w:top w:type="dxa" w:w="60"/>
+              <w:left w:type="dxa" w:w="100"/>
+              <w:bottom w:type="dxa" w:w="60"/>
+              <w:right w:type="dxa" w:w="100"/>
+            </w:tcMar>
+            <w:vAlign w:val="top"/>
+          </w:tcPr>
+          <w:p>
+            <w:pPr>
+              <w:spacing w:after="40" w:before="40"/>
+              <w:jc w:val="center"/>
+            </w:pPr>
+            <w:r>
+              <w:rPr>
+                <w:rFonts w:ascii="Times New Roman" w:cs="Times New Roman" w:eastAsia="Times New Roman" w:hAnsi="Times New Roman"/>
+                <w:sz w:val="22"/>
+                <w:szCs w:val="22"/>
+              </w:rPr>
+              <w:t xml:space="preserve">8.3</w:t>
+            </w:r>
+          </w:p>
+        </w:tc>
+        <w:tc>
+          <w:tcPr>
+            <w:tcW w:type="dxa" w:w="6138"/>
+            <w:tcBorders>
+              <w:top w:val="single" w:color="808080" w:sz="4"/>
+              <w:left w:val="single" w:color="808080" w:sz="4"/>
+              <w:bottom w:val="single" w:color="808080" w:sz="4"/>
+              <w:right w:val="single" w:color="808080" w:sz="4"/>
+            </w:tcBorders>
+            <w:tcMar>
+              <w:top w:type="dxa" w:w="60"/>
+              <w:left w:type="dxa" w:w="100"/>
+              <w:bottom w:type="dxa" w:w="60"/>
+              <w:right w:type="dxa" w:w="100"/>
+            </w:tcMar>
+            <w:vAlign w:val="top"/>
+          </w:tcPr>
+          <w:p>
+            <w:pPr>
+              <w:spacing w:after="40" w:before="40"/>
+            </w:pPr>
+            <w:r>
+              <w:rPr>
+                <w:rFonts w:ascii="Times New Roman" w:cs="Times New Roman" w:eastAsia="Times New Roman" w:hAnsi="Times New Roman"/>
+                <w:sz w:val="22"/>
+                <w:szCs w:val="22"/>
+              </w:rPr>
+              <w:t xml:space="preserve">Чертёж и спецификация ротора и скребковой системы E-102 и E-202, сертификат на материал скребков (п. 3 программы FAT)</w:t>
+            </w:r>
+          </w:p>
+        </w:tc>
+        <w:tc>
+          <w:tcPr>
+            <w:tcW w:type="dxa" w:w="1000"/>
+            <w:tcBorders>
+              <w:top w:val="single" w:color="808080" w:sz="4"/>
+              <w:left w:val="single" w:color="808080" w:sz="4"/>
+              <w:bottom w:val="single" w:color="808080" w:sz="4"/>
+              <w:right w:val="single" w:color="808080" w:sz="4"/>
+            </w:tcBorders>
+            <w:tcMar>
+              <w:top w:type="dxa" w:w="60"/>
+              <w:left w:type="dxa" w:w="100"/>
+              <w:bottom w:type="dxa" w:w="60"/>
+              <w:right w:type="dxa" w:w="100"/>
+            </w:tcMar>
+            <w:vAlign w:val="top"/>
+          </w:tcPr>
+          <w:p/>
+        </w:tc>
+        <w:tc>
+          <w:tcPr>
+            <w:tcW w:type="dxa" w:w="1800"/>
             <w:tcBorders>
               <w:top w:val="single" w:color="808080" w:sz="4"/>
               <w:left w:val="single" w:color="808080" w:sz="4"/>
@@ -7139,64 +7079,64 @@
         </w:trPr>
         <w:tc>
           <w:tcPr>
-            <w:tcW w:type="dxa" w:w="1500"/>
-            <w:tcBorders>
-              <w:top w:val="single" w:color="808080" w:sz="4"/>
-              <w:left w:val="single" w:color="808080" w:sz="4"/>
-              <w:bottom w:val="single" w:color="808080" w:sz="4"/>
-              <w:right w:val="single" w:color="808080" w:sz="4"/>
-            </w:tcBorders>
-            <w:tcMar>
-              <w:top w:type="dxa" w:w="60"/>
-              <w:left w:type="dxa" w:w="100"/>
-              <w:bottom w:type="dxa" w:w="60"/>
-              <w:right w:type="dxa" w:w="100"/>
-            </w:tcMar>
-            <w:vAlign w:val="top"/>
-          </w:tcPr>
-          <w:p>
-            <w:pPr>
-              <w:spacing w:after="40" w:before="40"/>
-              <w:jc w:val="center"/>
-            </w:pPr>
-            <w:r>
-              <w:rPr>
-                <w:rFonts w:ascii="Times New Roman" w:cs="Times New Roman" w:eastAsia="Times New Roman" w:hAnsi="Times New Roman"/>
-                <w:sz w:val="22"/>
-                <w:szCs w:val="22"/>
-              </w:rPr>
-              <w:t xml:space="preserve">4</w:t>
-            </w:r>
-          </w:p>
-        </w:tc>
-        <w:tc>
-          <w:tcPr>
-            <w:tcW w:type="dxa" w:w="6038"/>
-            <w:tcBorders>
-              <w:top w:val="single" w:color="808080" w:sz="4"/>
-              <w:left w:val="single" w:color="808080" w:sz="4"/>
-              <w:bottom w:val="single" w:color="808080" w:sz="4"/>
-              <w:right w:val="single" w:color="808080" w:sz="4"/>
-            </w:tcBorders>
-            <w:tcMar>
-              <w:top w:type="dxa" w:w="60"/>
-              <w:left w:type="dxa" w:w="100"/>
-              <w:bottom w:type="dxa" w:w="60"/>
-              <w:right w:type="dxa" w:w="100"/>
-            </w:tcMar>
-            <w:vAlign w:val="top"/>
-          </w:tcPr>
-          <w:p>
-            <w:pPr>
-              <w:spacing w:after="40" w:before="40"/>
-            </w:pPr>
-            <w:r>
-              <w:rPr>
-                <w:rFonts w:ascii="Times New Roman" w:cs="Times New Roman" w:eastAsia="Times New Roman" w:hAnsi="Times New Roman"/>
-                <w:sz w:val="22"/>
-                <w:szCs w:val="22"/>
-              </w:rPr>
-              <w:t xml:space="preserve">Паспорта аппаратов:</w:t>
+            <w:tcW w:type="dxa" w:w="700"/>
+            <w:tcBorders>
+              <w:top w:val="single" w:color="808080" w:sz="4"/>
+              <w:left w:val="single" w:color="808080" w:sz="4"/>
+              <w:bottom w:val="single" w:color="808080" w:sz="4"/>
+              <w:right w:val="single" w:color="808080" w:sz="4"/>
+            </w:tcBorders>
+            <w:tcMar>
+              <w:top w:type="dxa" w:w="60"/>
+              <w:left w:type="dxa" w:w="100"/>
+              <w:bottom w:type="dxa" w:w="60"/>
+              <w:right w:type="dxa" w:w="100"/>
+            </w:tcMar>
+            <w:vAlign w:val="top"/>
+          </w:tcPr>
+          <w:p>
+            <w:pPr>
+              <w:spacing w:after="40" w:before="40"/>
+              <w:jc w:val="center"/>
+            </w:pPr>
+            <w:r>
+              <w:rPr>
+                <w:rFonts w:ascii="Times New Roman" w:cs="Times New Roman" w:eastAsia="Times New Roman" w:hAnsi="Times New Roman"/>
+                <w:sz w:val="22"/>
+                <w:szCs w:val="22"/>
+              </w:rPr>
+              <w:t xml:space="preserve">8.4</w:t>
+            </w:r>
+          </w:p>
+        </w:tc>
+        <w:tc>
+          <w:tcPr>
+            <w:tcW w:type="dxa" w:w="6138"/>
+            <w:tcBorders>
+              <w:top w:val="single" w:color="808080" w:sz="4"/>
+              <w:left w:val="single" w:color="808080" w:sz="4"/>
+              <w:bottom w:val="single" w:color="808080" w:sz="4"/>
+              <w:right w:val="single" w:color="808080" w:sz="4"/>
+            </w:tcBorders>
+            <w:tcMar>
+              <w:top w:type="dxa" w:w="60"/>
+              <w:left w:type="dxa" w:w="100"/>
+              <w:bottom w:type="dxa" w:w="60"/>
+              <w:right w:type="dxa" w:w="100"/>
+            </w:tcMar>
+            <w:vAlign w:val="top"/>
+          </w:tcPr>
+          <w:p>
+            <w:pPr>
+              <w:spacing w:after="40" w:before="40"/>
+            </w:pPr>
+            <w:r>
+              <w:rPr>
+                <w:rFonts w:ascii="Times New Roman" w:cs="Times New Roman" w:eastAsia="Times New Roman" w:hAnsi="Times New Roman"/>
+                <w:sz w:val="22"/>
+                <w:szCs w:val="22"/>
+              </w:rPr>
+              <w:t xml:space="preserve">Паспорта аппаратов (п. 4 программы FAT):</w:t>
             </w:r>
           </w:p>
           <w:p>
@@ -7286,7 +7226,26 @@
         </w:tc>
         <w:tc>
           <w:tcPr>
-            <w:tcW w:type="dxa" w:w="2100"/>
+            <w:tcW w:type="dxa" w:w="1000"/>
+            <w:tcBorders>
+              <w:top w:val="single" w:color="808080" w:sz="4"/>
+              <w:left w:val="single" w:color="808080" w:sz="4"/>
+              <w:bottom w:val="single" w:color="808080" w:sz="4"/>
+              <w:right w:val="single" w:color="808080" w:sz="4"/>
+            </w:tcBorders>
+            <w:tcMar>
+              <w:top w:type="dxa" w:w="60"/>
+              <w:left w:type="dxa" w:w="100"/>
+              <w:bottom w:type="dxa" w:w="60"/>
+              <w:right w:type="dxa" w:w="100"/>
+            </w:tcMar>
+            <w:vAlign w:val="top"/>
+          </w:tcPr>
+          <w:p/>
+        </w:tc>
+        <w:tc>
+          <w:tcPr>
+            <w:tcW w:type="dxa" w:w="1800"/>
             <w:tcBorders>
               <w:top w:val="single" w:color="808080" w:sz="4"/>
               <w:left w:val="single" w:color="808080" w:sz="4"/>
@@ -7322,64 +7281,64 @@
         </w:trPr>
         <w:tc>
           <w:tcPr>
-            <w:tcW w:type="dxa" w:w="1500"/>
-            <w:tcBorders>
-              <w:top w:val="single" w:color="808080" w:sz="4"/>
-              <w:left w:val="single" w:color="808080" w:sz="4"/>
-              <w:bottom w:val="single" w:color="808080" w:sz="4"/>
-              <w:right w:val="single" w:color="808080" w:sz="4"/>
-            </w:tcBorders>
-            <w:tcMar>
-              <w:top w:type="dxa" w:w="60"/>
-              <w:left w:type="dxa" w:w="100"/>
-              <w:bottom w:type="dxa" w:w="60"/>
-              <w:right w:type="dxa" w:w="100"/>
-            </w:tcMar>
-            <w:vAlign w:val="top"/>
-          </w:tcPr>
-          <w:p>
-            <w:pPr>
-              <w:spacing w:after="40" w:before="40"/>
-              <w:jc w:val="center"/>
-            </w:pPr>
-            <w:r>
-              <w:rPr>
-                <w:rFonts w:ascii="Times New Roman" w:cs="Times New Roman" w:eastAsia="Times New Roman" w:hAnsi="Times New Roman"/>
-                <w:sz w:val="22"/>
-                <w:szCs w:val="22"/>
-              </w:rPr>
-              <w:t xml:space="preserve">5</w:t>
-            </w:r>
-          </w:p>
-        </w:tc>
-        <w:tc>
-          <w:tcPr>
-            <w:tcW w:type="dxa" w:w="6038"/>
-            <w:tcBorders>
-              <w:top w:val="single" w:color="808080" w:sz="4"/>
-              <w:left w:val="single" w:color="808080" w:sz="4"/>
-              <w:bottom w:val="single" w:color="808080" w:sz="4"/>
-              <w:right w:val="single" w:color="808080" w:sz="4"/>
-            </w:tcBorders>
-            <w:tcMar>
-              <w:top w:type="dxa" w:w="60"/>
-              <w:left w:type="dxa" w:w="100"/>
-              <w:bottom w:type="dxa" w:w="60"/>
-              <w:right w:type="dxa" w:w="100"/>
-            </w:tcMar>
-            <w:vAlign w:val="top"/>
-          </w:tcPr>
-          <w:p>
-            <w:pPr>
-              <w:spacing w:after="40" w:before="40"/>
-            </w:pPr>
-            <w:r>
-              <w:rPr>
-                <w:rFonts w:ascii="Times New Roman" w:cs="Times New Roman" w:eastAsia="Times New Roman" w:hAnsi="Times New Roman"/>
-                <w:sz w:val="22"/>
-                <w:szCs w:val="22"/>
-              </w:rPr>
-              <w:t xml:space="preserve">Сертификаты на материалы:</w:t>
+            <w:tcW w:type="dxa" w:w="700"/>
+            <w:tcBorders>
+              <w:top w:val="single" w:color="808080" w:sz="4"/>
+              <w:left w:val="single" w:color="808080" w:sz="4"/>
+              <w:bottom w:val="single" w:color="808080" w:sz="4"/>
+              <w:right w:val="single" w:color="808080" w:sz="4"/>
+            </w:tcBorders>
+            <w:tcMar>
+              <w:top w:type="dxa" w:w="60"/>
+              <w:left w:type="dxa" w:w="100"/>
+              <w:bottom w:type="dxa" w:w="60"/>
+              <w:right w:type="dxa" w:w="100"/>
+            </w:tcMar>
+            <w:vAlign w:val="top"/>
+          </w:tcPr>
+          <w:p>
+            <w:pPr>
+              <w:spacing w:after="40" w:before="40"/>
+              <w:jc w:val="center"/>
+            </w:pPr>
+            <w:r>
+              <w:rPr>
+                <w:rFonts w:ascii="Times New Roman" w:cs="Times New Roman" w:eastAsia="Times New Roman" w:hAnsi="Times New Roman"/>
+                <w:sz w:val="22"/>
+                <w:szCs w:val="22"/>
+              </w:rPr>
+              <w:t xml:space="preserve">8.5</w:t>
+            </w:r>
+          </w:p>
+        </w:tc>
+        <w:tc>
+          <w:tcPr>
+            <w:tcW w:type="dxa" w:w="6138"/>
+            <w:tcBorders>
+              <w:top w:val="single" w:color="808080" w:sz="4"/>
+              <w:left w:val="single" w:color="808080" w:sz="4"/>
+              <w:bottom w:val="single" w:color="808080" w:sz="4"/>
+              <w:right w:val="single" w:color="808080" w:sz="4"/>
+            </w:tcBorders>
+            <w:tcMar>
+              <w:top w:type="dxa" w:w="60"/>
+              <w:left w:type="dxa" w:w="100"/>
+              <w:bottom w:type="dxa" w:w="60"/>
+              <w:right w:type="dxa" w:w="100"/>
+            </w:tcMar>
+            <w:vAlign w:val="top"/>
+          </w:tcPr>
+          <w:p>
+            <w:pPr>
+              <w:spacing w:after="40" w:before="40"/>
+            </w:pPr>
+            <w:r>
+              <w:rPr>
+                <w:rFonts w:ascii="Times New Roman" w:cs="Times New Roman" w:eastAsia="Times New Roman" w:hAnsi="Times New Roman"/>
+                <w:sz w:val="22"/>
+                <w:szCs w:val="22"/>
+              </w:rPr>
+              <w:t xml:space="preserve">Сертификаты на материалы (п. 5 программы FAT):</w:t>
             </w:r>
           </w:p>
           <w:p>
@@ -7427,7 +7386,26 @@
         </w:tc>
         <w:tc>
           <w:tcPr>
-            <w:tcW w:type="dxa" w:w="2100"/>
+            <w:tcW w:type="dxa" w:w="1000"/>
+            <w:tcBorders>
+              <w:top w:val="single" w:color="808080" w:sz="4"/>
+              <w:left w:val="single" w:color="808080" w:sz="4"/>
+              <w:bottom w:val="single" w:color="808080" w:sz="4"/>
+              <w:right w:val="single" w:color="808080" w:sz="4"/>
+            </w:tcBorders>
+            <w:tcMar>
+              <w:top w:type="dxa" w:w="60"/>
+              <w:left w:type="dxa" w:w="100"/>
+              <w:bottom w:type="dxa" w:w="60"/>
+              <w:right w:type="dxa" w:w="100"/>
+            </w:tcMar>
+            <w:vAlign w:val="top"/>
+          </w:tcPr>
+          <w:p/>
+        </w:tc>
+        <w:tc>
+          <w:tcPr>
+            <w:tcW w:type="dxa" w:w="1800"/>
             <w:tcBorders>
               <w:top w:val="single" w:color="808080" w:sz="4"/>
               <w:left w:val="single" w:color="808080" w:sz="4"/>
@@ -7463,70 +7441,89 @@
         </w:trPr>
         <w:tc>
           <w:tcPr>
-            <w:tcW w:type="dxa" w:w="1500"/>
-            <w:tcBorders>
-              <w:top w:val="single" w:color="808080" w:sz="4"/>
-              <w:left w:val="single" w:color="808080" w:sz="4"/>
-              <w:bottom w:val="single" w:color="808080" w:sz="4"/>
-              <w:right w:val="single" w:color="808080" w:sz="4"/>
-            </w:tcBorders>
-            <w:tcMar>
-              <w:top w:type="dxa" w:w="60"/>
-              <w:left w:type="dxa" w:w="100"/>
-              <w:bottom w:type="dxa" w:w="60"/>
-              <w:right w:type="dxa" w:w="100"/>
-            </w:tcMar>
-            <w:vAlign w:val="top"/>
-          </w:tcPr>
-          <w:p>
-            <w:pPr>
-              <w:spacing w:after="40" w:before="40"/>
-              <w:jc w:val="center"/>
-            </w:pPr>
-            <w:r>
-              <w:rPr>
-                <w:rFonts w:ascii="Times New Roman" w:cs="Times New Roman" w:eastAsia="Times New Roman" w:hAnsi="Times New Roman"/>
-                <w:sz w:val="22"/>
-                <w:szCs w:val="22"/>
-              </w:rPr>
-              <w:t xml:space="preserve">6</w:t>
-            </w:r>
-          </w:p>
-        </w:tc>
-        <w:tc>
-          <w:tcPr>
-            <w:tcW w:type="dxa" w:w="6038"/>
-            <w:tcBorders>
-              <w:top w:val="single" w:color="808080" w:sz="4"/>
-              <w:left w:val="single" w:color="808080" w:sz="4"/>
-              <w:bottom w:val="single" w:color="808080" w:sz="4"/>
-              <w:right w:val="single" w:color="808080" w:sz="4"/>
-            </w:tcBorders>
-            <w:tcMar>
-              <w:top w:type="dxa" w:w="60"/>
-              <w:left w:type="dxa" w:w="100"/>
-              <w:bottom w:type="dxa" w:w="60"/>
-              <w:right w:type="dxa" w:w="100"/>
-            </w:tcMar>
-            <w:vAlign w:val="top"/>
-          </w:tcPr>
-          <w:p>
-            <w:pPr>
-              <w:spacing w:after="40" w:before="40"/>
-            </w:pPr>
-            <w:r>
-              <w:rPr>
-                <w:rFonts w:ascii="Times New Roman" w:cs="Times New Roman" w:eastAsia="Times New Roman" w:hAnsi="Times New Roman"/>
-                <w:sz w:val="22"/>
-                <w:szCs w:val="22"/>
-              </w:rPr>
-              <w:t xml:space="preserve">Протоколы неразрушающего контроля: E-101, V-103, V-203, E-102, E-202</w:t>
-            </w:r>
-          </w:p>
-        </w:tc>
-        <w:tc>
-          <w:tcPr>
-            <w:tcW w:type="dxa" w:w="2100"/>
+            <w:tcW w:type="dxa" w:w="700"/>
+            <w:tcBorders>
+              <w:top w:val="single" w:color="808080" w:sz="4"/>
+              <w:left w:val="single" w:color="808080" w:sz="4"/>
+              <w:bottom w:val="single" w:color="808080" w:sz="4"/>
+              <w:right w:val="single" w:color="808080" w:sz="4"/>
+            </w:tcBorders>
+            <w:tcMar>
+              <w:top w:type="dxa" w:w="60"/>
+              <w:left w:type="dxa" w:w="100"/>
+              <w:bottom w:type="dxa" w:w="60"/>
+              <w:right w:type="dxa" w:w="100"/>
+            </w:tcMar>
+            <w:vAlign w:val="top"/>
+          </w:tcPr>
+          <w:p>
+            <w:pPr>
+              <w:spacing w:after="40" w:before="40"/>
+              <w:jc w:val="center"/>
+            </w:pPr>
+            <w:r>
+              <w:rPr>
+                <w:rFonts w:ascii="Times New Roman" w:cs="Times New Roman" w:eastAsia="Times New Roman" w:hAnsi="Times New Roman"/>
+                <w:sz w:val="22"/>
+                <w:szCs w:val="22"/>
+              </w:rPr>
+              <w:t xml:space="preserve">8.6</w:t>
+            </w:r>
+          </w:p>
+        </w:tc>
+        <w:tc>
+          <w:tcPr>
+            <w:tcW w:type="dxa" w:w="6138"/>
+            <w:tcBorders>
+              <w:top w:val="single" w:color="808080" w:sz="4"/>
+              <w:left w:val="single" w:color="808080" w:sz="4"/>
+              <w:bottom w:val="single" w:color="808080" w:sz="4"/>
+              <w:right w:val="single" w:color="808080" w:sz="4"/>
+            </w:tcBorders>
+            <w:tcMar>
+              <w:top w:type="dxa" w:w="60"/>
+              <w:left w:type="dxa" w:w="100"/>
+              <w:bottom w:type="dxa" w:w="60"/>
+              <w:right w:type="dxa" w:w="100"/>
+            </w:tcMar>
+            <w:vAlign w:val="top"/>
+          </w:tcPr>
+          <w:p>
+            <w:pPr>
+              <w:spacing w:after="40" w:before="40"/>
+            </w:pPr>
+            <w:r>
+              <w:rPr>
+                <w:rFonts w:ascii="Times New Roman" w:cs="Times New Roman" w:eastAsia="Times New Roman" w:hAnsi="Times New Roman"/>
+                <w:sz w:val="22"/>
+                <w:szCs w:val="22"/>
+              </w:rPr>
+              <w:t xml:space="preserve">Протоколы неразрушающего контроля: E-101, V-103, V-203, E-102, E-202 (п. 6 программы FAT)</w:t>
+            </w:r>
+          </w:p>
+        </w:tc>
+        <w:tc>
+          <w:tcPr>
+            <w:tcW w:type="dxa" w:w="1000"/>
+            <w:tcBorders>
+              <w:top w:val="single" w:color="808080" w:sz="4"/>
+              <w:left w:val="single" w:color="808080" w:sz="4"/>
+              <w:bottom w:val="single" w:color="808080" w:sz="4"/>
+              <w:right w:val="single" w:color="808080" w:sz="4"/>
+            </w:tcBorders>
+            <w:tcMar>
+              <w:top w:type="dxa" w:w="60"/>
+              <w:left w:type="dxa" w:w="100"/>
+              <w:bottom w:type="dxa" w:w="60"/>
+              <w:right w:type="dxa" w:w="100"/>
+            </w:tcMar>
+            <w:vAlign w:val="top"/>
+          </w:tcPr>
+          <w:p/>
+        </w:tc>
+        <w:tc>
+          <w:tcPr>
+            <w:tcW w:type="dxa" w:w="1800"/>
             <w:tcBorders>
               <w:top w:val="single" w:color="808080" w:sz="4"/>
               <w:left w:val="single" w:color="808080" w:sz="4"/>
@@ -7562,70 +7559,89 @@
         </w:trPr>
         <w:tc>
           <w:tcPr>
-            <w:tcW w:type="dxa" w:w="1500"/>
-            <w:tcBorders>
-              <w:top w:val="single" w:color="808080" w:sz="4"/>
-              <w:left w:val="single" w:color="808080" w:sz="4"/>
-              <w:bottom w:val="single" w:color="808080" w:sz="4"/>
-              <w:right w:val="single" w:color="808080" w:sz="4"/>
-            </w:tcBorders>
-            <w:tcMar>
-              <w:top w:type="dxa" w:w="60"/>
-              <w:left w:type="dxa" w:w="100"/>
-              <w:bottom w:type="dxa" w:w="60"/>
-              <w:right w:type="dxa" w:w="100"/>
-            </w:tcMar>
-            <w:vAlign w:val="top"/>
-          </w:tcPr>
-          <w:p>
-            <w:pPr>
-              <w:spacing w:after="40" w:before="40"/>
-              <w:jc w:val="center"/>
-            </w:pPr>
-            <w:r>
-              <w:rPr>
-                <w:rFonts w:ascii="Times New Roman" w:cs="Times New Roman" w:eastAsia="Times New Roman" w:hAnsi="Times New Roman"/>
-                <w:sz w:val="22"/>
-                <w:szCs w:val="22"/>
-              </w:rPr>
-              <w:t xml:space="preserve">7</w:t>
-            </w:r>
-          </w:p>
-        </w:tc>
-        <w:tc>
-          <w:tcPr>
-            <w:tcW w:type="dxa" w:w="6038"/>
-            <w:tcBorders>
-              <w:top w:val="single" w:color="808080" w:sz="4"/>
-              <w:left w:val="single" w:color="808080" w:sz="4"/>
-              <w:bottom w:val="single" w:color="808080" w:sz="4"/>
-              <w:right w:val="single" w:color="808080" w:sz="4"/>
-            </w:tcBorders>
-            <w:tcMar>
-              <w:top w:type="dxa" w:w="60"/>
-              <w:left w:type="dxa" w:w="100"/>
-              <w:bottom w:type="dxa" w:w="60"/>
-              <w:right w:type="dxa" w:w="100"/>
-            </w:tcMar>
-            <w:vAlign w:val="top"/>
-          </w:tcPr>
-          <w:p>
-            <w:pPr>
-              <w:spacing w:after="40" w:before="40"/>
-            </w:pPr>
-            <w:r>
-              <w:rPr>
-                <w:rFonts w:ascii="Times New Roman" w:cs="Times New Roman" w:eastAsia="Times New Roman" w:hAnsi="Times New Roman"/>
-                <w:sz w:val="22"/>
-                <w:szCs w:val="22"/>
-              </w:rPr>
-              <w:t xml:space="preserve">Протоколы гидроиспытаний: E-101, V-103, V-203, E-102 и E-202 (рубашки), E-204; подтверждение сушки после испытаний</w:t>
-            </w:r>
-          </w:p>
-        </w:tc>
-        <w:tc>
-          <w:tcPr>
-            <w:tcW w:type="dxa" w:w="2100"/>
+            <w:tcW w:type="dxa" w:w="700"/>
+            <w:tcBorders>
+              <w:top w:val="single" w:color="808080" w:sz="4"/>
+              <w:left w:val="single" w:color="808080" w:sz="4"/>
+              <w:bottom w:val="single" w:color="808080" w:sz="4"/>
+              <w:right w:val="single" w:color="808080" w:sz="4"/>
+            </w:tcBorders>
+            <w:tcMar>
+              <w:top w:type="dxa" w:w="60"/>
+              <w:left w:type="dxa" w:w="100"/>
+              <w:bottom w:type="dxa" w:w="60"/>
+              <w:right w:type="dxa" w:w="100"/>
+            </w:tcMar>
+            <w:vAlign w:val="top"/>
+          </w:tcPr>
+          <w:p>
+            <w:pPr>
+              <w:spacing w:after="40" w:before="40"/>
+              <w:jc w:val="center"/>
+            </w:pPr>
+            <w:r>
+              <w:rPr>
+                <w:rFonts w:ascii="Times New Roman" w:cs="Times New Roman" w:eastAsia="Times New Roman" w:hAnsi="Times New Roman"/>
+                <w:sz w:val="22"/>
+                <w:szCs w:val="22"/>
+              </w:rPr>
+              <w:t xml:space="preserve">8.7</w:t>
+            </w:r>
+          </w:p>
+        </w:tc>
+        <w:tc>
+          <w:tcPr>
+            <w:tcW w:type="dxa" w:w="6138"/>
+            <w:tcBorders>
+              <w:top w:val="single" w:color="808080" w:sz="4"/>
+              <w:left w:val="single" w:color="808080" w:sz="4"/>
+              <w:bottom w:val="single" w:color="808080" w:sz="4"/>
+              <w:right w:val="single" w:color="808080" w:sz="4"/>
+            </w:tcBorders>
+            <w:tcMar>
+              <w:top w:type="dxa" w:w="60"/>
+              <w:left w:type="dxa" w:w="100"/>
+              <w:bottom w:type="dxa" w:w="60"/>
+              <w:right w:type="dxa" w:w="100"/>
+            </w:tcMar>
+            <w:vAlign w:val="top"/>
+          </w:tcPr>
+          <w:p>
+            <w:pPr>
+              <w:spacing w:after="40" w:before="40"/>
+            </w:pPr>
+            <w:r>
+              <w:rPr>
+                <w:rFonts w:ascii="Times New Roman" w:cs="Times New Roman" w:eastAsia="Times New Roman" w:hAnsi="Times New Roman"/>
+                <w:sz w:val="22"/>
+                <w:szCs w:val="22"/>
+              </w:rPr>
+              <w:t xml:space="preserve">Протоколы гидроиспытаний: E-101, V-103, V-203, E-102 и E-202 (рубашки), E-204; подтверждение сушки после испытаний (п. 7 программы FAT)</w:t>
+            </w:r>
+          </w:p>
+        </w:tc>
+        <w:tc>
+          <w:tcPr>
+            <w:tcW w:type="dxa" w:w="1000"/>
+            <w:tcBorders>
+              <w:top w:val="single" w:color="808080" w:sz="4"/>
+              <w:left w:val="single" w:color="808080" w:sz="4"/>
+              <w:bottom w:val="single" w:color="808080" w:sz="4"/>
+              <w:right w:val="single" w:color="808080" w:sz="4"/>
+            </w:tcBorders>
+            <w:tcMar>
+              <w:top w:type="dxa" w:w="60"/>
+              <w:left w:type="dxa" w:w="100"/>
+              <w:bottom w:type="dxa" w:w="60"/>
+              <w:right w:type="dxa" w:w="100"/>
+            </w:tcMar>
+            <w:vAlign w:val="top"/>
+          </w:tcPr>
+          <w:p/>
+        </w:tc>
+        <w:tc>
+          <w:tcPr>
+            <w:tcW w:type="dxa" w:w="1800"/>
             <w:tcBorders>
               <w:top w:val="single" w:color="808080" w:sz="4"/>
               <w:left w:val="single" w:color="808080" w:sz="4"/>
@@ -7661,70 +7677,89 @@
         </w:trPr>
         <w:tc>
           <w:tcPr>
-            <w:tcW w:type="dxa" w:w="1500"/>
-            <w:tcBorders>
-              <w:top w:val="single" w:color="808080" w:sz="4"/>
-              <w:left w:val="single" w:color="808080" w:sz="4"/>
-              <w:bottom w:val="single" w:color="808080" w:sz="4"/>
-              <w:right w:val="single" w:color="808080" w:sz="4"/>
-            </w:tcBorders>
-            <w:tcMar>
-              <w:top w:type="dxa" w:w="60"/>
-              <w:left w:type="dxa" w:w="100"/>
-              <w:bottom w:type="dxa" w:w="60"/>
-              <w:right w:type="dxa" w:w="100"/>
-            </w:tcMar>
-            <w:vAlign w:val="top"/>
-          </w:tcPr>
-          <w:p>
-            <w:pPr>
-              <w:spacing w:after="40" w:before="40"/>
-              <w:jc w:val="center"/>
-            </w:pPr>
-            <w:r>
-              <w:rPr>
-                <w:rFonts w:ascii="Times New Roman" w:cs="Times New Roman" w:eastAsia="Times New Roman" w:hAnsi="Times New Roman"/>
-                <w:sz w:val="22"/>
-                <w:szCs w:val="22"/>
-              </w:rPr>
-              <w:t xml:space="preserve">8</w:t>
-            </w:r>
-          </w:p>
-        </w:tc>
-        <w:tc>
-          <w:tcPr>
-            <w:tcW w:type="dxa" w:w="6038"/>
-            <w:tcBorders>
-              <w:top w:val="single" w:color="808080" w:sz="4"/>
-              <w:left w:val="single" w:color="808080" w:sz="4"/>
-              <w:bottom w:val="single" w:color="808080" w:sz="4"/>
-              <w:right w:val="single" w:color="808080" w:sz="4"/>
-            </w:tcBorders>
-            <w:tcMar>
-              <w:top w:type="dxa" w:w="60"/>
-              <w:left w:type="dxa" w:w="100"/>
-              <w:bottom w:type="dxa" w:w="60"/>
-              <w:right w:type="dxa" w:w="100"/>
-            </w:tcMar>
-            <w:vAlign w:val="top"/>
-          </w:tcPr>
-          <w:p>
-            <w:pPr>
-              <w:spacing w:after="40" w:before="40"/>
-            </w:pPr>
-            <w:r>
-              <w:rPr>
-                <w:rFonts w:ascii="Times New Roman" w:cs="Times New Roman" w:eastAsia="Times New Roman" w:hAnsi="Times New Roman"/>
-                <w:sz w:val="22"/>
-                <w:szCs w:val="22"/>
-              </w:rPr>
-              <w:t xml:space="preserve">Протоколы заводских испытаний E-102 и E-202 у изготовителя (LIMA)</w:t>
-            </w:r>
-          </w:p>
-        </w:tc>
-        <w:tc>
-          <w:tcPr>
-            <w:tcW w:type="dxa" w:w="2100"/>
+            <w:tcW w:type="dxa" w:w="700"/>
+            <w:tcBorders>
+              <w:top w:val="single" w:color="808080" w:sz="4"/>
+              <w:left w:val="single" w:color="808080" w:sz="4"/>
+              <w:bottom w:val="single" w:color="808080" w:sz="4"/>
+              <w:right w:val="single" w:color="808080" w:sz="4"/>
+            </w:tcBorders>
+            <w:tcMar>
+              <w:top w:type="dxa" w:w="60"/>
+              <w:left w:type="dxa" w:w="100"/>
+              <w:bottom w:type="dxa" w:w="60"/>
+              <w:right w:type="dxa" w:w="100"/>
+            </w:tcMar>
+            <w:vAlign w:val="top"/>
+          </w:tcPr>
+          <w:p>
+            <w:pPr>
+              <w:spacing w:after="40" w:before="40"/>
+              <w:jc w:val="center"/>
+            </w:pPr>
+            <w:r>
+              <w:rPr>
+                <w:rFonts w:ascii="Times New Roman" w:cs="Times New Roman" w:eastAsia="Times New Roman" w:hAnsi="Times New Roman"/>
+                <w:sz w:val="22"/>
+                <w:szCs w:val="22"/>
+              </w:rPr>
+              <w:t xml:space="preserve">8.8</w:t>
+            </w:r>
+          </w:p>
+        </w:tc>
+        <w:tc>
+          <w:tcPr>
+            <w:tcW w:type="dxa" w:w="6138"/>
+            <w:tcBorders>
+              <w:top w:val="single" w:color="808080" w:sz="4"/>
+              <w:left w:val="single" w:color="808080" w:sz="4"/>
+              <w:bottom w:val="single" w:color="808080" w:sz="4"/>
+              <w:right w:val="single" w:color="808080" w:sz="4"/>
+            </w:tcBorders>
+            <w:tcMar>
+              <w:top w:type="dxa" w:w="60"/>
+              <w:left w:type="dxa" w:w="100"/>
+              <w:bottom w:type="dxa" w:w="60"/>
+              <w:right w:type="dxa" w:w="100"/>
+            </w:tcMar>
+            <w:vAlign w:val="top"/>
+          </w:tcPr>
+          <w:p>
+            <w:pPr>
+              <w:spacing w:after="40" w:before="40"/>
+            </w:pPr>
+            <w:r>
+              <w:rPr>
+                <w:rFonts w:ascii="Times New Roman" w:cs="Times New Roman" w:eastAsia="Times New Roman" w:hAnsi="Times New Roman"/>
+                <w:sz w:val="22"/>
+                <w:szCs w:val="22"/>
+              </w:rPr>
+              <w:t xml:space="preserve">Протоколы заводских испытаний E-102 и E-202 у изготовителя (LIMA) (п. 8 программы FAT)</w:t>
+            </w:r>
+          </w:p>
+        </w:tc>
+        <w:tc>
+          <w:tcPr>
+            <w:tcW w:type="dxa" w:w="1000"/>
+            <w:tcBorders>
+              <w:top w:val="single" w:color="808080" w:sz="4"/>
+              <w:left w:val="single" w:color="808080" w:sz="4"/>
+              <w:bottom w:val="single" w:color="808080" w:sz="4"/>
+              <w:right w:val="single" w:color="808080" w:sz="4"/>
+            </w:tcBorders>
+            <w:tcMar>
+              <w:top w:type="dxa" w:w="60"/>
+              <w:left w:type="dxa" w:w="100"/>
+              <w:bottom w:type="dxa" w:w="60"/>
+              <w:right w:type="dxa" w:w="100"/>
+            </w:tcMar>
+            <w:vAlign w:val="top"/>
+          </w:tcPr>
+          <w:p/>
+        </w:tc>
+        <w:tc>
+          <w:tcPr>
+            <w:tcW w:type="dxa" w:w="1800"/>
             <w:tcBorders>
               <w:top w:val="single" w:color="808080" w:sz="4"/>
               <w:left w:val="single" w:color="808080" w:sz="4"/>
@@ -7760,64 +7795,64 @@
         </w:trPr>
         <w:tc>
           <w:tcPr>
-            <w:tcW w:type="dxa" w:w="1500"/>
-            <w:tcBorders>
-              <w:top w:val="single" w:color="808080" w:sz="4"/>
-              <w:left w:val="single" w:color="808080" w:sz="4"/>
-              <w:bottom w:val="single" w:color="808080" w:sz="4"/>
-              <w:right w:val="single" w:color="808080" w:sz="4"/>
-            </w:tcBorders>
-            <w:tcMar>
-              <w:top w:type="dxa" w:w="60"/>
-              <w:left w:type="dxa" w:w="100"/>
-              <w:bottom w:type="dxa" w:w="60"/>
-              <w:right w:type="dxa" w:w="100"/>
-            </w:tcMar>
-            <w:vAlign w:val="top"/>
-          </w:tcPr>
-          <w:p>
-            <w:pPr>
-              <w:spacing w:after="40" w:before="40"/>
-              <w:jc w:val="center"/>
-            </w:pPr>
-            <w:r>
-              <w:rPr>
-                <w:rFonts w:ascii="Times New Roman" w:cs="Times New Roman" w:eastAsia="Times New Roman" w:hAnsi="Times New Roman"/>
-                <w:sz w:val="22"/>
-                <w:szCs w:val="22"/>
-              </w:rPr>
-              <w:t xml:space="preserve">9</w:t>
-            </w:r>
-          </w:p>
-        </w:tc>
-        <w:tc>
-          <w:tcPr>
-            <w:tcW w:type="dxa" w:w="6038"/>
-            <w:tcBorders>
-              <w:top w:val="single" w:color="808080" w:sz="4"/>
-              <w:left w:val="single" w:color="808080" w:sz="4"/>
-              <w:bottom w:val="single" w:color="808080" w:sz="4"/>
-              <w:right w:val="single" w:color="808080" w:sz="4"/>
-            </w:tcBorders>
-            <w:tcMar>
-              <w:top w:type="dxa" w:w="60"/>
-              <w:left w:type="dxa" w:w="100"/>
-              <w:bottom w:type="dxa" w:w="60"/>
-              <w:right w:type="dxa" w:w="100"/>
-            </w:tcMar>
-            <w:vAlign w:val="top"/>
-          </w:tcPr>
-          <w:p>
-            <w:pPr>
-              <w:spacing w:after="40" w:before="40"/>
-            </w:pPr>
-            <w:r>
-              <w:rPr>
-                <w:rFonts w:ascii="Times New Roman" w:cs="Times New Roman" w:eastAsia="Times New Roman" w:hAnsi="Times New Roman"/>
-                <w:sz w:val="22"/>
-                <w:szCs w:val="22"/>
-              </w:rPr>
-              <w:t xml:space="preserve">Паспорта и сертификаты на комплектующие:</w:t>
+            <w:tcW w:type="dxa" w:w="700"/>
+            <w:tcBorders>
+              <w:top w:val="single" w:color="808080" w:sz="4"/>
+              <w:left w:val="single" w:color="808080" w:sz="4"/>
+              <w:bottom w:val="single" w:color="808080" w:sz="4"/>
+              <w:right w:val="single" w:color="808080" w:sz="4"/>
+            </w:tcBorders>
+            <w:tcMar>
+              <w:top w:type="dxa" w:w="60"/>
+              <w:left w:type="dxa" w:w="100"/>
+              <w:bottom w:type="dxa" w:w="60"/>
+              <w:right w:type="dxa" w:w="100"/>
+            </w:tcMar>
+            <w:vAlign w:val="top"/>
+          </w:tcPr>
+          <w:p>
+            <w:pPr>
+              <w:spacing w:after="40" w:before="40"/>
+              <w:jc w:val="center"/>
+            </w:pPr>
+            <w:r>
+              <w:rPr>
+                <w:rFonts w:ascii="Times New Roman" w:cs="Times New Roman" w:eastAsia="Times New Roman" w:hAnsi="Times New Roman"/>
+                <w:sz w:val="22"/>
+                <w:szCs w:val="22"/>
+              </w:rPr>
+              <w:t xml:space="preserve">8.9</w:t>
+            </w:r>
+          </w:p>
+        </w:tc>
+        <w:tc>
+          <w:tcPr>
+            <w:tcW w:type="dxa" w:w="6138"/>
+            <w:tcBorders>
+              <w:top w:val="single" w:color="808080" w:sz="4"/>
+              <w:left w:val="single" w:color="808080" w:sz="4"/>
+              <w:bottom w:val="single" w:color="808080" w:sz="4"/>
+              <w:right w:val="single" w:color="808080" w:sz="4"/>
+            </w:tcBorders>
+            <w:tcMar>
+              <w:top w:type="dxa" w:w="60"/>
+              <w:left w:type="dxa" w:w="100"/>
+              <w:bottom w:type="dxa" w:w="60"/>
+              <w:right w:type="dxa" w:w="100"/>
+            </w:tcMar>
+            <w:vAlign w:val="top"/>
+          </w:tcPr>
+          <w:p>
+            <w:pPr>
+              <w:spacing w:after="40" w:before="40"/>
+            </w:pPr>
+            <w:r>
+              <w:rPr>
+                <w:rFonts w:ascii="Times New Roman" w:cs="Times New Roman" w:eastAsia="Times New Roman" w:hAnsi="Times New Roman"/>
+                <w:sz w:val="22"/>
+                <w:szCs w:val="22"/>
+              </w:rPr>
+              <w:t xml:space="preserve">Паспорта и сертификаты на комплектующие (п. 9 программы FAT):</w:t>
             </w:r>
           </w:p>
           <w:p>
@@ -7907,7 +7942,26 @@
         </w:tc>
         <w:tc>
           <w:tcPr>
-            <w:tcW w:type="dxa" w:w="2100"/>
+            <w:tcW w:type="dxa" w:w="1000"/>
+            <w:tcBorders>
+              <w:top w:val="single" w:color="808080" w:sz="4"/>
+              <w:left w:val="single" w:color="808080" w:sz="4"/>
+              <w:bottom w:val="single" w:color="808080" w:sz="4"/>
+              <w:right w:val="single" w:color="808080" w:sz="4"/>
+            </w:tcBorders>
+            <w:tcMar>
+              <w:top w:type="dxa" w:w="60"/>
+              <w:left w:type="dxa" w:w="100"/>
+              <w:bottom w:type="dxa" w:w="60"/>
+              <w:right w:type="dxa" w:w="100"/>
+            </w:tcMar>
+            <w:vAlign w:val="top"/>
+          </w:tcPr>
+          <w:p/>
+        </w:tc>
+        <w:tc>
+          <w:tcPr>
+            <w:tcW w:type="dxa" w:w="1800"/>
             <w:tcBorders>
               <w:top w:val="single" w:color="808080" w:sz="4"/>
               <w:left w:val="single" w:color="808080" w:sz="4"/>
@@ -7943,64 +7997,64 @@
         </w:trPr>
         <w:tc>
           <w:tcPr>
-            <w:tcW w:type="dxa" w:w="1500"/>
-            <w:tcBorders>
-              <w:top w:val="single" w:color="808080" w:sz="4"/>
-              <w:left w:val="single" w:color="808080" w:sz="4"/>
-              <w:bottom w:val="single" w:color="808080" w:sz="4"/>
-              <w:right w:val="single" w:color="808080" w:sz="4"/>
-            </w:tcBorders>
-            <w:tcMar>
-              <w:top w:type="dxa" w:w="60"/>
-              <w:left w:type="dxa" w:w="100"/>
-              <w:bottom w:type="dxa" w:w="60"/>
-              <w:right w:type="dxa" w:w="100"/>
-            </w:tcMar>
-            <w:vAlign w:val="top"/>
-          </w:tcPr>
-          <w:p>
-            <w:pPr>
-              <w:spacing w:after="40" w:before="40"/>
-              <w:jc w:val="center"/>
-            </w:pPr>
-            <w:r>
-              <w:rPr>
-                <w:rFonts w:ascii="Times New Roman" w:cs="Times New Roman" w:eastAsia="Times New Roman" w:hAnsi="Times New Roman"/>
-                <w:sz w:val="22"/>
-                <w:szCs w:val="22"/>
-              </w:rPr>
-              <w:t xml:space="preserve">9</w:t>
-            </w:r>
-          </w:p>
-        </w:tc>
-        <w:tc>
-          <w:tcPr>
-            <w:tcW w:type="dxa" w:w="6038"/>
-            <w:tcBorders>
-              <w:top w:val="single" w:color="808080" w:sz="4"/>
-              <w:left w:val="single" w:color="808080" w:sz="4"/>
-              <w:bottom w:val="single" w:color="808080" w:sz="4"/>
-              <w:right w:val="single" w:color="808080" w:sz="4"/>
-            </w:tcBorders>
-            <w:tcMar>
-              <w:top w:type="dxa" w:w="60"/>
-              <w:left w:type="dxa" w:w="100"/>
-              <w:bottom w:type="dxa" w:w="60"/>
-              <w:right w:type="dxa" w:w="100"/>
-            </w:tcMar>
-            <w:vAlign w:val="top"/>
-          </w:tcPr>
-          <w:p>
-            <w:pPr>
-              <w:spacing w:after="40" w:before="40"/>
-            </w:pPr>
-            <w:r>
-              <w:rPr>
-                <w:rFonts w:ascii="Times New Roman" w:cs="Times New Roman" w:eastAsia="Times New Roman" w:hAnsi="Times New Roman"/>
-                <w:sz w:val="22"/>
-                <w:szCs w:val="22"/>
-              </w:rPr>
-              <w:t xml:space="preserve">КИП:</w:t>
+            <w:tcW w:type="dxa" w:w="700"/>
+            <w:tcBorders>
+              <w:top w:val="single" w:color="808080" w:sz="4"/>
+              <w:left w:val="single" w:color="808080" w:sz="4"/>
+              <w:bottom w:val="single" w:color="808080" w:sz="4"/>
+              <w:right w:val="single" w:color="808080" w:sz="4"/>
+            </w:tcBorders>
+            <w:tcMar>
+              <w:top w:type="dxa" w:w="60"/>
+              <w:left w:type="dxa" w:w="100"/>
+              <w:bottom w:type="dxa" w:w="60"/>
+              <w:right w:type="dxa" w:w="100"/>
+            </w:tcMar>
+            <w:vAlign w:val="top"/>
+          </w:tcPr>
+          <w:p>
+            <w:pPr>
+              <w:spacing w:after="40" w:before="40"/>
+              <w:jc w:val="center"/>
+            </w:pPr>
+            <w:r>
+              <w:rPr>
+                <w:rFonts w:ascii="Times New Roman" w:cs="Times New Roman" w:eastAsia="Times New Roman" w:hAnsi="Times New Roman"/>
+                <w:sz w:val="22"/>
+                <w:szCs w:val="22"/>
+              </w:rPr>
+              <w:t xml:space="preserve">8.10</w:t>
+            </w:r>
+          </w:p>
+        </w:tc>
+        <w:tc>
+          <w:tcPr>
+            <w:tcW w:type="dxa" w:w="6138"/>
+            <w:tcBorders>
+              <w:top w:val="single" w:color="808080" w:sz="4"/>
+              <w:left w:val="single" w:color="808080" w:sz="4"/>
+              <w:bottom w:val="single" w:color="808080" w:sz="4"/>
+              <w:right w:val="single" w:color="808080" w:sz="4"/>
+            </w:tcBorders>
+            <w:tcMar>
+              <w:top w:type="dxa" w:w="60"/>
+              <w:left w:type="dxa" w:w="100"/>
+              <w:bottom w:type="dxa" w:w="60"/>
+              <w:right w:type="dxa" w:w="100"/>
+            </w:tcMar>
+            <w:vAlign w:val="top"/>
+          </w:tcPr>
+          <w:p>
+            <w:pPr>
+              <w:spacing w:after="40" w:before="40"/>
+            </w:pPr>
+            <w:r>
+              <w:rPr>
+                <w:rFonts w:ascii="Times New Roman" w:cs="Times New Roman" w:eastAsia="Times New Roman" w:hAnsi="Times New Roman"/>
+                <w:sz w:val="22"/>
+                <w:szCs w:val="22"/>
+              </w:rPr>
+              <w:t xml:space="preserve">КИП (п. 9 программы FAT):</w:t>
             </w:r>
           </w:p>
           <w:p>
@@ -8048,7 +8102,26 @@
         </w:tc>
         <w:tc>
           <w:tcPr>
-            <w:tcW w:type="dxa" w:w="2100"/>
+            <w:tcW w:type="dxa" w:w="1000"/>
+            <w:tcBorders>
+              <w:top w:val="single" w:color="808080" w:sz="4"/>
+              <w:left w:val="single" w:color="808080" w:sz="4"/>
+              <w:bottom w:val="single" w:color="808080" w:sz="4"/>
+              <w:right w:val="single" w:color="808080" w:sz="4"/>
+            </w:tcBorders>
+            <w:tcMar>
+              <w:top w:type="dxa" w:w="60"/>
+              <w:left w:type="dxa" w:w="100"/>
+              <w:bottom w:type="dxa" w:w="60"/>
+              <w:right w:type="dxa" w:w="100"/>
+            </w:tcMar>
+            <w:vAlign w:val="top"/>
+          </w:tcPr>
+          <w:p/>
+        </w:tc>
+        <w:tc>
+          <w:tcPr>
+            <w:tcW w:type="dxa" w:w="1800"/>
             <w:tcBorders>
               <w:top w:val="single" w:color="808080" w:sz="4"/>
               <w:left w:val="single" w:color="808080" w:sz="4"/>
@@ -8084,64 +8157,64 @@
         </w:trPr>
         <w:tc>
           <w:tcPr>
-            <w:tcW w:type="dxa" w:w="1500"/>
-            <w:tcBorders>
-              <w:top w:val="single" w:color="808080" w:sz="4"/>
-              <w:left w:val="single" w:color="808080" w:sz="4"/>
-              <w:bottom w:val="single" w:color="808080" w:sz="4"/>
-              <w:right w:val="single" w:color="808080" w:sz="4"/>
-            </w:tcBorders>
-            <w:tcMar>
-              <w:top w:type="dxa" w:w="60"/>
-              <w:left w:type="dxa" w:w="100"/>
-              <w:bottom w:type="dxa" w:w="60"/>
-              <w:right w:type="dxa" w:w="100"/>
-            </w:tcMar>
-            <w:vAlign w:val="top"/>
-          </w:tcPr>
-          <w:p>
-            <w:pPr>
-              <w:spacing w:after="40" w:before="40"/>
-              <w:jc w:val="center"/>
-            </w:pPr>
-            <w:r>
-              <w:rPr>
-                <w:rFonts w:ascii="Times New Roman" w:cs="Times New Roman" w:eastAsia="Times New Roman" w:hAnsi="Times New Roman"/>
-                <w:sz w:val="22"/>
-                <w:szCs w:val="22"/>
-              </w:rPr>
-              <w:t xml:space="preserve">14</w:t>
-            </w:r>
-          </w:p>
-        </w:tc>
-        <w:tc>
-          <w:tcPr>
-            <w:tcW w:type="dxa" w:w="6038"/>
-            <w:tcBorders>
-              <w:top w:val="single" w:color="808080" w:sz="4"/>
-              <w:left w:val="single" w:color="808080" w:sz="4"/>
-              <w:bottom w:val="single" w:color="808080" w:sz="4"/>
-              <w:right w:val="single" w:color="808080" w:sz="4"/>
-            </w:tcBorders>
-            <w:tcMar>
-              <w:top w:type="dxa" w:w="60"/>
-              <w:left w:type="dxa" w:w="100"/>
-              <w:bottom w:type="dxa" w:w="60"/>
-              <w:right w:type="dxa" w:w="100"/>
-            </w:tcMar>
-            <w:vAlign w:val="top"/>
-          </w:tcPr>
-          <w:p>
-            <w:pPr>
-              <w:spacing w:after="40" w:before="40"/>
-            </w:pPr>
-            <w:r>
-              <w:rPr>
-                <w:rFonts w:ascii="Times New Roman" w:cs="Times New Roman" w:eastAsia="Times New Roman" w:hAnsi="Times New Roman"/>
-                <w:sz w:val="22"/>
-                <w:szCs w:val="22"/>
-              </w:rPr>
-              <w:t xml:space="preserve">Документация на шкаф управления:</w:t>
+            <w:tcW w:type="dxa" w:w="700"/>
+            <w:tcBorders>
+              <w:top w:val="single" w:color="808080" w:sz="4"/>
+              <w:left w:val="single" w:color="808080" w:sz="4"/>
+              <w:bottom w:val="single" w:color="808080" w:sz="4"/>
+              <w:right w:val="single" w:color="808080" w:sz="4"/>
+            </w:tcBorders>
+            <w:tcMar>
+              <w:top w:type="dxa" w:w="60"/>
+              <w:left w:type="dxa" w:w="100"/>
+              <w:bottom w:type="dxa" w:w="60"/>
+              <w:right w:type="dxa" w:w="100"/>
+            </w:tcMar>
+            <w:vAlign w:val="top"/>
+          </w:tcPr>
+          <w:p>
+            <w:pPr>
+              <w:spacing w:after="40" w:before="40"/>
+              <w:jc w:val="center"/>
+            </w:pPr>
+            <w:r>
+              <w:rPr>
+                <w:rFonts w:ascii="Times New Roman" w:cs="Times New Roman" w:eastAsia="Times New Roman" w:hAnsi="Times New Roman"/>
+                <w:sz w:val="22"/>
+                <w:szCs w:val="22"/>
+              </w:rPr>
+              <w:t xml:space="preserve">8.11</w:t>
+            </w:r>
+          </w:p>
+        </w:tc>
+        <w:tc>
+          <w:tcPr>
+            <w:tcW w:type="dxa" w:w="6138"/>
+            <w:tcBorders>
+              <w:top w:val="single" w:color="808080" w:sz="4"/>
+              <w:left w:val="single" w:color="808080" w:sz="4"/>
+              <w:bottom w:val="single" w:color="808080" w:sz="4"/>
+              <w:right w:val="single" w:color="808080" w:sz="4"/>
+            </w:tcBorders>
+            <w:tcMar>
+              <w:top w:type="dxa" w:w="60"/>
+              <w:left w:type="dxa" w:w="100"/>
+              <w:bottom w:type="dxa" w:w="60"/>
+              <w:right w:type="dxa" w:w="100"/>
+            </w:tcMar>
+            <w:vAlign w:val="top"/>
+          </w:tcPr>
+          <w:p>
+            <w:pPr>
+              <w:spacing w:after="40" w:before="40"/>
+            </w:pPr>
+            <w:r>
+              <w:rPr>
+                <w:rFonts w:ascii="Times New Roman" w:cs="Times New Roman" w:eastAsia="Times New Roman" w:hAnsi="Times New Roman"/>
+                <w:sz w:val="22"/>
+                <w:szCs w:val="22"/>
+              </w:rPr>
+              <w:t xml:space="preserve">Документация на шкаф управления (п. 14 программы FAT):</w:t>
             </w:r>
           </w:p>
           <w:p>
@@ -8231,7 +8304,26 @@
         </w:tc>
         <w:tc>
           <w:tcPr>
-            <w:tcW w:type="dxa" w:w="2100"/>
+            <w:tcW w:type="dxa" w:w="1000"/>
+            <w:tcBorders>
+              <w:top w:val="single" w:color="808080" w:sz="4"/>
+              <w:left w:val="single" w:color="808080" w:sz="4"/>
+              <w:bottom w:val="single" w:color="808080" w:sz="4"/>
+              <w:right w:val="single" w:color="808080" w:sz="4"/>
+            </w:tcBorders>
+            <w:tcMar>
+              <w:top w:type="dxa" w:w="60"/>
+              <w:left w:type="dxa" w:w="100"/>
+              <w:bottom w:type="dxa" w:w="60"/>
+              <w:right w:type="dxa" w:w="100"/>
+            </w:tcMar>
+            <w:vAlign w:val="top"/>
+          </w:tcPr>
+          <w:p/>
+        </w:tc>
+        <w:tc>
+          <w:tcPr>
+            <w:tcW w:type="dxa" w:w="1800"/>
             <w:tcBorders>
               <w:top w:val="single" w:color="808080" w:sz="4"/>
               <w:left w:val="single" w:color="808080" w:sz="4"/>
@@ -8267,70 +8359,89 @@
         </w:trPr>
         <w:tc>
           <w:tcPr>
-            <w:tcW w:type="dxa" w:w="1500"/>
-            <w:tcBorders>
-              <w:top w:val="single" w:color="808080" w:sz="4"/>
-              <w:left w:val="single" w:color="808080" w:sz="4"/>
-              <w:bottom w:val="single" w:color="808080" w:sz="4"/>
-              <w:right w:val="single" w:color="808080" w:sz="4"/>
-            </w:tcBorders>
-            <w:tcMar>
-              <w:top w:type="dxa" w:w="60"/>
-              <w:left w:type="dxa" w:w="100"/>
-              <w:bottom w:type="dxa" w:w="60"/>
-              <w:right w:type="dxa" w:w="100"/>
-            </w:tcMar>
-            <w:vAlign w:val="top"/>
-          </w:tcPr>
-          <w:p>
-            <w:pPr>
-              <w:spacing w:after="40" w:before="40"/>
-              <w:jc w:val="center"/>
-            </w:pPr>
-            <w:r>
-              <w:rPr>
-                <w:rFonts w:ascii="Times New Roman" w:cs="Times New Roman" w:eastAsia="Times New Roman" w:hAnsi="Times New Roman"/>
-                <w:sz w:val="22"/>
-                <w:szCs w:val="22"/>
-              </w:rPr>
-              <w:t xml:space="preserve">15</w:t>
-            </w:r>
-          </w:p>
-        </w:tc>
-        <w:tc>
-          <w:tcPr>
-            <w:tcW w:type="dxa" w:w="6038"/>
-            <w:tcBorders>
-              <w:top w:val="single" w:color="808080" w:sz="4"/>
-              <w:left w:val="single" w:color="808080" w:sz="4"/>
-              <w:bottom w:val="single" w:color="808080" w:sz="4"/>
-              <w:right w:val="single" w:color="808080" w:sz="4"/>
-            </w:tcBorders>
-            <w:tcMar>
-              <w:top w:type="dxa" w:w="60"/>
-              <w:left w:type="dxa" w:w="100"/>
-              <w:bottom w:type="dxa" w:w="60"/>
-              <w:right w:type="dxa" w:w="100"/>
-            </w:tcMar>
-            <w:vAlign w:val="top"/>
-          </w:tcPr>
-          <w:p>
-            <w:pPr>
-              <w:spacing w:after="40" w:before="40"/>
-            </w:pPr>
-            <w:r>
-              <w:rPr>
-                <w:rFonts w:ascii="Times New Roman" w:cs="Times New Roman" w:eastAsia="Times New Roman" w:hAnsi="Times New Roman"/>
-                <w:sz w:val="22"/>
-                <w:szCs w:val="22"/>
-              </w:rPr>
-              <w:t xml:space="preserve">Программное обеспечение ПЛК и панели оператора (резервная копия)</w:t>
-            </w:r>
-          </w:p>
-        </w:tc>
-        <w:tc>
-          <w:tcPr>
-            <w:tcW w:type="dxa" w:w="2100"/>
+            <w:tcW w:type="dxa" w:w="700"/>
+            <w:tcBorders>
+              <w:top w:val="single" w:color="808080" w:sz="4"/>
+              <w:left w:val="single" w:color="808080" w:sz="4"/>
+              <w:bottom w:val="single" w:color="808080" w:sz="4"/>
+              <w:right w:val="single" w:color="808080" w:sz="4"/>
+            </w:tcBorders>
+            <w:tcMar>
+              <w:top w:type="dxa" w:w="60"/>
+              <w:left w:type="dxa" w:w="100"/>
+              <w:bottom w:type="dxa" w:w="60"/>
+              <w:right w:type="dxa" w:w="100"/>
+            </w:tcMar>
+            <w:vAlign w:val="top"/>
+          </w:tcPr>
+          <w:p>
+            <w:pPr>
+              <w:spacing w:after="40" w:before="40"/>
+              <w:jc w:val="center"/>
+            </w:pPr>
+            <w:r>
+              <w:rPr>
+                <w:rFonts w:ascii="Times New Roman" w:cs="Times New Roman" w:eastAsia="Times New Roman" w:hAnsi="Times New Roman"/>
+                <w:sz w:val="22"/>
+                <w:szCs w:val="22"/>
+              </w:rPr>
+              <w:t xml:space="preserve">8.12</w:t>
+            </w:r>
+          </w:p>
+        </w:tc>
+        <w:tc>
+          <w:tcPr>
+            <w:tcW w:type="dxa" w:w="6138"/>
+            <w:tcBorders>
+              <w:top w:val="single" w:color="808080" w:sz="4"/>
+              <w:left w:val="single" w:color="808080" w:sz="4"/>
+              <w:bottom w:val="single" w:color="808080" w:sz="4"/>
+              <w:right w:val="single" w:color="808080" w:sz="4"/>
+            </w:tcBorders>
+            <w:tcMar>
+              <w:top w:type="dxa" w:w="60"/>
+              <w:left w:type="dxa" w:w="100"/>
+              <w:bottom w:type="dxa" w:w="60"/>
+              <w:right w:type="dxa" w:w="100"/>
+            </w:tcMar>
+            <w:vAlign w:val="top"/>
+          </w:tcPr>
+          <w:p>
+            <w:pPr>
+              <w:spacing w:after="40" w:before="40"/>
+            </w:pPr>
+            <w:r>
+              <w:rPr>
+                <w:rFonts w:ascii="Times New Roman" w:cs="Times New Roman" w:eastAsia="Times New Roman" w:hAnsi="Times New Roman"/>
+                <w:sz w:val="22"/>
+                <w:szCs w:val="22"/>
+              </w:rPr>
+              <w:t xml:space="preserve">Программное обеспечение ПЛК и панели оператора (резервная копия) (п. 15 программы FAT)</w:t>
+            </w:r>
+          </w:p>
+        </w:tc>
+        <w:tc>
+          <w:tcPr>
+            <w:tcW w:type="dxa" w:w="1000"/>
+            <w:tcBorders>
+              <w:top w:val="single" w:color="808080" w:sz="4"/>
+              <w:left w:val="single" w:color="808080" w:sz="4"/>
+              <w:bottom w:val="single" w:color="808080" w:sz="4"/>
+              <w:right w:val="single" w:color="808080" w:sz="4"/>
+            </w:tcBorders>
+            <w:tcMar>
+              <w:top w:type="dxa" w:w="60"/>
+              <w:left w:type="dxa" w:w="100"/>
+              <w:bottom w:type="dxa" w:w="60"/>
+              <w:right w:type="dxa" w:w="100"/>
+            </w:tcMar>
+            <w:vAlign w:val="top"/>
+          </w:tcPr>
+          <w:p/>
+        </w:tc>
+        <w:tc>
+          <w:tcPr>
+            <w:tcW w:type="dxa" w:w="1800"/>
             <w:tcBorders>
               <w:top w:val="single" w:color="808080" w:sz="4"/>
               <w:left w:val="single" w:color="808080" w:sz="4"/>
@@ -8366,70 +8477,89 @@
         </w:trPr>
         <w:tc>
           <w:tcPr>
-            <w:tcW w:type="dxa" w:w="1500"/>
-            <w:tcBorders>
-              <w:top w:val="single" w:color="808080" w:sz="4"/>
-              <w:left w:val="single" w:color="808080" w:sz="4"/>
-              <w:bottom w:val="single" w:color="808080" w:sz="4"/>
-              <w:right w:val="single" w:color="808080" w:sz="4"/>
-            </w:tcBorders>
-            <w:tcMar>
-              <w:top w:type="dxa" w:w="60"/>
-              <w:left w:type="dxa" w:w="100"/>
-              <w:bottom w:type="dxa" w:w="60"/>
-              <w:right w:type="dxa" w:w="100"/>
-            </w:tcMar>
-            <w:vAlign w:val="top"/>
-          </w:tcPr>
-          <w:p>
-            <w:pPr>
-              <w:spacing w:after="40" w:before="40"/>
-              <w:jc w:val="center"/>
-            </w:pPr>
-            <w:r>
-              <w:rPr>
-                <w:rFonts w:ascii="Times New Roman" w:cs="Times New Roman" w:eastAsia="Times New Roman" w:hAnsi="Times New Roman"/>
-                <w:sz w:val="22"/>
-                <w:szCs w:val="22"/>
-              </w:rPr>
-              <w:t xml:space="preserve">16</w:t>
-            </w:r>
-          </w:p>
-        </w:tc>
-        <w:tc>
-          <w:tcPr>
-            <w:tcW w:type="dxa" w:w="6038"/>
-            <w:tcBorders>
-              <w:top w:val="single" w:color="808080" w:sz="4"/>
-              <w:left w:val="single" w:color="808080" w:sz="4"/>
-              <w:bottom w:val="single" w:color="808080" w:sz="4"/>
-              <w:right w:val="single" w:color="808080" w:sz="4"/>
-            </w:tcBorders>
-            <w:tcMar>
-              <w:top w:type="dxa" w:w="60"/>
-              <w:left w:type="dxa" w:w="100"/>
-              <w:bottom w:type="dxa" w:w="60"/>
-              <w:right w:type="dxa" w:w="100"/>
-            </w:tcMar>
-            <w:vAlign w:val="top"/>
-          </w:tcPr>
-          <w:p>
-            <w:pPr>
-              <w:spacing w:after="40" w:before="40"/>
-            </w:pPr>
-            <w:r>
-              <w:rPr>
-                <w:rFonts w:ascii="Times New Roman" w:cs="Times New Roman" w:eastAsia="Times New Roman" w:hAnsi="Times New Roman"/>
-                <w:sz w:val="22"/>
-                <w:szCs w:val="22"/>
-              </w:rPr>
-              <w:t xml:space="preserve">Руководства IOM на установку в целом, испарители E-102/E-202, шестерённые насосы, чиллеры, шкаф управления (предъявлены только на вакуумные насосы)</w:t>
-            </w:r>
-          </w:p>
-        </w:tc>
-        <w:tc>
-          <w:tcPr>
-            <w:tcW w:type="dxa" w:w="2100"/>
+            <w:tcW w:type="dxa" w:w="700"/>
+            <w:tcBorders>
+              <w:top w:val="single" w:color="808080" w:sz="4"/>
+              <w:left w:val="single" w:color="808080" w:sz="4"/>
+              <w:bottom w:val="single" w:color="808080" w:sz="4"/>
+              <w:right w:val="single" w:color="808080" w:sz="4"/>
+            </w:tcBorders>
+            <w:tcMar>
+              <w:top w:type="dxa" w:w="60"/>
+              <w:left w:type="dxa" w:w="100"/>
+              <w:bottom w:type="dxa" w:w="60"/>
+              <w:right w:type="dxa" w:w="100"/>
+            </w:tcMar>
+            <w:vAlign w:val="top"/>
+          </w:tcPr>
+          <w:p>
+            <w:pPr>
+              <w:spacing w:after="40" w:before="40"/>
+              <w:jc w:val="center"/>
+            </w:pPr>
+            <w:r>
+              <w:rPr>
+                <w:rFonts w:ascii="Times New Roman" w:cs="Times New Roman" w:eastAsia="Times New Roman" w:hAnsi="Times New Roman"/>
+                <w:sz w:val="22"/>
+                <w:szCs w:val="22"/>
+              </w:rPr>
+              <w:t xml:space="preserve">8.13</w:t>
+            </w:r>
+          </w:p>
+        </w:tc>
+        <w:tc>
+          <w:tcPr>
+            <w:tcW w:type="dxa" w:w="6138"/>
+            <w:tcBorders>
+              <w:top w:val="single" w:color="808080" w:sz="4"/>
+              <w:left w:val="single" w:color="808080" w:sz="4"/>
+              <w:bottom w:val="single" w:color="808080" w:sz="4"/>
+              <w:right w:val="single" w:color="808080" w:sz="4"/>
+            </w:tcBorders>
+            <w:tcMar>
+              <w:top w:type="dxa" w:w="60"/>
+              <w:left w:type="dxa" w:w="100"/>
+              <w:bottom w:type="dxa" w:w="60"/>
+              <w:right w:type="dxa" w:w="100"/>
+            </w:tcMar>
+            <w:vAlign w:val="top"/>
+          </w:tcPr>
+          <w:p>
+            <w:pPr>
+              <w:spacing w:after="40" w:before="40"/>
+            </w:pPr>
+            <w:r>
+              <w:rPr>
+                <w:rFonts w:ascii="Times New Roman" w:cs="Times New Roman" w:eastAsia="Times New Roman" w:hAnsi="Times New Roman"/>
+                <w:sz w:val="22"/>
+                <w:szCs w:val="22"/>
+              </w:rPr>
+              <w:t xml:space="preserve">Руководства IOM на установку в целом, испарители E-102/E-202, шестерённые насосы, чиллеры, шкаф управления (предъявлены только на вакуумные насосы) (п. 16 программы FAT)</w:t>
+            </w:r>
+          </w:p>
+        </w:tc>
+        <w:tc>
+          <w:tcPr>
+            <w:tcW w:type="dxa" w:w="1000"/>
+            <w:tcBorders>
+              <w:top w:val="single" w:color="808080" w:sz="4"/>
+              <w:left w:val="single" w:color="808080" w:sz="4"/>
+              <w:bottom w:val="single" w:color="808080" w:sz="4"/>
+              <w:right w:val="single" w:color="808080" w:sz="4"/>
+            </w:tcBorders>
+            <w:tcMar>
+              <w:top w:type="dxa" w:w="60"/>
+              <w:left w:type="dxa" w:w="100"/>
+              <w:bottom w:type="dxa" w:w="60"/>
+              <w:right w:type="dxa" w:w="100"/>
+            </w:tcMar>
+            <w:vAlign w:val="top"/>
+          </w:tcPr>
+          <w:p/>
+        </w:tc>
+        <w:tc>
+          <w:tcPr>
+            <w:tcW w:type="dxa" w:w="1800"/>
             <w:tcBorders>
               <w:top w:val="single" w:color="808080" w:sz="4"/>
               <w:left w:val="single" w:color="808080" w:sz="4"/>
@@ -8465,70 +8595,89 @@
         </w:trPr>
         <w:tc>
           <w:tcPr>
-            <w:tcW w:type="dxa" w:w="1500"/>
-            <w:tcBorders>
-              <w:top w:val="single" w:color="808080" w:sz="4"/>
-              <w:left w:val="single" w:color="808080" w:sz="4"/>
-              <w:bottom w:val="single" w:color="808080" w:sz="4"/>
-              <w:right w:val="single" w:color="808080" w:sz="4"/>
-            </w:tcBorders>
-            <w:tcMar>
-              <w:top w:type="dxa" w:w="60"/>
-              <w:left w:type="dxa" w:w="100"/>
-              <w:bottom w:type="dxa" w:w="60"/>
-              <w:right w:type="dxa" w:w="100"/>
-            </w:tcMar>
-            <w:vAlign w:val="top"/>
-          </w:tcPr>
-          <w:p>
-            <w:pPr>
-              <w:spacing w:after="40" w:before="40"/>
-              <w:jc w:val="center"/>
-            </w:pPr>
-            <w:r>
-              <w:rPr>
-                <w:rFonts w:ascii="Times New Roman" w:cs="Times New Roman" w:eastAsia="Times New Roman" w:hAnsi="Times New Roman"/>
-                <w:sz w:val="22"/>
-                <w:szCs w:val="22"/>
-              </w:rPr>
-              <w:t xml:space="preserve">17</w:t>
-            </w:r>
-          </w:p>
-        </w:tc>
-        <w:tc>
-          <w:tcPr>
-            <w:tcW w:type="dxa" w:w="6038"/>
-            <w:tcBorders>
-              <w:top w:val="single" w:color="808080" w:sz="4"/>
-              <w:left w:val="single" w:color="808080" w:sz="4"/>
-              <w:bottom w:val="single" w:color="808080" w:sz="4"/>
-              <w:right w:val="single" w:color="808080" w:sz="4"/>
-            </w:tcBorders>
-            <w:tcMar>
-              <w:top w:type="dxa" w:w="60"/>
-              <w:left w:type="dxa" w:w="100"/>
-              <w:bottom w:type="dxa" w:w="60"/>
-              <w:right w:type="dxa" w:w="100"/>
-            </w:tcMar>
-            <w:vAlign w:val="top"/>
-          </w:tcPr>
-          <w:p>
-            <w:pPr>
-              <w:spacing w:after="40" w:before="40"/>
-            </w:pPr>
-            <w:r>
-              <w:rPr>
-                <w:rFonts w:ascii="Times New Roman" w:cs="Times New Roman" w:eastAsia="Times New Roman" w:hAnsi="Times New Roman"/>
-                <w:sz w:val="22"/>
-                <w:szCs w:val="22"/>
-              </w:rPr>
-              <w:t xml:space="preserve">Высота крюка и масса ротора с приводом для выемки роторов E-102 и E-202</w:t>
-            </w:r>
-          </w:p>
-        </w:tc>
-        <w:tc>
-          <w:tcPr>
-            <w:tcW w:type="dxa" w:w="2100"/>
+            <w:tcW w:type="dxa" w:w="700"/>
+            <w:tcBorders>
+              <w:top w:val="single" w:color="808080" w:sz="4"/>
+              <w:left w:val="single" w:color="808080" w:sz="4"/>
+              <w:bottom w:val="single" w:color="808080" w:sz="4"/>
+              <w:right w:val="single" w:color="808080" w:sz="4"/>
+            </w:tcBorders>
+            <w:tcMar>
+              <w:top w:type="dxa" w:w="60"/>
+              <w:left w:type="dxa" w:w="100"/>
+              <w:bottom w:type="dxa" w:w="60"/>
+              <w:right w:type="dxa" w:w="100"/>
+            </w:tcMar>
+            <w:vAlign w:val="top"/>
+          </w:tcPr>
+          <w:p>
+            <w:pPr>
+              <w:spacing w:after="40" w:before="40"/>
+              <w:jc w:val="center"/>
+            </w:pPr>
+            <w:r>
+              <w:rPr>
+                <w:rFonts w:ascii="Times New Roman" w:cs="Times New Roman" w:eastAsia="Times New Roman" w:hAnsi="Times New Roman"/>
+                <w:sz w:val="22"/>
+                <w:szCs w:val="22"/>
+              </w:rPr>
+              <w:t xml:space="preserve">8.14</w:t>
+            </w:r>
+          </w:p>
+        </w:tc>
+        <w:tc>
+          <w:tcPr>
+            <w:tcW w:type="dxa" w:w="6138"/>
+            <w:tcBorders>
+              <w:top w:val="single" w:color="808080" w:sz="4"/>
+              <w:left w:val="single" w:color="808080" w:sz="4"/>
+              <w:bottom w:val="single" w:color="808080" w:sz="4"/>
+              <w:right w:val="single" w:color="808080" w:sz="4"/>
+            </w:tcBorders>
+            <w:tcMar>
+              <w:top w:type="dxa" w:w="60"/>
+              <w:left w:type="dxa" w:w="100"/>
+              <w:bottom w:type="dxa" w:w="60"/>
+              <w:right w:type="dxa" w:w="100"/>
+            </w:tcMar>
+            <w:vAlign w:val="top"/>
+          </w:tcPr>
+          <w:p>
+            <w:pPr>
+              <w:spacing w:after="40" w:before="40"/>
+            </w:pPr>
+            <w:r>
+              <w:rPr>
+                <w:rFonts w:ascii="Times New Roman" w:cs="Times New Roman" w:eastAsia="Times New Roman" w:hAnsi="Times New Roman"/>
+                <w:sz w:val="22"/>
+                <w:szCs w:val="22"/>
+              </w:rPr>
+              <w:t xml:space="preserve">Высота крюка и масса ротора с приводом для выемки роторов E-102 и E-202 (п. 17 программы FAT)</w:t>
+            </w:r>
+          </w:p>
+        </w:tc>
+        <w:tc>
+          <w:tcPr>
+            <w:tcW w:type="dxa" w:w="1000"/>
+            <w:tcBorders>
+              <w:top w:val="single" w:color="808080" w:sz="4"/>
+              <w:left w:val="single" w:color="808080" w:sz="4"/>
+              <w:bottom w:val="single" w:color="808080" w:sz="4"/>
+              <w:right w:val="single" w:color="808080" w:sz="4"/>
+            </w:tcBorders>
+            <w:tcMar>
+              <w:top w:type="dxa" w:w="60"/>
+              <w:left w:type="dxa" w:w="100"/>
+              <w:bottom w:type="dxa" w:w="60"/>
+              <w:right w:type="dxa" w:w="100"/>
+            </w:tcMar>
+            <w:vAlign w:val="top"/>
+          </w:tcPr>
+          <w:p/>
+        </w:tc>
+        <w:tc>
+          <w:tcPr>
+            <w:tcW w:type="dxa" w:w="1800"/>
             <w:tcBorders>
               <w:top w:val="single" w:color="808080" w:sz="4"/>
               <w:left w:val="single" w:color="808080" w:sz="4"/>
@@ -8564,70 +8713,89 @@
         </w:trPr>
         <w:tc>
           <w:tcPr>
-            <w:tcW w:type="dxa" w:w="1500"/>
-            <w:tcBorders>
-              <w:top w:val="single" w:color="808080" w:sz="4"/>
-              <w:left w:val="single" w:color="808080" w:sz="4"/>
-              <w:bottom w:val="single" w:color="808080" w:sz="4"/>
-              <w:right w:val="single" w:color="808080" w:sz="4"/>
-            </w:tcBorders>
-            <w:tcMar>
-              <w:top w:type="dxa" w:w="60"/>
-              <w:left w:type="dxa" w:w="100"/>
-              <w:bottom w:type="dxa" w:w="60"/>
-              <w:right w:type="dxa" w:w="100"/>
-            </w:tcMar>
-            <w:vAlign w:val="top"/>
-          </w:tcPr>
-          <w:p>
-            <w:pPr>
-              <w:spacing w:after="40" w:before="40"/>
-              <w:jc w:val="center"/>
-            </w:pPr>
-            <w:r>
-              <w:rPr>
-                <w:rFonts w:ascii="Times New Roman" w:cs="Times New Roman" w:eastAsia="Times New Roman" w:hAnsi="Times New Roman"/>
-                <w:sz w:val="22"/>
-                <w:szCs w:val="22"/>
-              </w:rPr>
-              <w:t xml:space="preserve">18</w:t>
-            </w:r>
-          </w:p>
-        </w:tc>
-        <w:tc>
-          <w:tcPr>
-            <w:tcW w:type="dxa" w:w="6038"/>
-            <w:tcBorders>
-              <w:top w:val="single" w:color="808080" w:sz="4"/>
-              <w:left w:val="single" w:color="808080" w:sz="4"/>
-              <w:bottom w:val="single" w:color="808080" w:sz="4"/>
-              <w:right w:val="single" w:color="808080" w:sz="4"/>
-            </w:tcBorders>
-            <w:tcMar>
-              <w:top w:type="dxa" w:w="60"/>
-              <w:left w:type="dxa" w:w="100"/>
-              <w:bottom w:type="dxa" w:w="60"/>
-              <w:right w:type="dxa" w:w="100"/>
-            </w:tcMar>
-            <w:vAlign w:val="top"/>
-          </w:tcPr>
-          <w:p>
-            <w:pPr>
-              <w:spacing w:after="40" w:before="40"/>
-            </w:pPr>
-            <w:r>
-              <w:rPr>
-                <w:rFonts w:ascii="Times New Roman" w:cs="Times New Roman" w:eastAsia="Times New Roman" w:hAnsi="Times New Roman"/>
-                <w:sz w:val="22"/>
-                <w:szCs w:val="22"/>
-              </w:rPr>
-              <w:t xml:space="preserve">Схема разделения на транспортные места с габаритами и массами</w:t>
-            </w:r>
-          </w:p>
-        </w:tc>
-        <w:tc>
-          <w:tcPr>
-            <w:tcW w:type="dxa" w:w="2100"/>
+            <w:tcW w:type="dxa" w:w="700"/>
+            <w:tcBorders>
+              <w:top w:val="single" w:color="808080" w:sz="4"/>
+              <w:left w:val="single" w:color="808080" w:sz="4"/>
+              <w:bottom w:val="single" w:color="808080" w:sz="4"/>
+              <w:right w:val="single" w:color="808080" w:sz="4"/>
+            </w:tcBorders>
+            <w:tcMar>
+              <w:top w:type="dxa" w:w="60"/>
+              <w:left w:type="dxa" w:w="100"/>
+              <w:bottom w:type="dxa" w:w="60"/>
+              <w:right w:type="dxa" w:w="100"/>
+            </w:tcMar>
+            <w:vAlign w:val="top"/>
+          </w:tcPr>
+          <w:p>
+            <w:pPr>
+              <w:spacing w:after="40" w:before="40"/>
+              <w:jc w:val="center"/>
+            </w:pPr>
+            <w:r>
+              <w:rPr>
+                <w:rFonts w:ascii="Times New Roman" w:cs="Times New Roman" w:eastAsia="Times New Roman" w:hAnsi="Times New Roman"/>
+                <w:sz w:val="22"/>
+                <w:szCs w:val="22"/>
+              </w:rPr>
+              <w:t xml:space="preserve">8.15</w:t>
+            </w:r>
+          </w:p>
+        </w:tc>
+        <w:tc>
+          <w:tcPr>
+            <w:tcW w:type="dxa" w:w="6138"/>
+            <w:tcBorders>
+              <w:top w:val="single" w:color="808080" w:sz="4"/>
+              <w:left w:val="single" w:color="808080" w:sz="4"/>
+              <w:bottom w:val="single" w:color="808080" w:sz="4"/>
+              <w:right w:val="single" w:color="808080" w:sz="4"/>
+            </w:tcBorders>
+            <w:tcMar>
+              <w:top w:type="dxa" w:w="60"/>
+              <w:left w:type="dxa" w:w="100"/>
+              <w:bottom w:type="dxa" w:w="60"/>
+              <w:right w:type="dxa" w:w="100"/>
+            </w:tcMar>
+            <w:vAlign w:val="top"/>
+          </w:tcPr>
+          <w:p>
+            <w:pPr>
+              <w:spacing w:after="40" w:before="40"/>
+            </w:pPr>
+            <w:r>
+              <w:rPr>
+                <w:rFonts w:ascii="Times New Roman" w:cs="Times New Roman" w:eastAsia="Times New Roman" w:hAnsi="Times New Roman"/>
+                <w:sz w:val="22"/>
+                <w:szCs w:val="22"/>
+              </w:rPr>
+              <w:t xml:space="preserve">Схема разделения на транспортные места с габаритами и массами (п. 18 программы FAT)</w:t>
+            </w:r>
+          </w:p>
+        </w:tc>
+        <w:tc>
+          <w:tcPr>
+            <w:tcW w:type="dxa" w:w="1000"/>
+            <w:tcBorders>
+              <w:top w:val="single" w:color="808080" w:sz="4"/>
+              <w:left w:val="single" w:color="808080" w:sz="4"/>
+              <w:bottom w:val="single" w:color="808080" w:sz="4"/>
+              <w:right w:val="single" w:color="808080" w:sz="4"/>
+            </w:tcBorders>
+            <w:tcMar>
+              <w:top w:type="dxa" w:w="60"/>
+              <w:left w:type="dxa" w:w="100"/>
+              <w:bottom w:type="dxa" w:w="60"/>
+              <w:right w:type="dxa" w:w="100"/>
+            </w:tcMar>
+            <w:vAlign w:val="top"/>
+          </w:tcPr>
+          <w:p/>
+        </w:tc>
+        <w:tc>
+          <w:tcPr>
+            <w:tcW w:type="dxa" w:w="1800"/>
             <w:tcBorders>
               <w:top w:val="single" w:color="808080" w:sz="4"/>
               <w:left w:val="single" w:color="808080" w:sz="4"/>
@@ -8663,70 +8831,89 @@
         </w:trPr>
         <w:tc>
           <w:tcPr>
-            <w:tcW w:type="dxa" w:w="1500"/>
-            <w:tcBorders>
-              <w:top w:val="single" w:color="808080" w:sz="4"/>
-              <w:left w:val="single" w:color="808080" w:sz="4"/>
-              <w:bottom w:val="single" w:color="808080" w:sz="4"/>
-              <w:right w:val="single" w:color="808080" w:sz="4"/>
-            </w:tcBorders>
-            <w:tcMar>
-              <w:top w:type="dxa" w:w="60"/>
-              <w:left w:type="dxa" w:w="100"/>
-              <w:bottom w:type="dxa" w:w="60"/>
-              <w:right w:type="dxa" w:w="100"/>
-            </w:tcMar>
-            <w:vAlign w:val="top"/>
-          </w:tcPr>
-          <w:p>
-            <w:pPr>
-              <w:spacing w:after="40" w:before="40"/>
-              <w:jc w:val="center"/>
-            </w:pPr>
-            <w:r>
-              <w:rPr>
-                <w:rFonts w:ascii="Times New Roman" w:cs="Times New Roman" w:eastAsia="Times New Roman" w:hAnsi="Times New Roman"/>
-                <w:sz w:val="22"/>
-                <w:szCs w:val="22"/>
-              </w:rPr>
-              <w:t xml:space="preserve">Разд. 9, п. 5</w:t>
-            </w:r>
-          </w:p>
-        </w:tc>
-        <w:tc>
-          <w:tcPr>
-            <w:tcW w:type="dxa" w:w="6038"/>
-            <w:tcBorders>
-              <w:top w:val="single" w:color="808080" w:sz="4"/>
-              <w:left w:val="single" w:color="808080" w:sz="4"/>
-              <w:bottom w:val="single" w:color="808080" w:sz="4"/>
-              <w:right w:val="single" w:color="808080" w:sz="4"/>
-            </w:tcBorders>
-            <w:tcMar>
-              <w:top w:type="dxa" w:w="60"/>
-              <w:left w:type="dxa" w:w="100"/>
-              <w:bottom w:type="dxa" w:w="60"/>
-              <w:right w:type="dxa" w:w="100"/>
-            </w:tcMar>
-            <w:vAlign w:val="top"/>
-          </w:tcPr>
-          <w:p>
-            <w:pPr>
-              <w:spacing w:after="40" w:before="40"/>
-            </w:pPr>
-            <w:r>
-              <w:rPr>
-                <w:rFonts w:ascii="Times New Roman" w:cs="Times New Roman" w:eastAsia="Times New Roman" w:hAnsi="Times New Roman"/>
-                <w:sz w:val="22"/>
-                <w:szCs w:val="22"/>
-              </w:rPr>
-              <w:t xml:space="preserve">Протоколы балансировки роторов E-102 и E-202 (G 6.3)</w:t>
-            </w:r>
-          </w:p>
-        </w:tc>
-        <w:tc>
-          <w:tcPr>
-            <w:tcW w:type="dxa" w:w="2100"/>
+            <w:tcW w:type="dxa" w:w="700"/>
+            <w:tcBorders>
+              <w:top w:val="single" w:color="808080" w:sz="4"/>
+              <w:left w:val="single" w:color="808080" w:sz="4"/>
+              <w:bottom w:val="single" w:color="808080" w:sz="4"/>
+              <w:right w:val="single" w:color="808080" w:sz="4"/>
+            </w:tcBorders>
+            <w:tcMar>
+              <w:top w:type="dxa" w:w="60"/>
+              <w:left w:type="dxa" w:w="100"/>
+              <w:bottom w:type="dxa" w:w="60"/>
+              <w:right w:type="dxa" w:w="100"/>
+            </w:tcMar>
+            <w:vAlign w:val="top"/>
+          </w:tcPr>
+          <w:p>
+            <w:pPr>
+              <w:spacing w:after="40" w:before="40"/>
+              <w:jc w:val="center"/>
+            </w:pPr>
+            <w:r>
+              <w:rPr>
+                <w:rFonts w:ascii="Times New Roman" w:cs="Times New Roman" w:eastAsia="Times New Roman" w:hAnsi="Times New Roman"/>
+                <w:sz w:val="22"/>
+                <w:szCs w:val="22"/>
+              </w:rPr>
+              <w:t xml:space="preserve">8.16</w:t>
+            </w:r>
+          </w:p>
+        </w:tc>
+        <w:tc>
+          <w:tcPr>
+            <w:tcW w:type="dxa" w:w="6138"/>
+            <w:tcBorders>
+              <w:top w:val="single" w:color="808080" w:sz="4"/>
+              <w:left w:val="single" w:color="808080" w:sz="4"/>
+              <w:bottom w:val="single" w:color="808080" w:sz="4"/>
+              <w:right w:val="single" w:color="808080" w:sz="4"/>
+            </w:tcBorders>
+            <w:tcMar>
+              <w:top w:type="dxa" w:w="60"/>
+              <w:left w:type="dxa" w:w="100"/>
+              <w:bottom w:type="dxa" w:w="60"/>
+              <w:right w:type="dxa" w:w="100"/>
+            </w:tcMar>
+            <w:vAlign w:val="top"/>
+          </w:tcPr>
+          <w:p>
+            <w:pPr>
+              <w:spacing w:after="40" w:before="40"/>
+            </w:pPr>
+            <w:r>
+              <w:rPr>
+                <w:rFonts w:ascii="Times New Roman" w:cs="Times New Roman" w:eastAsia="Times New Roman" w:hAnsi="Times New Roman"/>
+                <w:sz w:val="22"/>
+                <w:szCs w:val="22"/>
+              </w:rPr>
+              <w:t xml:space="preserve">Протоколы балансировки роторов E-102 и E-202 (G 6.3) (разд. 9, п. 5 программы FAT)</w:t>
+            </w:r>
+          </w:p>
+        </w:tc>
+        <w:tc>
+          <w:tcPr>
+            <w:tcW w:type="dxa" w:w="1000"/>
+            <w:tcBorders>
+              <w:top w:val="single" w:color="808080" w:sz="4"/>
+              <w:left w:val="single" w:color="808080" w:sz="4"/>
+              <w:bottom w:val="single" w:color="808080" w:sz="4"/>
+              <w:right w:val="single" w:color="808080" w:sz="4"/>
+            </w:tcBorders>
+            <w:tcMar>
+              <w:top w:type="dxa" w:w="60"/>
+              <w:left w:type="dxa" w:w="100"/>
+              <w:bottom w:type="dxa" w:w="60"/>
+              <w:right w:type="dxa" w:w="100"/>
+            </w:tcMar>
+            <w:vAlign w:val="top"/>
+          </w:tcPr>
+          <w:p/>
+        </w:tc>
+        <w:tc>
+          <w:tcPr>
+            <w:tcW w:type="dxa" w:w="1800"/>
             <w:tcBorders>
               <w:top w:val="single" w:color="808080" w:sz="4"/>
               <w:left w:val="single" w:color="808080" w:sz="4"/>

</xml_diff>

<commit_message>
Merge duplicate flange items and fix FAT item number for instrumentation
Co-Authored-By: Claude Opus 5.5 <noreply@anthropic.com>
Claude-Session: https://claude.ai/code/session_01DhfrxujFdtSZWrLQm5rNqB
</commit_message>
<xml_diff>
--- a/Замечания_приемочные_испытания.docx
+++ b/Замечания_приемочные_испытания.docx
@@ -1897,7 +1897,7 @@
                 <w:sz w:val="22"/>
                 <w:szCs w:val="22"/>
               </w:rPr>
-              <w:t xml:space="preserve">Фланцы трубопроводов теплоносителя мешают подключению (в трёх местах).</w:t>
+              <w:t xml:space="preserve">Зазор между поручнями лестницы и поручнем перил с левой стороны увеличить до 50 мм (не менее) во избежание травмирования пальцев.</w:t>
             </w:r>
           </w:p>
         </w:tc>
@@ -1918,7 +1918,20 @@
             </w:tcMar>
             <w:vAlign w:val="top"/>
           </w:tcPr>
-          <w:p/>
+          <w:p>
+            <w:pPr>
+              <w:spacing w:after="40" w:before="40"/>
+              <w:jc w:val="center"/>
+            </w:pPr>
+            <w:r>
+              <w:rPr>
+                <w:rFonts w:ascii="Times New Roman" w:cs="Times New Roman" w:eastAsia="Times New Roman" w:hAnsi="Times New Roman"/>
+                <w:sz w:val="22"/>
+                <w:szCs w:val="22"/>
+              </w:rPr>
+              <w:t xml:space="preserve">Фото 1</w:t>
+            </w:r>
+          </w:p>
         </w:tc>
         <w:tc>
           <w:tcPr>
@@ -2015,7 +2028,7 @@
                 <w:sz w:val="22"/>
                 <w:szCs w:val="22"/>
               </w:rPr>
-              <w:t xml:space="preserve">Зазор между поручнями лестницы и поручнем перил с левой стороны увеличить до 50 мм (не менее) во избежание травмирования пальцев.</w:t>
+              <w:t xml:space="preserve">Ограждение лестницы выполнить на высоте 2 м от пола.</w:t>
             </w:r>
           </w:p>
         </w:tc>
@@ -2047,7 +2060,7 @@
                 <w:sz w:val="22"/>
                 <w:szCs w:val="22"/>
               </w:rPr>
-              <w:t xml:space="preserve">Фото 1</w:t>
+              <w:t xml:space="preserve">Фото 2</w:t>
             </w:r>
           </w:p>
         </w:tc>
@@ -2146,7 +2159,7 @@
                 <w:sz w:val="22"/>
                 <w:szCs w:val="22"/>
               </w:rPr>
-              <w:t xml:space="preserve">Ограждение лестницы выполнить на высоте 2 м от пола.</w:t>
+              <w:t xml:space="preserve">Высоту бортового ограждения площадки выполнить 150 мм.</w:t>
             </w:r>
           </w:p>
         </w:tc>
@@ -2178,7 +2191,7 @@
                 <w:sz w:val="22"/>
                 <w:szCs w:val="22"/>
               </w:rPr>
-              <w:t xml:space="preserve">Фото 2</w:t>
+              <w:t xml:space="preserve">Фото 3</w:t>
             </w:r>
           </w:p>
         </w:tc>
@@ -2277,7 +2290,7 @@
                 <w:sz w:val="22"/>
                 <w:szCs w:val="22"/>
               </w:rPr>
-              <w:t xml:space="preserve">Высоту бортового ограждения площадки выполнить 150 мм.</w:t>
+              <w:t xml:space="preserve">Блок вакуумных насосов выходит за габариты установки — закрепить его, установив дополнительные проушины.</w:t>
             </w:r>
           </w:p>
         </w:tc>
@@ -2298,20 +2311,7 @@
             </w:tcMar>
             <w:vAlign w:val="top"/>
           </w:tcPr>
-          <w:p>
-            <w:pPr>
-              <w:spacing w:after="40" w:before="40"/>
-              <w:jc w:val="center"/>
-            </w:pPr>
-            <w:r>
-              <w:rPr>
-                <w:rFonts w:ascii="Times New Roman" w:cs="Times New Roman" w:eastAsia="Times New Roman" w:hAnsi="Times New Roman"/>
-                <w:sz w:val="22"/>
-                <w:szCs w:val="22"/>
-              </w:rPr>
-              <w:t xml:space="preserve">Фото 3</w:t>
-            </w:r>
-          </w:p>
+          <w:p/>
         </w:tc>
         <w:tc>
           <w:tcPr>
@@ -2408,7 +2408,7 @@
                 <w:sz w:val="22"/>
                 <w:szCs w:val="22"/>
               </w:rPr>
-              <w:t xml:space="preserve">Блок вакуумных насосов выходит за габариты установки — закрепить его, установив дополнительные проушины.</w:t>
+              <w:t xml:space="preserve">Заменить редукторы на шестерённых насосах на редукторы с передаточным отношением 1:5–1:8 для обеспечения производительности до 120 л/ч.</w:t>
             </w:r>
           </w:p>
         </w:tc>
@@ -2526,7 +2526,7 @@
                 <w:sz w:val="22"/>
                 <w:szCs w:val="22"/>
               </w:rPr>
-              <w:t xml:space="preserve">Заменить редукторы на шестерённых насосах на редукторы с передаточным отношением 1:5–1:8 для обеспечения производительности до 120 л/ч.</w:t>
+              <w:t xml:space="preserve">Не загнуты лепестки стопорных шайб.</w:t>
             </w:r>
           </w:p>
         </w:tc>
@@ -2547,7 +2547,20 @@
             </w:tcMar>
             <w:vAlign w:val="top"/>
           </w:tcPr>
-          <w:p/>
+          <w:p>
+            <w:pPr>
+              <w:spacing w:after="40" w:before="40"/>
+              <w:jc w:val="center"/>
+            </w:pPr>
+            <w:r>
+              <w:rPr>
+                <w:rFonts w:ascii="Times New Roman" w:cs="Times New Roman" w:eastAsia="Times New Roman" w:hAnsi="Times New Roman"/>
+                <w:sz w:val="22"/>
+                <w:szCs w:val="22"/>
+              </w:rPr>
+              <w:t xml:space="preserve">Фото 4</w:t>
+            </w:r>
+          </w:p>
         </w:tc>
         <w:tc>
           <w:tcPr>
@@ -2644,7 +2657,7 @@
                 <w:sz w:val="22"/>
                 <w:szCs w:val="22"/>
               </w:rPr>
-              <w:t xml:space="preserve">Не загнуты лепестки стопорных шайб.</w:t>
+              <w:t xml:space="preserve">Колба затворной жидкости конфликтует с фланцем — подключить к ней подвод жидкости невозможно. На остальных насосах аналогичный конфликт (колбы не установлены).</w:t>
             </w:r>
           </w:p>
         </w:tc>
@@ -2676,7 +2689,7 @@
                 <w:sz w:val="22"/>
                 <w:szCs w:val="22"/>
               </w:rPr>
-              <w:t xml:space="preserve">Фото 4</w:t>
+              <w:t xml:space="preserve">Фото 5</w:t>
             </w:r>
           </w:p>
         </w:tc>
@@ -2775,7 +2788,7 @@
                 <w:sz w:val="22"/>
                 <w:szCs w:val="22"/>
               </w:rPr>
-              <w:t xml:space="preserve">Колба затворной жидкости конфликтует с фланцем — подключить к ней подвод жидкости невозможно. На остальных насосах аналогичный конфликт (колбы не установлены).</w:t>
+              <w:t xml:space="preserve">Винтовой насос на short path оснастить сильфоном.</w:t>
             </w:r>
           </w:p>
         </w:tc>
@@ -2807,7 +2820,7 @@
                 <w:sz w:val="22"/>
                 <w:szCs w:val="22"/>
               </w:rPr>
-              <w:t xml:space="preserve">Фото 5</w:t>
+              <w:t xml:space="preserve">Фото 6</w:t>
             </w:r>
           </w:p>
         </w:tc>
@@ -2849,127 +2862,37 @@
         </w:trPr>
         <w:tc>
           <w:tcPr>
-            <w:tcW w:type="dxa" w:w="700"/>
-            <w:tcBorders>
-              <w:top w:val="single" w:color="808080" w:sz="4"/>
-              <w:left w:val="single" w:color="808080" w:sz="4"/>
-              <w:bottom w:val="single" w:color="808080" w:sz="4"/>
-              <w:right w:val="single" w:color="808080" w:sz="4"/>
-            </w:tcBorders>
-            <w:tcMar>
-              <w:top w:type="dxa" w:w="60"/>
-              <w:left w:type="dxa" w:w="100"/>
-              <w:bottom w:type="dxa" w:w="60"/>
-              <w:right w:type="dxa" w:w="100"/>
-            </w:tcMar>
-            <w:vAlign w:val="top"/>
-          </w:tcPr>
-          <w:p>
-            <w:pPr>
-              <w:spacing w:after="40" w:before="40"/>
-              <w:jc w:val="center"/>
-            </w:pPr>
-            <w:r>
-              <w:rPr>
-                <w:rFonts w:ascii="Times New Roman" w:cs="Times New Roman" w:eastAsia="Times New Roman" w:hAnsi="Times New Roman"/>
-                <w:sz w:val="22"/>
-                <w:szCs w:val="22"/>
-              </w:rPr>
-              <w:t xml:space="preserve">3.11</w:t>
-            </w:r>
-          </w:p>
-        </w:tc>
-        <w:tc>
-          <w:tcPr>
-            <w:tcW w:type="dxa" w:w="6138"/>
-            <w:tcBorders>
-              <w:top w:val="single" w:color="808080" w:sz="4"/>
-              <w:left w:val="single" w:color="808080" w:sz="4"/>
-              <w:bottom w:val="single" w:color="808080" w:sz="4"/>
-              <w:right w:val="single" w:color="808080" w:sz="4"/>
-            </w:tcBorders>
-            <w:tcMar>
-              <w:top w:type="dxa" w:w="60"/>
-              <w:left w:type="dxa" w:w="100"/>
-              <w:bottom w:type="dxa" w:w="60"/>
-              <w:right w:type="dxa" w:w="100"/>
-            </w:tcMar>
-            <w:vAlign w:val="top"/>
-          </w:tcPr>
-          <w:p>
-            <w:pPr>
-              <w:spacing w:after="40" w:before="40"/>
-            </w:pPr>
-            <w:r>
-              <w:rPr>
-                <w:rFonts w:ascii="Times New Roman" w:cs="Times New Roman" w:eastAsia="Times New Roman" w:hAnsi="Times New Roman"/>
-                <w:sz w:val="22"/>
-                <w:szCs w:val="22"/>
-              </w:rPr>
-              <w:t xml:space="preserve">Винтовой насос на short path оснастить сильфоном.</w:t>
-            </w:r>
-          </w:p>
-        </w:tc>
-        <w:tc>
-          <w:tcPr>
-            <w:tcW w:type="dxa" w:w="1000"/>
-            <w:tcBorders>
-              <w:top w:val="single" w:color="808080" w:sz="4"/>
-              <w:left w:val="single" w:color="808080" w:sz="4"/>
-              <w:bottom w:val="single" w:color="808080" w:sz="4"/>
-              <w:right w:val="single" w:color="808080" w:sz="4"/>
-            </w:tcBorders>
-            <w:tcMar>
-              <w:top w:type="dxa" w:w="60"/>
-              <w:left w:type="dxa" w:w="100"/>
-              <w:bottom w:type="dxa" w:w="60"/>
-              <w:right w:type="dxa" w:w="100"/>
-            </w:tcMar>
-            <w:vAlign w:val="top"/>
-          </w:tcPr>
-          <w:p>
-            <w:pPr>
-              <w:spacing w:after="40" w:before="40"/>
-              <w:jc w:val="center"/>
-            </w:pPr>
-            <w:r>
-              <w:rPr>
-                <w:rFonts w:ascii="Times New Roman" w:cs="Times New Roman" w:eastAsia="Times New Roman" w:hAnsi="Times New Roman"/>
-                <w:sz w:val="22"/>
-                <w:szCs w:val="22"/>
-              </w:rPr>
-              <w:t xml:space="preserve">Фото 6</w:t>
-            </w:r>
-          </w:p>
-        </w:tc>
-        <w:tc>
-          <w:tcPr>
-            <w:tcW w:type="dxa" w:w="1800"/>
-            <w:tcBorders>
-              <w:top w:val="single" w:color="808080" w:sz="4"/>
-              <w:left w:val="single" w:color="808080" w:sz="4"/>
-              <w:bottom w:val="single" w:color="808080" w:sz="4"/>
-              <w:right w:val="single" w:color="808080" w:sz="4"/>
-            </w:tcBorders>
-            <w:tcMar>
-              <w:top w:type="dxa" w:w="60"/>
-              <w:left w:type="dxa" w:w="100"/>
-              <w:bottom w:type="dxa" w:w="60"/>
-              <w:right w:type="dxa" w:w="100"/>
-            </w:tcMar>
-            <w:vAlign w:val="top"/>
-          </w:tcPr>
-          <w:p>
-            <w:pPr>
-              <w:spacing w:after="40" w:before="40"/>
-            </w:pPr>
-            <w:r>
-              <w:rPr>
-                <w:rFonts w:ascii="Times New Roman" w:cs="Times New Roman" w:eastAsia="Times New Roman" w:hAnsi="Times New Roman"/>
-                <w:sz w:val="22"/>
-                <w:szCs w:val="22"/>
-              </w:rPr>
-              <w:t xml:space="preserve"/>
+            <w:tcW w:type="dxa" w:w="9638"/>
+            <w:gridSpan w:val="4"/>
+            <w:tcBorders>
+              <w:top w:val="single" w:color="808080" w:sz="4"/>
+              <w:left w:val="single" w:color="808080" w:sz="4"/>
+              <w:bottom w:val="single" w:color="808080" w:sz="4"/>
+              <w:right w:val="single" w:color="808080" w:sz="4"/>
+            </w:tcBorders>
+            <w:shd w:fill="F2F2F2" w:color="auto" w:val="clear"/>
+            <w:tcMar>
+              <w:top w:type="dxa" w:w="60"/>
+              <w:left w:type="dxa" w:w="100"/>
+              <w:bottom w:type="dxa" w:w="60"/>
+              <w:right w:type="dxa" w:w="100"/>
+            </w:tcMar>
+            <w:vAlign w:val="top"/>
+          </w:tcPr>
+          <w:p>
+            <w:pPr>
+              <w:keepNext/>
+              <w:spacing w:after="40" w:before="40"/>
+            </w:pPr>
+            <w:r>
+              <w:rPr>
+                <w:rFonts w:ascii="Times New Roman" w:cs="Times New Roman" w:eastAsia="Times New Roman" w:hAnsi="Times New Roman"/>
+                <w:b/>
+                <w:bCs/>
+                <w:sz w:val="22"/>
+                <w:szCs w:val="22"/>
+              </w:rPr>
+              <w:t xml:space="preserve">4. Обвязка трубопроводов</w:t>
             </w:r>
           </w:p>
         </w:tc>
@@ -2980,37 +2903,127 @@
         </w:trPr>
         <w:tc>
           <w:tcPr>
-            <w:tcW w:type="dxa" w:w="9638"/>
-            <w:gridSpan w:val="4"/>
-            <w:tcBorders>
-              <w:top w:val="single" w:color="808080" w:sz="4"/>
-              <w:left w:val="single" w:color="808080" w:sz="4"/>
-              <w:bottom w:val="single" w:color="808080" w:sz="4"/>
-              <w:right w:val="single" w:color="808080" w:sz="4"/>
-            </w:tcBorders>
-            <w:shd w:fill="F2F2F2" w:color="auto" w:val="clear"/>
-            <w:tcMar>
-              <w:top w:type="dxa" w:w="60"/>
-              <w:left w:type="dxa" w:w="100"/>
-              <w:bottom w:type="dxa" w:w="60"/>
-              <w:right w:type="dxa" w:w="100"/>
-            </w:tcMar>
-            <w:vAlign w:val="top"/>
-          </w:tcPr>
-          <w:p>
-            <w:pPr>
-              <w:keepNext/>
-              <w:spacing w:after="40" w:before="40"/>
-            </w:pPr>
-            <w:r>
-              <w:rPr>
-                <w:rFonts w:ascii="Times New Roman" w:cs="Times New Roman" w:eastAsia="Times New Roman" w:hAnsi="Times New Roman"/>
-                <w:b/>
-                <w:bCs/>
-                <w:sz w:val="22"/>
-                <w:szCs w:val="22"/>
-              </w:rPr>
-              <w:t xml:space="preserve">4. Обвязка трубопроводов</w:t>
+            <w:tcW w:type="dxa" w:w="700"/>
+            <w:tcBorders>
+              <w:top w:val="single" w:color="808080" w:sz="4"/>
+              <w:left w:val="single" w:color="808080" w:sz="4"/>
+              <w:bottom w:val="single" w:color="808080" w:sz="4"/>
+              <w:right w:val="single" w:color="808080" w:sz="4"/>
+            </w:tcBorders>
+            <w:tcMar>
+              <w:top w:type="dxa" w:w="60"/>
+              <w:left w:type="dxa" w:w="100"/>
+              <w:bottom w:type="dxa" w:w="60"/>
+              <w:right w:type="dxa" w:w="100"/>
+            </w:tcMar>
+            <w:vAlign w:val="top"/>
+          </w:tcPr>
+          <w:p>
+            <w:pPr>
+              <w:spacing w:after="40" w:before="40"/>
+              <w:jc w:val="center"/>
+            </w:pPr>
+            <w:r>
+              <w:rPr>
+                <w:rFonts w:ascii="Times New Roman" w:cs="Times New Roman" w:eastAsia="Times New Roman" w:hAnsi="Times New Roman"/>
+                <w:sz w:val="22"/>
+                <w:szCs w:val="22"/>
+              </w:rPr>
+              <w:t xml:space="preserve">4.1</w:t>
+            </w:r>
+          </w:p>
+        </w:tc>
+        <w:tc>
+          <w:tcPr>
+            <w:tcW w:type="dxa" w:w="6138"/>
+            <w:tcBorders>
+              <w:top w:val="single" w:color="808080" w:sz="4"/>
+              <w:left w:val="single" w:color="808080" w:sz="4"/>
+              <w:bottom w:val="single" w:color="808080" w:sz="4"/>
+              <w:right w:val="single" w:color="808080" w:sz="4"/>
+            </w:tcBorders>
+            <w:tcMar>
+              <w:top w:type="dxa" w:w="60"/>
+              <w:left w:type="dxa" w:w="100"/>
+              <w:bottom w:type="dxa" w:w="60"/>
+              <w:right w:type="dxa" w:w="100"/>
+            </w:tcMar>
+            <w:vAlign w:val="top"/>
+          </w:tcPr>
+          <w:p>
+            <w:pPr>
+              <w:spacing w:after="40" w:before="40"/>
+            </w:pPr>
+            <w:r>
+              <w:rPr>
+                <w:rFonts w:ascii="Times New Roman" w:cs="Times New Roman" w:eastAsia="Times New Roman" w:hAnsi="Times New Roman"/>
+                <w:sz w:val="22"/>
+                <w:szCs w:val="22"/>
+              </w:rPr>
+              <w:t xml:space="preserve">Трубопровод теплоносителя проложен некорректно: теплоноситель должен подаваться снизу вверх, а после флоуметра поток идёт сверху вниз.</w:t>
+            </w:r>
+          </w:p>
+        </w:tc>
+        <w:tc>
+          <w:tcPr>
+            <w:tcW w:type="dxa" w:w="1000"/>
+            <w:tcBorders>
+              <w:top w:val="single" w:color="808080" w:sz="4"/>
+              <w:left w:val="single" w:color="808080" w:sz="4"/>
+              <w:bottom w:val="single" w:color="808080" w:sz="4"/>
+              <w:right w:val="single" w:color="808080" w:sz="4"/>
+            </w:tcBorders>
+            <w:tcMar>
+              <w:top w:type="dxa" w:w="60"/>
+              <w:left w:type="dxa" w:w="100"/>
+              <w:bottom w:type="dxa" w:w="60"/>
+              <w:right w:type="dxa" w:w="100"/>
+            </w:tcMar>
+            <w:vAlign w:val="top"/>
+          </w:tcPr>
+          <w:p>
+            <w:pPr>
+              <w:spacing w:after="40" w:before="40"/>
+              <w:jc w:val="center"/>
+            </w:pPr>
+            <w:r>
+              <w:rPr>
+                <w:rFonts w:ascii="Times New Roman" w:cs="Times New Roman" w:eastAsia="Times New Roman" w:hAnsi="Times New Roman"/>
+                <w:sz w:val="22"/>
+                <w:szCs w:val="22"/>
+              </w:rPr>
+              <w:t xml:space="preserve">Фото 7</w:t>
+            </w:r>
+          </w:p>
+        </w:tc>
+        <w:tc>
+          <w:tcPr>
+            <w:tcW w:type="dxa" w:w="1800"/>
+            <w:tcBorders>
+              <w:top w:val="single" w:color="808080" w:sz="4"/>
+              <w:left w:val="single" w:color="808080" w:sz="4"/>
+              <w:bottom w:val="single" w:color="808080" w:sz="4"/>
+              <w:right w:val="single" w:color="808080" w:sz="4"/>
+            </w:tcBorders>
+            <w:tcMar>
+              <w:top w:type="dxa" w:w="60"/>
+              <w:left w:type="dxa" w:w="100"/>
+              <w:bottom w:type="dxa" w:w="60"/>
+              <w:right w:type="dxa" w:w="100"/>
+            </w:tcMar>
+            <w:vAlign w:val="top"/>
+          </w:tcPr>
+          <w:p>
+            <w:pPr>
+              <w:spacing w:after="40" w:before="40"/>
+            </w:pPr>
+            <w:r>
+              <w:rPr>
+                <w:rFonts w:ascii="Times New Roman" w:cs="Times New Roman" w:eastAsia="Times New Roman" w:hAnsi="Times New Roman"/>
+                <w:sz w:val="22"/>
+                <w:szCs w:val="22"/>
+              </w:rPr>
+              <w:t xml:space="preserve"/>
             </w:r>
           </w:p>
         </w:tc>
@@ -3047,7 +3060,7 @@
                 <w:sz w:val="22"/>
                 <w:szCs w:val="22"/>
               </w:rPr>
-              <w:t xml:space="preserve">4.1</w:t>
+              <w:t xml:space="preserve">4.2</w:t>
             </w:r>
           </w:p>
         </w:tc>
@@ -3078,7 +3091,7 @@
                 <w:sz w:val="22"/>
                 <w:szCs w:val="22"/>
               </w:rPr>
-              <w:t xml:space="preserve">Трубопровод теплоносителя проложен некорректно: теплоноситель должен подаваться снизу вверх, а после флоуметра поток идёт сверху вниз.</w:t>
+              <w:t xml:space="preserve">Отсутствуют трубопроводы теплоносителя на кранах и обратных клапанах: BV-001, BV-002, BV-008, BV-011, BV-012, BV-014, BV-015, BV-016, BV-104, BV-106, CV-001, CV-002, CV-004, CV-005, TV-002, TV-003, TV-004, TV-005, HV-002, HV-003, кран на PG-004.</w:t>
             </w:r>
           </w:p>
         </w:tc>
@@ -3099,20 +3112,7 @@
             </w:tcMar>
             <w:vAlign w:val="top"/>
           </w:tcPr>
-          <w:p>
-            <w:pPr>
-              <w:spacing w:after="40" w:before="40"/>
-              <w:jc w:val="center"/>
-            </w:pPr>
-            <w:r>
-              <w:rPr>
-                <w:rFonts w:ascii="Times New Roman" w:cs="Times New Roman" w:eastAsia="Times New Roman" w:hAnsi="Times New Roman"/>
-                <w:sz w:val="22"/>
-                <w:szCs w:val="22"/>
-              </w:rPr>
-              <w:t xml:space="preserve">Фото 7</w:t>
-            </w:r>
-          </w:p>
+          <w:p/>
         </w:tc>
         <w:tc>
           <w:tcPr>
@@ -3178,7 +3178,7 @@
                 <w:sz w:val="22"/>
                 <w:szCs w:val="22"/>
               </w:rPr>
-              <w:t xml:space="preserve">4.2</w:t>
+              <w:t xml:space="preserve">4.3</w:t>
             </w:r>
           </w:p>
         </w:tc>
@@ -3209,7 +3209,7 @@
                 <w:sz w:val="22"/>
                 <w:szCs w:val="22"/>
               </w:rPr>
-              <w:t xml:space="preserve">Отсутствуют трубопроводы теплоносителя на кранах и обратных клапанах: BV-001, BV-002, BV-008, BV-011, BV-012, BV-014, BV-015, BV-016, BV-104, BV-106, CV-001, CV-002, CV-004, CV-005, TV-002, TV-003, TV-004, TV-005, HV-002, HV-003, кран на PG-004.</w:t>
+              <w:t xml:space="preserve">Отсутствуют подключения теплоносителя насоса Р-101.</w:t>
             </w:r>
           </w:p>
         </w:tc>
@@ -3230,7 +3230,20 @@
             </w:tcMar>
             <w:vAlign w:val="top"/>
           </w:tcPr>
-          <w:p/>
+          <w:p>
+            <w:pPr>
+              <w:spacing w:after="40" w:before="40"/>
+              <w:jc w:val="center"/>
+            </w:pPr>
+            <w:r>
+              <w:rPr>
+                <w:rFonts w:ascii="Times New Roman" w:cs="Times New Roman" w:eastAsia="Times New Roman" w:hAnsi="Times New Roman"/>
+                <w:sz w:val="22"/>
+                <w:szCs w:val="22"/>
+              </w:rPr>
+              <w:t xml:space="preserve">Фото 8</w:t>
+            </w:r>
+          </w:p>
         </w:tc>
         <w:tc>
           <w:tcPr>
@@ -3296,7 +3309,7 @@
                 <w:sz w:val="22"/>
                 <w:szCs w:val="22"/>
               </w:rPr>
-              <w:t xml:space="preserve">4.3</w:t>
+              <w:t xml:space="preserve">4.4</w:t>
             </w:r>
           </w:p>
         </w:tc>
@@ -3327,7 +3340,7 @@
                 <w:sz w:val="22"/>
                 <w:szCs w:val="22"/>
               </w:rPr>
-              <w:t xml:space="preserve">Отсутствуют подключения теплоносителя насоса Р-101.</w:t>
+              <w:t xml:space="preserve">Отсутствуют подключения теплоносителя на выходе pre-heater 1-го контура.</w:t>
             </w:r>
           </w:p>
         </w:tc>
@@ -3359,7 +3372,7 @@
                 <w:sz w:val="22"/>
                 <w:szCs w:val="22"/>
               </w:rPr>
-              <w:t xml:space="preserve">Фото 8</w:t>
+              <w:t xml:space="preserve">Фото 9</w:t>
             </w:r>
           </w:p>
         </w:tc>
@@ -3427,7 +3440,7 @@
                 <w:sz w:val="22"/>
                 <w:szCs w:val="22"/>
               </w:rPr>
-              <w:t xml:space="preserve">4.4</w:t>
+              <w:t xml:space="preserve">4.5</w:t>
             </w:r>
           </w:p>
         </w:tc>
@@ -3458,7 +3471,7 @@
                 <w:sz w:val="22"/>
                 <w:szCs w:val="22"/>
               </w:rPr>
-              <w:t xml:space="preserve">Отсутствуют подключения теплоносителя на выходе pre-heater 1-го контура.</w:t>
+              <w:t xml:space="preserve">Отсутствует кран дренажного слива после насоса Р-101.</w:t>
             </w:r>
           </w:p>
         </w:tc>
@@ -3490,7 +3503,7 @@
                 <w:sz w:val="22"/>
                 <w:szCs w:val="22"/>
               </w:rPr>
-              <w:t xml:space="preserve">Фото 9</w:t>
+              <w:t xml:space="preserve">Фото 10</w:t>
             </w:r>
           </w:p>
         </w:tc>
@@ -3558,7 +3571,7 @@
                 <w:sz w:val="22"/>
                 <w:szCs w:val="22"/>
               </w:rPr>
-              <w:t xml:space="preserve">4.5</w:t>
+              <w:t xml:space="preserve">4.6</w:t>
             </w:r>
           </w:p>
         </w:tc>
@@ -3589,7 +3602,7 @@
                 <w:sz w:val="22"/>
                 <w:szCs w:val="22"/>
               </w:rPr>
-              <w:t xml:space="preserve">Отсутствует кран дренажного слива после насоса Р-101.</w:t>
+              <w:t xml:space="preserve">Фланцы трубопроводов теплоносителя мешают подключению (в трёх местах), в том числе фланец на кране BV-008 (слив тяжёлой фракции 1-й ступени) — исправить.</w:t>
             </w:r>
           </w:p>
         </w:tc>
@@ -3621,7 +3634,7 @@
                 <w:sz w:val="22"/>
                 <w:szCs w:val="22"/>
               </w:rPr>
-              <w:t xml:space="preserve">Фото 10</w:t>
+              <w:t xml:space="preserve">Фото 11</w:t>
             </w:r>
           </w:p>
         </w:tc>
@@ -3689,7 +3702,7 @@
                 <w:sz w:val="22"/>
                 <w:szCs w:val="22"/>
               </w:rPr>
-              <w:t xml:space="preserve">4.6</w:t>
+              <w:t xml:space="preserve">4.7</w:t>
             </w:r>
           </w:p>
         </w:tc>
@@ -3720,7 +3733,7 @@
                 <w:sz w:val="22"/>
                 <w:szCs w:val="22"/>
               </w:rPr>
-              <w:t xml:space="preserve">Исправить фланец на кране BV-008 (слив тяжёлой фракции 1-й ступени).</w:t>
+              <w:t xml:space="preserve">Отсутствуют шайбы на фланцевом соединении.</w:t>
             </w:r>
           </w:p>
         </w:tc>
@@ -3752,7 +3765,7 @@
                 <w:sz w:val="22"/>
                 <w:szCs w:val="22"/>
               </w:rPr>
-              <w:t xml:space="preserve">Фото 11</w:t>
+              <w:t xml:space="preserve">Фото 12</w:t>
             </w:r>
           </w:p>
         </w:tc>
@@ -3820,7 +3833,7 @@
                 <w:sz w:val="22"/>
                 <w:szCs w:val="22"/>
               </w:rPr>
-              <w:t xml:space="preserve">4.7</w:t>
+              <w:t xml:space="preserve">4.8</w:t>
             </w:r>
           </w:p>
         </w:tc>
@@ -3851,7 +3864,7 @@
                 <w:sz w:val="22"/>
                 <w:szCs w:val="22"/>
               </w:rPr>
-              <w:t xml:space="preserve">Отсутствуют шайбы на фланцевом соединении.</w:t>
+              <w:t xml:space="preserve">Отсутствуют два болта после флоуметра.</w:t>
             </w:r>
           </w:p>
         </w:tc>
@@ -3883,7 +3896,7 @@
                 <w:sz w:val="22"/>
                 <w:szCs w:val="22"/>
               </w:rPr>
-              <w:t xml:space="preserve">Фото 12</w:t>
+              <w:t xml:space="preserve">Фото 13</w:t>
             </w:r>
           </w:p>
         </w:tc>
@@ -3951,7 +3964,7 @@
                 <w:sz w:val="22"/>
                 <w:szCs w:val="22"/>
               </w:rPr>
-              <w:t xml:space="preserve">4.8</w:t>
+              <w:t xml:space="preserve">4.9</w:t>
             </w:r>
           </w:p>
         </w:tc>
@@ -3982,7 +3995,7 @@
                 <w:sz w:val="22"/>
                 <w:szCs w:val="22"/>
               </w:rPr>
-              <w:t xml:space="preserve">Отсутствуют два болта после флоуметра.</w:t>
+              <w:t xml:space="preserve">Заменить прямой отвод на отвод 90° для устранения конфликта трубопроводов.</w:t>
             </w:r>
           </w:p>
         </w:tc>
@@ -4014,7 +4027,7 @@
                 <w:sz w:val="22"/>
                 <w:szCs w:val="22"/>
               </w:rPr>
-              <w:t xml:space="preserve">Фото 13</w:t>
+              <w:t xml:space="preserve">Фото 14</w:t>
             </w:r>
           </w:p>
         </w:tc>
@@ -4082,7 +4095,7 @@
                 <w:sz w:val="22"/>
                 <w:szCs w:val="22"/>
               </w:rPr>
-              <w:t xml:space="preserve">4.9</w:t>
+              <w:t xml:space="preserve">4.10</w:t>
             </w:r>
           </w:p>
         </w:tc>
@@ -4113,7 +4126,7 @@
                 <w:sz w:val="22"/>
                 <w:szCs w:val="22"/>
               </w:rPr>
-              <w:t xml:space="preserve">Заменить прямой отвод на отвод 90° для устранения конфликта трубопроводов.</w:t>
+              <w:t xml:space="preserve">На части фланцевых соединений установлены резиновые прокладки вместо PTFE.</w:t>
             </w:r>
           </w:p>
         </w:tc>
@@ -4145,7 +4158,7 @@
                 <w:sz w:val="22"/>
                 <w:szCs w:val="22"/>
               </w:rPr>
-              <w:t xml:space="preserve">Фото 14</w:t>
+              <w:t xml:space="preserve">Фото 15</w:t>
             </w:r>
           </w:p>
         </w:tc>
@@ -4213,7 +4226,7 @@
                 <w:sz w:val="22"/>
                 <w:szCs w:val="22"/>
               </w:rPr>
-              <w:t xml:space="preserve">4.10</w:t>
+              <w:t xml:space="preserve">4.11</w:t>
             </w:r>
           </w:p>
         </w:tc>
@@ -4244,7 +4257,7 @@
                 <w:sz w:val="22"/>
                 <w:szCs w:val="22"/>
               </w:rPr>
-              <w:t xml:space="preserve">На части фланцевых соединений установлены резиновые прокладки вместо PTFE.</w:t>
+              <w:t xml:space="preserve">Гибкие подводки установлены со скручиванием, что недопустимо.</w:t>
             </w:r>
           </w:p>
         </w:tc>
@@ -4276,7 +4289,21 @@
                 <w:sz w:val="22"/>
                 <w:szCs w:val="22"/>
               </w:rPr>
-              <w:t xml:space="preserve">Фото 15</w:t>
+              <w:t xml:space="preserve">Фото 16</w:t>
+            </w:r>
+          </w:p>
+          <w:p>
+            <w:pPr>
+              <w:spacing w:after="40" w:before="40"/>
+              <w:jc w:val="center"/>
+            </w:pPr>
+            <w:r>
+              <w:rPr>
+                <w:rFonts w:ascii="Times New Roman" w:cs="Times New Roman" w:eastAsia="Times New Roman" w:hAnsi="Times New Roman"/>
+                <w:sz w:val="22"/>
+                <w:szCs w:val="22"/>
+              </w:rPr>
+              <w:t xml:space="preserve">Фото 17</w:t>
             </w:r>
           </w:p>
         </w:tc>
@@ -4344,7 +4371,7 @@
                 <w:sz w:val="22"/>
                 <w:szCs w:val="22"/>
               </w:rPr>
-              <w:t xml:space="preserve">4.11</w:t>
+              <w:t xml:space="preserve">4.12</w:t>
             </w:r>
           </w:p>
         </w:tc>
@@ -4375,7 +4402,7 @@
                 <w:sz w:val="22"/>
                 <w:szCs w:val="22"/>
               </w:rPr>
-              <w:t xml:space="preserve">Гибкие подводки установлены со скручиванием, что недопустимо.</w:t>
+              <w:t xml:space="preserve">Вместо временных подставок (красных коробок) установить опоры под трубопроводы.</w:t>
             </w:r>
           </w:p>
         </w:tc>
@@ -4407,21 +4434,7 @@
                 <w:sz w:val="22"/>
                 <w:szCs w:val="22"/>
               </w:rPr>
-              <w:t xml:space="preserve">Фото 16</w:t>
-            </w:r>
-          </w:p>
-          <w:p>
-            <w:pPr>
-              <w:spacing w:after="40" w:before="40"/>
-              <w:jc w:val="center"/>
-            </w:pPr>
-            <w:r>
-              <w:rPr>
-                <w:rFonts w:ascii="Times New Roman" w:cs="Times New Roman" w:eastAsia="Times New Roman" w:hAnsi="Times New Roman"/>
-                <w:sz w:val="22"/>
-                <w:szCs w:val="22"/>
-              </w:rPr>
-              <w:t xml:space="preserve">Фото 17</w:t>
+              <w:t xml:space="preserve">Фото 18</w:t>
             </w:r>
           </w:p>
         </w:tc>
@@ -4489,7 +4502,7 @@
                 <w:sz w:val="22"/>
                 <w:szCs w:val="22"/>
               </w:rPr>
-              <w:t xml:space="preserve">4.12</w:t>
+              <w:t xml:space="preserve">4.13</w:t>
             </w:r>
           </w:p>
         </w:tc>
@@ -4520,7 +4533,7 @@
                 <w:sz w:val="22"/>
                 <w:szCs w:val="22"/>
               </w:rPr>
-              <w:t xml:space="preserve">Вместо временных подставок (красных коробок) установить опоры под трубопроводы.</w:t>
+              <w:t xml:space="preserve">Перенести два трубопровода под пол второго технологического этажа.</w:t>
             </w:r>
           </w:p>
         </w:tc>
@@ -4552,7 +4565,7 @@
                 <w:sz w:val="22"/>
                 <w:szCs w:val="22"/>
               </w:rPr>
-              <w:t xml:space="preserve">Фото 18</w:t>
+              <w:t xml:space="preserve">Фото 19</w:t>
             </w:r>
           </w:p>
         </w:tc>
@@ -4620,7 +4633,7 @@
                 <w:sz w:val="22"/>
                 <w:szCs w:val="22"/>
               </w:rPr>
-              <w:t xml:space="preserve">4.13</w:t>
+              <w:t xml:space="preserve">4.14</w:t>
             </w:r>
           </w:p>
         </w:tc>
@@ -4651,7 +4664,7 @@
                 <w:sz w:val="22"/>
                 <w:szCs w:val="22"/>
               </w:rPr>
-              <w:t xml:space="preserve">Перенести два трубопровода под пол второго технологического этажа.</w:t>
+              <w:t xml:space="preserve">Обеспечить предварительный нагрев до той же температуры, что и в основном трубопроводе подачи на испаритель.</w:t>
             </w:r>
           </w:p>
         </w:tc>
@@ -4672,20 +4685,7 @@
             </w:tcMar>
             <w:vAlign w:val="top"/>
           </w:tcPr>
-          <w:p>
-            <w:pPr>
-              <w:spacing w:after="40" w:before="40"/>
-              <w:jc w:val="center"/>
-            </w:pPr>
-            <w:r>
-              <w:rPr>
-                <w:rFonts w:ascii="Times New Roman" w:cs="Times New Roman" w:eastAsia="Times New Roman" w:hAnsi="Times New Roman"/>
-                <w:sz w:val="22"/>
-                <w:szCs w:val="22"/>
-              </w:rPr>
-              <w:t xml:space="preserve">Фото 19</w:t>
-            </w:r>
-          </w:p>
+          <w:p/>
         </w:tc>
         <w:tc>
           <w:tcPr>
@@ -4751,7 +4751,7 @@
                 <w:sz w:val="22"/>
                 <w:szCs w:val="22"/>
               </w:rPr>
-              <w:t xml:space="preserve">4.14</w:t>
+              <w:t xml:space="preserve">4.15</w:t>
             </w:r>
           </w:p>
         </w:tc>
@@ -4782,7 +4782,7 @@
                 <w:sz w:val="22"/>
                 <w:szCs w:val="22"/>
               </w:rPr>
-              <w:t xml:space="preserve">Обеспечить предварительный нагрев до той же температуры, что и в основном трубопроводе подачи на испаритель.</w:t>
+              <w:t xml:space="preserve">Насосы не имеют защиты — обеспечить подачу сжатого воздуха от централизованной разводки.</w:t>
             </w:r>
           </w:p>
         </w:tc>
@@ -4843,114 +4843,37 @@
         </w:trPr>
         <w:tc>
           <w:tcPr>
-            <w:tcW w:type="dxa" w:w="700"/>
-            <w:tcBorders>
-              <w:top w:val="single" w:color="808080" w:sz="4"/>
-              <w:left w:val="single" w:color="808080" w:sz="4"/>
-              <w:bottom w:val="single" w:color="808080" w:sz="4"/>
-              <w:right w:val="single" w:color="808080" w:sz="4"/>
-            </w:tcBorders>
-            <w:tcMar>
-              <w:top w:type="dxa" w:w="60"/>
-              <w:left w:type="dxa" w:w="100"/>
-              <w:bottom w:type="dxa" w:w="60"/>
-              <w:right w:type="dxa" w:w="100"/>
-            </w:tcMar>
-            <w:vAlign w:val="top"/>
-          </w:tcPr>
-          <w:p>
-            <w:pPr>
-              <w:spacing w:after="40" w:before="40"/>
-              <w:jc w:val="center"/>
-            </w:pPr>
-            <w:r>
-              <w:rPr>
-                <w:rFonts w:ascii="Times New Roman" w:cs="Times New Roman" w:eastAsia="Times New Roman" w:hAnsi="Times New Roman"/>
-                <w:sz w:val="22"/>
-                <w:szCs w:val="22"/>
-              </w:rPr>
-              <w:t xml:space="preserve">4.15</w:t>
-            </w:r>
-          </w:p>
-        </w:tc>
-        <w:tc>
-          <w:tcPr>
-            <w:tcW w:type="dxa" w:w="6138"/>
-            <w:tcBorders>
-              <w:top w:val="single" w:color="808080" w:sz="4"/>
-              <w:left w:val="single" w:color="808080" w:sz="4"/>
-              <w:bottom w:val="single" w:color="808080" w:sz="4"/>
-              <w:right w:val="single" w:color="808080" w:sz="4"/>
-            </w:tcBorders>
-            <w:tcMar>
-              <w:top w:type="dxa" w:w="60"/>
-              <w:left w:type="dxa" w:w="100"/>
-              <w:bottom w:type="dxa" w:w="60"/>
-              <w:right w:type="dxa" w:w="100"/>
-            </w:tcMar>
-            <w:vAlign w:val="top"/>
-          </w:tcPr>
-          <w:p>
-            <w:pPr>
-              <w:spacing w:after="40" w:before="40"/>
-            </w:pPr>
-            <w:r>
-              <w:rPr>
-                <w:rFonts w:ascii="Times New Roman" w:cs="Times New Roman" w:eastAsia="Times New Roman" w:hAnsi="Times New Roman"/>
-                <w:sz w:val="22"/>
-                <w:szCs w:val="22"/>
-              </w:rPr>
-              <w:t xml:space="preserve">Насосы не имеют защиты — обеспечить подачу сжатого воздуха от централизованной разводки.</w:t>
-            </w:r>
-          </w:p>
-        </w:tc>
-        <w:tc>
-          <w:tcPr>
-            <w:tcW w:type="dxa" w:w="1000"/>
-            <w:tcBorders>
-              <w:top w:val="single" w:color="808080" w:sz="4"/>
-              <w:left w:val="single" w:color="808080" w:sz="4"/>
-              <w:bottom w:val="single" w:color="808080" w:sz="4"/>
-              <w:right w:val="single" w:color="808080" w:sz="4"/>
-            </w:tcBorders>
-            <w:tcMar>
-              <w:top w:type="dxa" w:w="60"/>
-              <w:left w:type="dxa" w:w="100"/>
-              <w:bottom w:type="dxa" w:w="60"/>
-              <w:right w:type="dxa" w:w="100"/>
-            </w:tcMar>
-            <w:vAlign w:val="top"/>
-          </w:tcPr>
-          <w:p/>
-        </w:tc>
-        <w:tc>
-          <w:tcPr>
-            <w:tcW w:type="dxa" w:w="1800"/>
-            <w:tcBorders>
-              <w:top w:val="single" w:color="808080" w:sz="4"/>
-              <w:left w:val="single" w:color="808080" w:sz="4"/>
-              <w:bottom w:val="single" w:color="808080" w:sz="4"/>
-              <w:right w:val="single" w:color="808080" w:sz="4"/>
-            </w:tcBorders>
-            <w:tcMar>
-              <w:top w:type="dxa" w:w="60"/>
-              <w:left w:type="dxa" w:w="100"/>
-              <w:bottom w:type="dxa" w:w="60"/>
-              <w:right w:type="dxa" w:w="100"/>
-            </w:tcMar>
-            <w:vAlign w:val="top"/>
-          </w:tcPr>
-          <w:p>
-            <w:pPr>
-              <w:spacing w:after="40" w:before="40"/>
-            </w:pPr>
-            <w:r>
-              <w:rPr>
-                <w:rFonts w:ascii="Times New Roman" w:cs="Times New Roman" w:eastAsia="Times New Roman" w:hAnsi="Times New Roman"/>
-                <w:sz w:val="22"/>
-                <w:szCs w:val="22"/>
-              </w:rPr>
-              <w:t xml:space="preserve"/>
+            <w:tcW w:type="dxa" w:w="9638"/>
+            <w:gridSpan w:val="4"/>
+            <w:tcBorders>
+              <w:top w:val="single" w:color="808080" w:sz="4"/>
+              <w:left w:val="single" w:color="808080" w:sz="4"/>
+              <w:bottom w:val="single" w:color="808080" w:sz="4"/>
+              <w:right w:val="single" w:color="808080" w:sz="4"/>
+            </w:tcBorders>
+            <w:shd w:fill="F2F2F2" w:color="auto" w:val="clear"/>
+            <w:tcMar>
+              <w:top w:type="dxa" w:w="60"/>
+              <w:left w:type="dxa" w:w="100"/>
+              <w:bottom w:type="dxa" w:w="60"/>
+              <w:right w:type="dxa" w:w="100"/>
+            </w:tcMar>
+            <w:vAlign w:val="top"/>
+          </w:tcPr>
+          <w:p>
+            <w:pPr>
+              <w:keepNext/>
+              <w:spacing w:after="40" w:before="40"/>
+            </w:pPr>
+            <w:r>
+              <w:rPr>
+                <w:rFonts w:ascii="Times New Roman" w:cs="Times New Roman" w:eastAsia="Times New Roman" w:hAnsi="Times New Roman"/>
+                <w:b/>
+                <w:bCs/>
+                <w:sz w:val="22"/>
+                <w:szCs w:val="22"/>
+              </w:rPr>
+              <w:t xml:space="preserve">5. Электрооборудование и КИП</w:t>
             </w:r>
           </w:p>
         </w:tc>
@@ -4961,37 +4884,127 @@
         </w:trPr>
         <w:tc>
           <w:tcPr>
-            <w:tcW w:type="dxa" w:w="9638"/>
-            <w:gridSpan w:val="4"/>
-            <w:tcBorders>
-              <w:top w:val="single" w:color="808080" w:sz="4"/>
-              <w:left w:val="single" w:color="808080" w:sz="4"/>
-              <w:bottom w:val="single" w:color="808080" w:sz="4"/>
-              <w:right w:val="single" w:color="808080" w:sz="4"/>
-            </w:tcBorders>
-            <w:shd w:fill="F2F2F2" w:color="auto" w:val="clear"/>
-            <w:tcMar>
-              <w:top w:type="dxa" w:w="60"/>
-              <w:left w:type="dxa" w:w="100"/>
-              <w:bottom w:type="dxa" w:w="60"/>
-              <w:right w:type="dxa" w:w="100"/>
-            </w:tcMar>
-            <w:vAlign w:val="top"/>
-          </w:tcPr>
-          <w:p>
-            <w:pPr>
-              <w:keepNext/>
-              <w:spacing w:after="40" w:before="40"/>
-            </w:pPr>
-            <w:r>
-              <w:rPr>
-                <w:rFonts w:ascii="Times New Roman" w:cs="Times New Roman" w:eastAsia="Times New Roman" w:hAnsi="Times New Roman"/>
-                <w:b/>
-                <w:bCs/>
-                <w:sz w:val="22"/>
-                <w:szCs w:val="22"/>
-              </w:rPr>
-              <w:t xml:space="preserve">5. Электрооборудование и КИП</w:t>
+            <w:tcW w:type="dxa" w:w="700"/>
+            <w:tcBorders>
+              <w:top w:val="single" w:color="808080" w:sz="4"/>
+              <w:left w:val="single" w:color="808080" w:sz="4"/>
+              <w:bottom w:val="single" w:color="808080" w:sz="4"/>
+              <w:right w:val="single" w:color="808080" w:sz="4"/>
+            </w:tcBorders>
+            <w:tcMar>
+              <w:top w:type="dxa" w:w="60"/>
+              <w:left w:type="dxa" w:w="100"/>
+              <w:bottom w:type="dxa" w:w="60"/>
+              <w:right w:type="dxa" w:w="100"/>
+            </w:tcMar>
+            <w:vAlign w:val="top"/>
+          </w:tcPr>
+          <w:p>
+            <w:pPr>
+              <w:spacing w:after="40" w:before="40"/>
+              <w:jc w:val="center"/>
+            </w:pPr>
+            <w:r>
+              <w:rPr>
+                <w:rFonts w:ascii="Times New Roman" w:cs="Times New Roman" w:eastAsia="Times New Roman" w:hAnsi="Times New Roman"/>
+                <w:sz w:val="22"/>
+                <w:szCs w:val="22"/>
+              </w:rPr>
+              <w:t xml:space="preserve">5.1</w:t>
+            </w:r>
+          </w:p>
+        </w:tc>
+        <w:tc>
+          <w:tcPr>
+            <w:tcW w:type="dxa" w:w="6138"/>
+            <w:tcBorders>
+              <w:top w:val="single" w:color="808080" w:sz="4"/>
+              <w:left w:val="single" w:color="808080" w:sz="4"/>
+              <w:bottom w:val="single" w:color="808080" w:sz="4"/>
+              <w:right w:val="single" w:color="808080" w:sz="4"/>
+            </w:tcBorders>
+            <w:tcMar>
+              <w:top w:type="dxa" w:w="60"/>
+              <w:left w:type="dxa" w:w="100"/>
+              <w:bottom w:type="dxa" w:w="60"/>
+              <w:right w:type="dxa" w:w="100"/>
+            </w:tcMar>
+            <w:vAlign w:val="top"/>
+          </w:tcPr>
+          <w:p>
+            <w:pPr>
+              <w:spacing w:after="40" w:before="40"/>
+            </w:pPr>
+            <w:r>
+              <w:rPr>
+                <w:rFonts w:ascii="Times New Roman" w:cs="Times New Roman" w:eastAsia="Times New Roman" w:hAnsi="Times New Roman"/>
+                <w:sz w:val="22"/>
+                <w:szCs w:val="22"/>
+              </w:rPr>
+              <w:t xml:space="preserve">Бронированные кабели закреплены не полностью (не закреплена броня кабелей).</w:t>
+            </w:r>
+          </w:p>
+        </w:tc>
+        <w:tc>
+          <w:tcPr>
+            <w:tcW w:type="dxa" w:w="1000"/>
+            <w:tcBorders>
+              <w:top w:val="single" w:color="808080" w:sz="4"/>
+              <w:left w:val="single" w:color="808080" w:sz="4"/>
+              <w:bottom w:val="single" w:color="808080" w:sz="4"/>
+              <w:right w:val="single" w:color="808080" w:sz="4"/>
+            </w:tcBorders>
+            <w:tcMar>
+              <w:top w:type="dxa" w:w="60"/>
+              <w:left w:type="dxa" w:w="100"/>
+              <w:bottom w:type="dxa" w:w="60"/>
+              <w:right w:type="dxa" w:w="100"/>
+            </w:tcMar>
+            <w:vAlign w:val="top"/>
+          </w:tcPr>
+          <w:p>
+            <w:pPr>
+              <w:spacing w:after="40" w:before="40"/>
+              <w:jc w:val="center"/>
+            </w:pPr>
+            <w:r>
+              <w:rPr>
+                <w:rFonts w:ascii="Times New Roman" w:cs="Times New Roman" w:eastAsia="Times New Roman" w:hAnsi="Times New Roman"/>
+                <w:sz w:val="22"/>
+                <w:szCs w:val="22"/>
+              </w:rPr>
+              <w:t xml:space="preserve">Фото 20</w:t>
+            </w:r>
+          </w:p>
+        </w:tc>
+        <w:tc>
+          <w:tcPr>
+            <w:tcW w:type="dxa" w:w="1800"/>
+            <w:tcBorders>
+              <w:top w:val="single" w:color="808080" w:sz="4"/>
+              <w:left w:val="single" w:color="808080" w:sz="4"/>
+              <w:bottom w:val="single" w:color="808080" w:sz="4"/>
+              <w:right w:val="single" w:color="808080" w:sz="4"/>
+            </w:tcBorders>
+            <w:tcMar>
+              <w:top w:type="dxa" w:w="60"/>
+              <w:left w:type="dxa" w:w="100"/>
+              <w:bottom w:type="dxa" w:w="60"/>
+              <w:right w:type="dxa" w:w="100"/>
+            </w:tcMar>
+            <w:vAlign w:val="top"/>
+          </w:tcPr>
+          <w:p>
+            <w:pPr>
+              <w:spacing w:after="40" w:before="40"/>
+            </w:pPr>
+            <w:r>
+              <w:rPr>
+                <w:rFonts w:ascii="Times New Roman" w:cs="Times New Roman" w:eastAsia="Times New Roman" w:hAnsi="Times New Roman"/>
+                <w:sz w:val="22"/>
+                <w:szCs w:val="22"/>
+              </w:rPr>
+              <w:t xml:space="preserve"/>
             </w:r>
           </w:p>
         </w:tc>
@@ -5028,7 +5041,7 @@
                 <w:sz w:val="22"/>
                 <w:szCs w:val="22"/>
               </w:rPr>
-              <w:t xml:space="preserve">5.1</w:t>
+              <w:t xml:space="preserve">5.2</w:t>
             </w:r>
           </w:p>
         </w:tc>
@@ -5059,7 +5072,7 @@
                 <w:sz w:val="22"/>
                 <w:szCs w:val="22"/>
               </w:rPr>
-              <w:t xml:space="preserve">Бронированные кабели закреплены не полностью (не закреплена броня кабелей).</w:t>
+              <w:t xml:space="preserve">Кабели в лотках не изолированы от окружающей среды — не обеспечено Ex-исполнение.</w:t>
             </w:r>
           </w:p>
         </w:tc>
@@ -5080,20 +5093,7 @@
             </w:tcMar>
             <w:vAlign w:val="top"/>
           </w:tcPr>
-          <w:p>
-            <w:pPr>
-              <w:spacing w:after="40" w:before="40"/>
-              <w:jc w:val="center"/>
-            </w:pPr>
-            <w:r>
-              <w:rPr>
-                <w:rFonts w:ascii="Times New Roman" w:cs="Times New Roman" w:eastAsia="Times New Roman" w:hAnsi="Times New Roman"/>
-                <w:sz w:val="22"/>
-                <w:szCs w:val="22"/>
-              </w:rPr>
-              <w:t xml:space="preserve">Фото 20</w:t>
-            </w:r>
-          </w:p>
+          <w:p/>
         </w:tc>
         <w:tc>
           <w:tcPr>
@@ -5159,7 +5159,7 @@
                 <w:sz w:val="22"/>
                 <w:szCs w:val="22"/>
               </w:rPr>
-              <w:t xml:space="preserve">5.2</w:t>
+              <w:t xml:space="preserve">5.3</w:t>
             </w:r>
           </w:p>
         </w:tc>
@@ -5190,7 +5190,7 @@
                 <w:sz w:val="22"/>
                 <w:szCs w:val="22"/>
               </w:rPr>
-              <w:t xml:space="preserve">Кабели в лотках не изолированы от окружающей среды — не обеспечено Ex-исполнение.</w:t>
+              <w:t xml:space="preserve">Отсутствует заземление корпуса.</w:t>
             </w:r>
           </w:p>
         </w:tc>
@@ -5277,7 +5277,7 @@
                 <w:sz w:val="22"/>
                 <w:szCs w:val="22"/>
               </w:rPr>
-              <w:t xml:space="preserve">5.3</w:t>
+              <w:t xml:space="preserve">5.4</w:t>
             </w:r>
           </w:p>
         </w:tc>
@@ -5308,7 +5308,7 @@
                 <w:sz w:val="22"/>
                 <w:szCs w:val="22"/>
               </w:rPr>
-              <w:t xml:space="preserve">Отсутствует заземление корпуса.</w:t>
+              <w:t xml:space="preserve">Перебит кабель датчика температуры — нарушена изоляция.</w:t>
             </w:r>
           </w:p>
         </w:tc>
@@ -5329,7 +5329,34 @@
             </w:tcMar>
             <w:vAlign w:val="top"/>
           </w:tcPr>
-          <w:p/>
+          <w:p>
+            <w:pPr>
+              <w:spacing w:after="40" w:before="40"/>
+              <w:jc w:val="center"/>
+            </w:pPr>
+            <w:r>
+              <w:rPr>
+                <w:rFonts w:ascii="Times New Roman" w:cs="Times New Roman" w:eastAsia="Times New Roman" w:hAnsi="Times New Roman"/>
+                <w:sz w:val="22"/>
+                <w:szCs w:val="22"/>
+              </w:rPr>
+              <w:t xml:space="preserve">Фото 21</w:t>
+            </w:r>
+          </w:p>
+          <w:p>
+            <w:pPr>
+              <w:spacing w:after="40" w:before="40"/>
+              <w:jc w:val="center"/>
+            </w:pPr>
+            <w:r>
+              <w:rPr>
+                <w:rFonts w:ascii="Times New Roman" w:cs="Times New Roman" w:eastAsia="Times New Roman" w:hAnsi="Times New Roman"/>
+                <w:sz w:val="22"/>
+                <w:szCs w:val="22"/>
+              </w:rPr>
+              <w:t xml:space="preserve">Фото 22</w:t>
+            </w:r>
+          </w:p>
         </w:tc>
         <w:tc>
           <w:tcPr>
@@ -5395,7 +5422,7 @@
                 <w:sz w:val="22"/>
                 <w:szCs w:val="22"/>
               </w:rPr>
-              <w:t xml:space="preserve">5.4</w:t>
+              <w:t xml:space="preserve">5.5</w:t>
             </w:r>
           </w:p>
         </w:tc>
@@ -5426,7 +5453,7 @@
                 <w:sz w:val="22"/>
                 <w:szCs w:val="22"/>
               </w:rPr>
-              <w:t xml:space="preserve">Перебит кабель датчика температуры — нарушена изоляция.</w:t>
+              <w:t xml:space="preserve">Не закреплены трубы кабельной разводки.</w:t>
             </w:r>
           </w:p>
         </w:tc>
@@ -5458,21 +5485,7 @@
                 <w:sz w:val="22"/>
                 <w:szCs w:val="22"/>
               </w:rPr>
-              <w:t xml:space="preserve">Фото 21</w:t>
-            </w:r>
-          </w:p>
-          <w:p>
-            <w:pPr>
-              <w:spacing w:after="40" w:before="40"/>
-              <w:jc w:val="center"/>
-            </w:pPr>
-            <w:r>
-              <w:rPr>
-                <w:rFonts w:ascii="Times New Roman" w:cs="Times New Roman" w:eastAsia="Times New Roman" w:hAnsi="Times New Roman"/>
-                <w:sz w:val="22"/>
-                <w:szCs w:val="22"/>
-              </w:rPr>
-              <w:t xml:space="preserve">Фото 22</w:t>
+              <w:t xml:space="preserve">Фото 23</w:t>
             </w:r>
           </w:p>
         </w:tc>
@@ -5540,7 +5553,7 @@
                 <w:sz w:val="22"/>
                 <w:szCs w:val="22"/>
               </w:rPr>
-              <w:t xml:space="preserve">5.5</w:t>
+              <w:t xml:space="preserve">5.6</w:t>
             </w:r>
           </w:p>
         </w:tc>
@@ -5571,7 +5584,7 @@
                 <w:sz w:val="22"/>
                 <w:szCs w:val="22"/>
               </w:rPr>
-              <w:t xml:space="preserve">Не закреплены трубы кабельной разводки.</w:t>
+              <w:t xml:space="preserve">Отсутствует маркировка на датчиках Пирани.</w:t>
             </w:r>
           </w:p>
         </w:tc>
@@ -5603,7 +5616,7 @@
                 <w:sz w:val="22"/>
                 <w:szCs w:val="22"/>
               </w:rPr>
-              <w:t xml:space="preserve">Фото 23</w:t>
+              <w:t xml:space="preserve">Фото 24</w:t>
             </w:r>
           </w:p>
         </w:tc>
@@ -5671,7 +5684,7 @@
                 <w:sz w:val="22"/>
                 <w:szCs w:val="22"/>
               </w:rPr>
-              <w:t xml:space="preserve">5.6</w:t>
+              <w:t xml:space="preserve">5.7</w:t>
             </w:r>
           </w:p>
         </w:tc>
@@ -5702,7 +5715,7 @@
                 <w:sz w:val="22"/>
                 <w:szCs w:val="22"/>
               </w:rPr>
-              <w:t xml:space="preserve">Отсутствует маркировка на датчиках Пирани.</w:t>
+              <w:t xml:space="preserve">Датчики превышения давления (4 бар) выполнить комбинированными.</w:t>
             </w:r>
           </w:p>
         </w:tc>
@@ -5723,20 +5736,7 @@
             </w:tcMar>
             <w:vAlign w:val="top"/>
           </w:tcPr>
-          <w:p>
-            <w:pPr>
-              <w:spacing w:after="40" w:before="40"/>
-              <w:jc w:val="center"/>
-            </w:pPr>
-            <w:r>
-              <w:rPr>
-                <w:rFonts w:ascii="Times New Roman" w:cs="Times New Roman" w:eastAsia="Times New Roman" w:hAnsi="Times New Roman"/>
-                <w:sz w:val="22"/>
-                <w:szCs w:val="22"/>
-              </w:rPr>
-              <w:t xml:space="preserve">Фото 24</w:t>
-            </w:r>
-          </w:p>
+          <w:p/>
         </w:tc>
         <w:tc>
           <w:tcPr>
@@ -5802,7 +5802,7 @@
                 <w:sz w:val="22"/>
                 <w:szCs w:val="22"/>
               </w:rPr>
-              <w:t xml:space="preserve">5.7</w:t>
+              <w:t xml:space="preserve">5.8</w:t>
             </w:r>
           </w:p>
         </w:tc>
@@ -5833,7 +5833,7 @@
                 <w:sz w:val="22"/>
                 <w:szCs w:val="22"/>
               </w:rPr>
-              <w:t xml:space="preserve">Датчики превышения давления (4 бар) выполнить комбинированными.</w:t>
+              <w:t xml:space="preserve">Установить частотный преобразователь на шестерённый насос и датчик уровня на выходе лёгкой фракции 1-й ступени.</w:t>
             </w:r>
           </w:p>
         </w:tc>
@@ -5894,114 +5894,37 @@
         </w:trPr>
         <w:tc>
           <w:tcPr>
-            <w:tcW w:type="dxa" w:w="700"/>
-            <w:tcBorders>
-              <w:top w:val="single" w:color="808080" w:sz="4"/>
-              <w:left w:val="single" w:color="808080" w:sz="4"/>
-              <w:bottom w:val="single" w:color="808080" w:sz="4"/>
-              <w:right w:val="single" w:color="808080" w:sz="4"/>
-            </w:tcBorders>
-            <w:tcMar>
-              <w:top w:type="dxa" w:w="60"/>
-              <w:left w:type="dxa" w:w="100"/>
-              <w:bottom w:type="dxa" w:w="60"/>
-              <w:right w:type="dxa" w:w="100"/>
-            </w:tcMar>
-            <w:vAlign w:val="top"/>
-          </w:tcPr>
-          <w:p>
-            <w:pPr>
-              <w:spacing w:after="40" w:before="40"/>
-              <w:jc w:val="center"/>
-            </w:pPr>
-            <w:r>
-              <w:rPr>
-                <w:rFonts w:ascii="Times New Roman" w:cs="Times New Roman" w:eastAsia="Times New Roman" w:hAnsi="Times New Roman"/>
-                <w:sz w:val="22"/>
-                <w:szCs w:val="22"/>
-              </w:rPr>
-              <w:t xml:space="preserve">5.8</w:t>
-            </w:r>
-          </w:p>
-        </w:tc>
-        <w:tc>
-          <w:tcPr>
-            <w:tcW w:type="dxa" w:w="6138"/>
-            <w:tcBorders>
-              <w:top w:val="single" w:color="808080" w:sz="4"/>
-              <w:left w:val="single" w:color="808080" w:sz="4"/>
-              <w:bottom w:val="single" w:color="808080" w:sz="4"/>
-              <w:right w:val="single" w:color="808080" w:sz="4"/>
-            </w:tcBorders>
-            <w:tcMar>
-              <w:top w:type="dxa" w:w="60"/>
-              <w:left w:type="dxa" w:w="100"/>
-              <w:bottom w:type="dxa" w:w="60"/>
-              <w:right w:type="dxa" w:w="100"/>
-            </w:tcMar>
-            <w:vAlign w:val="top"/>
-          </w:tcPr>
-          <w:p>
-            <w:pPr>
-              <w:spacing w:after="40" w:before="40"/>
-            </w:pPr>
-            <w:r>
-              <w:rPr>
-                <w:rFonts w:ascii="Times New Roman" w:cs="Times New Roman" w:eastAsia="Times New Roman" w:hAnsi="Times New Roman"/>
-                <w:sz w:val="22"/>
-                <w:szCs w:val="22"/>
-              </w:rPr>
-              <w:t xml:space="preserve">Установить частотный преобразователь на шестерённый насос и датчик уровня на выходе лёгкой фракции 1-й ступени.</w:t>
-            </w:r>
-          </w:p>
-        </w:tc>
-        <w:tc>
-          <w:tcPr>
-            <w:tcW w:type="dxa" w:w="1000"/>
-            <w:tcBorders>
-              <w:top w:val="single" w:color="808080" w:sz="4"/>
-              <w:left w:val="single" w:color="808080" w:sz="4"/>
-              <w:bottom w:val="single" w:color="808080" w:sz="4"/>
-              <w:right w:val="single" w:color="808080" w:sz="4"/>
-            </w:tcBorders>
-            <w:tcMar>
-              <w:top w:type="dxa" w:w="60"/>
-              <w:left w:type="dxa" w:w="100"/>
-              <w:bottom w:type="dxa" w:w="60"/>
-              <w:right w:type="dxa" w:w="100"/>
-            </w:tcMar>
-            <w:vAlign w:val="top"/>
-          </w:tcPr>
-          <w:p/>
-        </w:tc>
-        <w:tc>
-          <w:tcPr>
-            <w:tcW w:type="dxa" w:w="1800"/>
-            <w:tcBorders>
-              <w:top w:val="single" w:color="808080" w:sz="4"/>
-              <w:left w:val="single" w:color="808080" w:sz="4"/>
-              <w:bottom w:val="single" w:color="808080" w:sz="4"/>
-              <w:right w:val="single" w:color="808080" w:sz="4"/>
-            </w:tcBorders>
-            <w:tcMar>
-              <w:top w:type="dxa" w:w="60"/>
-              <w:left w:type="dxa" w:w="100"/>
-              <w:bottom w:type="dxa" w:w="60"/>
-              <w:right w:type="dxa" w:w="100"/>
-            </w:tcMar>
-            <w:vAlign w:val="top"/>
-          </w:tcPr>
-          <w:p>
-            <w:pPr>
-              <w:spacing w:after="40" w:before="40"/>
-            </w:pPr>
-            <w:r>
-              <w:rPr>
-                <w:rFonts w:ascii="Times New Roman" w:cs="Times New Roman" w:eastAsia="Times New Roman" w:hAnsi="Times New Roman"/>
-                <w:sz w:val="22"/>
-                <w:szCs w:val="22"/>
-              </w:rPr>
-              <w:t xml:space="preserve"/>
+            <w:tcW w:type="dxa" w:w="9638"/>
+            <w:gridSpan w:val="4"/>
+            <w:tcBorders>
+              <w:top w:val="single" w:color="808080" w:sz="4"/>
+              <w:left w:val="single" w:color="808080" w:sz="4"/>
+              <w:bottom w:val="single" w:color="808080" w:sz="4"/>
+              <w:right w:val="single" w:color="808080" w:sz="4"/>
+            </w:tcBorders>
+            <w:shd w:fill="F2F2F2" w:color="auto" w:val="clear"/>
+            <w:tcMar>
+              <w:top w:type="dxa" w:w="60"/>
+              <w:left w:type="dxa" w:w="100"/>
+              <w:bottom w:type="dxa" w:w="60"/>
+              <w:right w:type="dxa" w:w="100"/>
+            </w:tcMar>
+            <w:vAlign w:val="top"/>
+          </w:tcPr>
+          <w:p>
+            <w:pPr>
+              <w:keepNext/>
+              <w:spacing w:after="40" w:before="40"/>
+            </w:pPr>
+            <w:r>
+              <w:rPr>
+                <w:rFonts w:ascii="Times New Roman" w:cs="Times New Roman" w:eastAsia="Times New Roman" w:hAnsi="Times New Roman"/>
+                <w:b/>
+                <w:bCs/>
+                <w:sz w:val="22"/>
+                <w:szCs w:val="22"/>
+              </w:rPr>
+              <w:t xml:space="preserve">6. Программное обеспечение</w:t>
             </w:r>
           </w:p>
         </w:tc>
@@ -6012,37 +5935,114 @@
         </w:trPr>
         <w:tc>
           <w:tcPr>
-            <w:tcW w:type="dxa" w:w="9638"/>
-            <w:gridSpan w:val="4"/>
-            <w:tcBorders>
-              <w:top w:val="single" w:color="808080" w:sz="4"/>
-              <w:left w:val="single" w:color="808080" w:sz="4"/>
-              <w:bottom w:val="single" w:color="808080" w:sz="4"/>
-              <w:right w:val="single" w:color="808080" w:sz="4"/>
-            </w:tcBorders>
-            <w:shd w:fill="F2F2F2" w:color="auto" w:val="clear"/>
-            <w:tcMar>
-              <w:top w:type="dxa" w:w="60"/>
-              <w:left w:type="dxa" w:w="100"/>
-              <w:bottom w:type="dxa" w:w="60"/>
-              <w:right w:type="dxa" w:w="100"/>
-            </w:tcMar>
-            <w:vAlign w:val="top"/>
-          </w:tcPr>
-          <w:p>
-            <w:pPr>
-              <w:keepNext/>
-              <w:spacing w:after="40" w:before="40"/>
-            </w:pPr>
-            <w:r>
-              <w:rPr>
-                <w:rFonts w:ascii="Times New Roman" w:cs="Times New Roman" w:eastAsia="Times New Roman" w:hAnsi="Times New Roman"/>
-                <w:b/>
-                <w:bCs/>
-                <w:sz w:val="22"/>
-                <w:szCs w:val="22"/>
-              </w:rPr>
-              <w:t xml:space="preserve">6. Программное обеспечение</w:t>
+            <w:tcW w:type="dxa" w:w="700"/>
+            <w:tcBorders>
+              <w:top w:val="single" w:color="808080" w:sz="4"/>
+              <w:left w:val="single" w:color="808080" w:sz="4"/>
+              <w:bottom w:val="single" w:color="808080" w:sz="4"/>
+              <w:right w:val="single" w:color="808080" w:sz="4"/>
+            </w:tcBorders>
+            <w:tcMar>
+              <w:top w:type="dxa" w:w="60"/>
+              <w:left w:type="dxa" w:w="100"/>
+              <w:bottom w:type="dxa" w:w="60"/>
+              <w:right w:type="dxa" w:w="100"/>
+            </w:tcMar>
+            <w:vAlign w:val="top"/>
+          </w:tcPr>
+          <w:p>
+            <w:pPr>
+              <w:spacing w:after="40" w:before="40"/>
+              <w:jc w:val="center"/>
+            </w:pPr>
+            <w:r>
+              <w:rPr>
+                <w:rFonts w:ascii="Times New Roman" w:cs="Times New Roman" w:eastAsia="Times New Roman" w:hAnsi="Times New Roman"/>
+                <w:sz w:val="22"/>
+                <w:szCs w:val="22"/>
+              </w:rPr>
+              <w:t xml:space="preserve">6.1</w:t>
+            </w:r>
+          </w:p>
+        </w:tc>
+        <w:tc>
+          <w:tcPr>
+            <w:tcW w:type="dxa" w:w="6138"/>
+            <w:tcBorders>
+              <w:top w:val="single" w:color="808080" w:sz="4"/>
+              <w:left w:val="single" w:color="808080" w:sz="4"/>
+              <w:bottom w:val="single" w:color="808080" w:sz="4"/>
+              <w:right w:val="single" w:color="808080" w:sz="4"/>
+            </w:tcBorders>
+            <w:tcMar>
+              <w:top w:type="dxa" w:w="60"/>
+              <w:left w:type="dxa" w:w="100"/>
+              <w:bottom w:type="dxa" w:w="60"/>
+              <w:right w:type="dxa" w:w="100"/>
+            </w:tcMar>
+            <w:vAlign w:val="top"/>
+          </w:tcPr>
+          <w:p>
+            <w:pPr>
+              <w:spacing w:after="40" w:before="40"/>
+            </w:pPr>
+            <w:r>
+              <w:rPr>
+                <w:rFonts w:ascii="Times New Roman" w:cs="Times New Roman" w:eastAsia="Times New Roman" w:hAnsi="Times New Roman"/>
+                <w:sz w:val="22"/>
+                <w:szCs w:val="22"/>
+              </w:rPr>
+              <w:t xml:space="preserve">Отсутствует английская версия интерфейса.</w:t>
+            </w:r>
+          </w:p>
+        </w:tc>
+        <w:tc>
+          <w:tcPr>
+            <w:tcW w:type="dxa" w:w="1000"/>
+            <w:tcBorders>
+              <w:top w:val="single" w:color="808080" w:sz="4"/>
+              <w:left w:val="single" w:color="808080" w:sz="4"/>
+              <w:bottom w:val="single" w:color="808080" w:sz="4"/>
+              <w:right w:val="single" w:color="808080" w:sz="4"/>
+            </w:tcBorders>
+            <w:tcMar>
+              <w:top w:type="dxa" w:w="60"/>
+              <w:left w:type="dxa" w:w="100"/>
+              <w:bottom w:type="dxa" w:w="60"/>
+              <w:right w:type="dxa" w:w="100"/>
+            </w:tcMar>
+            <w:vAlign w:val="top"/>
+          </w:tcPr>
+          <w:p/>
+        </w:tc>
+        <w:tc>
+          <w:tcPr>
+            <w:tcW w:type="dxa" w:w="1800"/>
+            <w:tcBorders>
+              <w:top w:val="single" w:color="808080" w:sz="4"/>
+              <w:left w:val="single" w:color="808080" w:sz="4"/>
+              <w:bottom w:val="single" w:color="808080" w:sz="4"/>
+              <w:right w:val="single" w:color="808080" w:sz="4"/>
+            </w:tcBorders>
+            <w:tcMar>
+              <w:top w:type="dxa" w:w="60"/>
+              <w:left w:type="dxa" w:w="100"/>
+              <w:bottom w:type="dxa" w:w="60"/>
+              <w:right w:type="dxa" w:w="100"/>
+            </w:tcMar>
+            <w:vAlign w:val="top"/>
+          </w:tcPr>
+          <w:p>
+            <w:pPr>
+              <w:spacing w:after="40" w:before="40"/>
+            </w:pPr>
+            <w:r>
+              <w:rPr>
+                <w:rFonts w:ascii="Times New Roman" w:cs="Times New Roman" w:eastAsia="Times New Roman" w:hAnsi="Times New Roman"/>
+                <w:sz w:val="22"/>
+                <w:szCs w:val="22"/>
+              </w:rPr>
+              <w:t xml:space="preserve"/>
             </w:r>
           </w:p>
         </w:tc>
@@ -6079,7 +6079,7 @@
                 <w:sz w:val="22"/>
                 <w:szCs w:val="22"/>
               </w:rPr>
-              <w:t xml:space="preserve">6.1</w:t>
+              <w:t xml:space="preserve">6.2</w:t>
             </w:r>
           </w:p>
         </w:tc>
@@ -6110,7 +6110,7 @@
                 <w:sz w:val="22"/>
                 <w:szCs w:val="22"/>
               </w:rPr>
-              <w:t xml:space="preserve">Отсутствует английская версия интерфейса.</w:t>
+              <w:t xml:space="preserve">Отключить переход панели оператора в спящий режим.</w:t>
             </w:r>
           </w:p>
         </w:tc>
@@ -6197,7 +6197,7 @@
                 <w:sz w:val="22"/>
                 <w:szCs w:val="22"/>
               </w:rPr>
-              <w:t xml:space="preserve">6.2</w:t>
+              <w:t xml:space="preserve">6.3</w:t>
             </w:r>
           </w:p>
         </w:tc>
@@ -6228,7 +6228,7 @@
                 <w:sz w:val="22"/>
                 <w:szCs w:val="22"/>
               </w:rPr>
-              <w:t xml:space="preserve">Отключить переход панели оператора в спящий режим.</w:t>
+              <w:t xml:space="preserve">На панели оператора не обнаружена функция калибровки датчиков — проверить наличие.</w:t>
             </w:r>
           </w:p>
         </w:tc>
@@ -6289,114 +6289,37 @@
         </w:trPr>
         <w:tc>
           <w:tcPr>
-            <w:tcW w:type="dxa" w:w="700"/>
-            <w:tcBorders>
-              <w:top w:val="single" w:color="808080" w:sz="4"/>
-              <w:left w:val="single" w:color="808080" w:sz="4"/>
-              <w:bottom w:val="single" w:color="808080" w:sz="4"/>
-              <w:right w:val="single" w:color="808080" w:sz="4"/>
-            </w:tcBorders>
-            <w:tcMar>
-              <w:top w:type="dxa" w:w="60"/>
-              <w:left w:type="dxa" w:w="100"/>
-              <w:bottom w:type="dxa" w:w="60"/>
-              <w:right w:type="dxa" w:w="100"/>
-            </w:tcMar>
-            <w:vAlign w:val="top"/>
-          </w:tcPr>
-          <w:p>
-            <w:pPr>
-              <w:spacing w:after="40" w:before="40"/>
-              <w:jc w:val="center"/>
-            </w:pPr>
-            <w:r>
-              <w:rPr>
-                <w:rFonts w:ascii="Times New Roman" w:cs="Times New Roman" w:eastAsia="Times New Roman" w:hAnsi="Times New Roman"/>
-                <w:sz w:val="22"/>
-                <w:szCs w:val="22"/>
-              </w:rPr>
-              <w:t xml:space="preserve">6.3</w:t>
-            </w:r>
-          </w:p>
-        </w:tc>
-        <w:tc>
-          <w:tcPr>
-            <w:tcW w:type="dxa" w:w="6138"/>
-            <w:tcBorders>
-              <w:top w:val="single" w:color="808080" w:sz="4"/>
-              <w:left w:val="single" w:color="808080" w:sz="4"/>
-              <w:bottom w:val="single" w:color="808080" w:sz="4"/>
-              <w:right w:val="single" w:color="808080" w:sz="4"/>
-            </w:tcBorders>
-            <w:tcMar>
-              <w:top w:type="dxa" w:w="60"/>
-              <w:left w:type="dxa" w:w="100"/>
-              <w:bottom w:type="dxa" w:w="60"/>
-              <w:right w:type="dxa" w:w="100"/>
-            </w:tcMar>
-            <w:vAlign w:val="top"/>
-          </w:tcPr>
-          <w:p>
-            <w:pPr>
-              <w:spacing w:after="40" w:before="40"/>
-            </w:pPr>
-            <w:r>
-              <w:rPr>
-                <w:rFonts w:ascii="Times New Roman" w:cs="Times New Roman" w:eastAsia="Times New Roman" w:hAnsi="Times New Roman"/>
-                <w:sz w:val="22"/>
-                <w:szCs w:val="22"/>
-              </w:rPr>
-              <w:t xml:space="preserve">На панели оператора не обнаружена функция калибровки датчиков — проверить наличие.</w:t>
-            </w:r>
-          </w:p>
-        </w:tc>
-        <w:tc>
-          <w:tcPr>
-            <w:tcW w:type="dxa" w:w="1000"/>
-            <w:tcBorders>
-              <w:top w:val="single" w:color="808080" w:sz="4"/>
-              <w:left w:val="single" w:color="808080" w:sz="4"/>
-              <w:bottom w:val="single" w:color="808080" w:sz="4"/>
-              <w:right w:val="single" w:color="808080" w:sz="4"/>
-            </w:tcBorders>
-            <w:tcMar>
-              <w:top w:type="dxa" w:w="60"/>
-              <w:left w:type="dxa" w:w="100"/>
-              <w:bottom w:type="dxa" w:w="60"/>
-              <w:right w:type="dxa" w:w="100"/>
-            </w:tcMar>
-            <w:vAlign w:val="top"/>
-          </w:tcPr>
-          <w:p/>
-        </w:tc>
-        <w:tc>
-          <w:tcPr>
-            <w:tcW w:type="dxa" w:w="1800"/>
-            <w:tcBorders>
-              <w:top w:val="single" w:color="808080" w:sz="4"/>
-              <w:left w:val="single" w:color="808080" w:sz="4"/>
-              <w:bottom w:val="single" w:color="808080" w:sz="4"/>
-              <w:right w:val="single" w:color="808080" w:sz="4"/>
-            </w:tcBorders>
-            <w:tcMar>
-              <w:top w:type="dxa" w:w="60"/>
-              <w:left w:type="dxa" w:w="100"/>
-              <w:bottom w:type="dxa" w:w="60"/>
-              <w:right w:type="dxa" w:w="100"/>
-            </w:tcMar>
-            <w:vAlign w:val="top"/>
-          </w:tcPr>
-          <w:p>
-            <w:pPr>
-              <w:spacing w:after="40" w:before="40"/>
-            </w:pPr>
-            <w:r>
-              <w:rPr>
-                <w:rFonts w:ascii="Times New Roman" w:cs="Times New Roman" w:eastAsia="Times New Roman" w:hAnsi="Times New Roman"/>
-                <w:sz w:val="22"/>
-                <w:szCs w:val="22"/>
-              </w:rPr>
-              <w:t xml:space="preserve"/>
+            <w:tcW w:type="dxa" w:w="9638"/>
+            <w:gridSpan w:val="4"/>
+            <w:tcBorders>
+              <w:top w:val="single" w:color="808080" w:sz="4"/>
+              <w:left w:val="single" w:color="808080" w:sz="4"/>
+              <w:bottom w:val="single" w:color="808080" w:sz="4"/>
+              <w:right w:val="single" w:color="808080" w:sz="4"/>
+            </w:tcBorders>
+            <w:shd w:fill="F2F2F2" w:color="auto" w:val="clear"/>
+            <w:tcMar>
+              <w:top w:type="dxa" w:w="60"/>
+              <w:left w:type="dxa" w:w="100"/>
+              <w:bottom w:type="dxa" w:w="60"/>
+              <w:right w:type="dxa" w:w="100"/>
+            </w:tcMar>
+            <w:vAlign w:val="top"/>
+          </w:tcPr>
+          <w:p>
+            <w:pPr>
+              <w:keepNext/>
+              <w:spacing w:after="40" w:before="40"/>
+            </w:pPr>
+            <w:r>
+              <w:rPr>
+                <w:rFonts w:ascii="Times New Roman" w:cs="Times New Roman" w:eastAsia="Times New Roman" w:hAnsi="Times New Roman"/>
+                <w:b/>
+                <w:bCs/>
+                <w:sz w:val="22"/>
+                <w:szCs w:val="22"/>
+              </w:rPr>
+              <w:t xml:space="preserve">7. Испытания</w:t>
             </w:r>
           </w:p>
         </w:tc>
@@ -6407,37 +6330,114 @@
         </w:trPr>
         <w:tc>
           <w:tcPr>
-            <w:tcW w:type="dxa" w:w="9638"/>
-            <w:gridSpan w:val="4"/>
-            <w:tcBorders>
-              <w:top w:val="single" w:color="808080" w:sz="4"/>
-              <w:left w:val="single" w:color="808080" w:sz="4"/>
-              <w:bottom w:val="single" w:color="808080" w:sz="4"/>
-              <w:right w:val="single" w:color="808080" w:sz="4"/>
-            </w:tcBorders>
-            <w:shd w:fill="F2F2F2" w:color="auto" w:val="clear"/>
-            <w:tcMar>
-              <w:top w:type="dxa" w:w="60"/>
-              <w:left w:type="dxa" w:w="100"/>
-              <w:bottom w:type="dxa" w:w="60"/>
-              <w:right w:type="dxa" w:w="100"/>
-            </w:tcMar>
-            <w:vAlign w:val="top"/>
-          </w:tcPr>
-          <w:p>
-            <w:pPr>
-              <w:keepNext/>
-              <w:spacing w:after="40" w:before="40"/>
-            </w:pPr>
-            <w:r>
-              <w:rPr>
-                <w:rFonts w:ascii="Times New Roman" w:cs="Times New Roman" w:eastAsia="Times New Roman" w:hAnsi="Times New Roman"/>
-                <w:b/>
-                <w:bCs/>
-                <w:sz w:val="22"/>
-                <w:szCs w:val="22"/>
-              </w:rPr>
-              <w:t xml:space="preserve">7. Испытания</w:t>
+            <w:tcW w:type="dxa" w:w="700"/>
+            <w:tcBorders>
+              <w:top w:val="single" w:color="808080" w:sz="4"/>
+              <w:left w:val="single" w:color="808080" w:sz="4"/>
+              <w:bottom w:val="single" w:color="808080" w:sz="4"/>
+              <w:right w:val="single" w:color="808080" w:sz="4"/>
+            </w:tcBorders>
+            <w:tcMar>
+              <w:top w:type="dxa" w:w="60"/>
+              <w:left w:type="dxa" w:w="100"/>
+              <w:bottom w:type="dxa" w:w="60"/>
+              <w:right w:type="dxa" w:w="100"/>
+            </w:tcMar>
+            <w:vAlign w:val="top"/>
+          </w:tcPr>
+          <w:p>
+            <w:pPr>
+              <w:spacing w:after="40" w:before="40"/>
+              <w:jc w:val="center"/>
+            </w:pPr>
+            <w:r>
+              <w:rPr>
+                <w:rFonts w:ascii="Times New Roman" w:cs="Times New Roman" w:eastAsia="Times New Roman" w:hAnsi="Times New Roman"/>
+                <w:sz w:val="22"/>
+                <w:szCs w:val="22"/>
+              </w:rPr>
+              <w:t xml:space="preserve">7.1</w:t>
+            </w:r>
+          </w:p>
+        </w:tc>
+        <w:tc>
+          <w:tcPr>
+            <w:tcW w:type="dxa" w:w="6138"/>
+            <w:tcBorders>
+              <w:top w:val="single" w:color="808080" w:sz="4"/>
+              <w:left w:val="single" w:color="808080" w:sz="4"/>
+              <w:bottom w:val="single" w:color="808080" w:sz="4"/>
+              <w:right w:val="single" w:color="808080" w:sz="4"/>
+            </w:tcBorders>
+            <w:tcMar>
+              <w:top w:type="dxa" w:w="60"/>
+              <w:left w:type="dxa" w:w="100"/>
+              <w:bottom w:type="dxa" w:w="60"/>
+              <w:right w:type="dxa" w:w="100"/>
+            </w:tcMar>
+            <w:vAlign w:val="top"/>
+          </w:tcPr>
+          <w:p>
+            <w:pPr>
+              <w:spacing w:after="40" w:before="40"/>
+            </w:pPr>
+            <w:r>
+              <w:rPr>
+                <w:rFonts w:ascii="Times New Roman" w:cs="Times New Roman" w:eastAsia="Times New Roman" w:hAnsi="Times New Roman"/>
+                <w:sz w:val="22"/>
+                <w:szCs w:val="22"/>
+              </w:rPr>
+              <w:t xml:space="preserve">Провести вакуумный тест первой ступени при вращающемся роторе (уточнить).</w:t>
+            </w:r>
+          </w:p>
+        </w:tc>
+        <w:tc>
+          <w:tcPr>
+            <w:tcW w:type="dxa" w:w="1000"/>
+            <w:tcBorders>
+              <w:top w:val="single" w:color="808080" w:sz="4"/>
+              <w:left w:val="single" w:color="808080" w:sz="4"/>
+              <w:bottom w:val="single" w:color="808080" w:sz="4"/>
+              <w:right w:val="single" w:color="808080" w:sz="4"/>
+            </w:tcBorders>
+            <w:tcMar>
+              <w:top w:type="dxa" w:w="60"/>
+              <w:left w:type="dxa" w:w="100"/>
+              <w:bottom w:type="dxa" w:w="60"/>
+              <w:right w:type="dxa" w:w="100"/>
+            </w:tcMar>
+            <w:vAlign w:val="top"/>
+          </w:tcPr>
+          <w:p/>
+        </w:tc>
+        <w:tc>
+          <w:tcPr>
+            <w:tcW w:type="dxa" w:w="1800"/>
+            <w:tcBorders>
+              <w:top w:val="single" w:color="808080" w:sz="4"/>
+              <w:left w:val="single" w:color="808080" w:sz="4"/>
+              <w:bottom w:val="single" w:color="808080" w:sz="4"/>
+              <w:right w:val="single" w:color="808080" w:sz="4"/>
+            </w:tcBorders>
+            <w:tcMar>
+              <w:top w:type="dxa" w:w="60"/>
+              <w:left w:type="dxa" w:w="100"/>
+              <w:bottom w:type="dxa" w:w="60"/>
+              <w:right w:type="dxa" w:w="100"/>
+            </w:tcMar>
+            <w:vAlign w:val="top"/>
+          </w:tcPr>
+          <w:p>
+            <w:pPr>
+              <w:spacing w:after="40" w:before="40"/>
+            </w:pPr>
+            <w:r>
+              <w:rPr>
+                <w:rFonts w:ascii="Times New Roman" w:cs="Times New Roman" w:eastAsia="Times New Roman" w:hAnsi="Times New Roman"/>
+                <w:sz w:val="22"/>
+                <w:szCs w:val="22"/>
+              </w:rPr>
+              <w:t xml:space="preserve"/>
             </w:r>
           </w:p>
         </w:tc>
@@ -6474,7 +6474,7 @@
                 <w:sz w:val="22"/>
                 <w:szCs w:val="22"/>
               </w:rPr>
-              <w:t xml:space="preserve">7.1</w:t>
+              <w:t xml:space="preserve">7.2</w:t>
             </w:r>
           </w:p>
         </w:tc>
@@ -6505,7 +6505,7 @@
                 <w:sz w:val="22"/>
                 <w:szCs w:val="22"/>
               </w:rPr>
-              <w:t xml:space="preserve">Провести вакуумный тест первой ступени при вращающемся роторе (уточнить).</w:t>
+              <w:t xml:space="preserve">Провести вакуумный тест второй ступени при вращающемся роторе (уточнить).</w:t>
             </w:r>
           </w:p>
         </w:tc>
@@ -6566,114 +6566,37 @@
         </w:trPr>
         <w:tc>
           <w:tcPr>
-            <w:tcW w:type="dxa" w:w="700"/>
-            <w:tcBorders>
-              <w:top w:val="single" w:color="808080" w:sz="4"/>
-              <w:left w:val="single" w:color="808080" w:sz="4"/>
-              <w:bottom w:val="single" w:color="808080" w:sz="4"/>
-              <w:right w:val="single" w:color="808080" w:sz="4"/>
-            </w:tcBorders>
-            <w:tcMar>
-              <w:top w:type="dxa" w:w="60"/>
-              <w:left w:type="dxa" w:w="100"/>
-              <w:bottom w:type="dxa" w:w="60"/>
-              <w:right w:type="dxa" w:w="100"/>
-            </w:tcMar>
-            <w:vAlign w:val="top"/>
-          </w:tcPr>
-          <w:p>
-            <w:pPr>
-              <w:spacing w:after="40" w:before="40"/>
-              <w:jc w:val="center"/>
-            </w:pPr>
-            <w:r>
-              <w:rPr>
-                <w:rFonts w:ascii="Times New Roman" w:cs="Times New Roman" w:eastAsia="Times New Roman" w:hAnsi="Times New Roman"/>
-                <w:sz w:val="22"/>
-                <w:szCs w:val="22"/>
-              </w:rPr>
-              <w:t xml:space="preserve">7.2</w:t>
-            </w:r>
-          </w:p>
-        </w:tc>
-        <w:tc>
-          <w:tcPr>
-            <w:tcW w:type="dxa" w:w="6138"/>
-            <w:tcBorders>
-              <w:top w:val="single" w:color="808080" w:sz="4"/>
-              <w:left w:val="single" w:color="808080" w:sz="4"/>
-              <w:bottom w:val="single" w:color="808080" w:sz="4"/>
-              <w:right w:val="single" w:color="808080" w:sz="4"/>
-            </w:tcBorders>
-            <w:tcMar>
-              <w:top w:type="dxa" w:w="60"/>
-              <w:left w:type="dxa" w:w="100"/>
-              <w:bottom w:type="dxa" w:w="60"/>
-              <w:right w:type="dxa" w:w="100"/>
-            </w:tcMar>
-            <w:vAlign w:val="top"/>
-          </w:tcPr>
-          <w:p>
-            <w:pPr>
-              <w:spacing w:after="40" w:before="40"/>
-            </w:pPr>
-            <w:r>
-              <w:rPr>
-                <w:rFonts w:ascii="Times New Roman" w:cs="Times New Roman" w:eastAsia="Times New Roman" w:hAnsi="Times New Roman"/>
-                <w:sz w:val="22"/>
-                <w:szCs w:val="22"/>
-              </w:rPr>
-              <w:t xml:space="preserve">Провести вакуумный тест второй ступени при вращающемся роторе (уточнить).</w:t>
-            </w:r>
-          </w:p>
-        </w:tc>
-        <w:tc>
-          <w:tcPr>
-            <w:tcW w:type="dxa" w:w="1000"/>
-            <w:tcBorders>
-              <w:top w:val="single" w:color="808080" w:sz="4"/>
-              <w:left w:val="single" w:color="808080" w:sz="4"/>
-              <w:bottom w:val="single" w:color="808080" w:sz="4"/>
-              <w:right w:val="single" w:color="808080" w:sz="4"/>
-            </w:tcBorders>
-            <w:tcMar>
-              <w:top w:type="dxa" w:w="60"/>
-              <w:left w:type="dxa" w:w="100"/>
-              <w:bottom w:type="dxa" w:w="60"/>
-              <w:right w:type="dxa" w:w="100"/>
-            </w:tcMar>
-            <w:vAlign w:val="top"/>
-          </w:tcPr>
-          <w:p/>
-        </w:tc>
-        <w:tc>
-          <w:tcPr>
-            <w:tcW w:type="dxa" w:w="1800"/>
-            <w:tcBorders>
-              <w:top w:val="single" w:color="808080" w:sz="4"/>
-              <w:left w:val="single" w:color="808080" w:sz="4"/>
-              <w:bottom w:val="single" w:color="808080" w:sz="4"/>
-              <w:right w:val="single" w:color="808080" w:sz="4"/>
-            </w:tcBorders>
-            <w:tcMar>
-              <w:top w:type="dxa" w:w="60"/>
-              <w:left w:type="dxa" w:w="100"/>
-              <w:bottom w:type="dxa" w:w="60"/>
-              <w:right w:type="dxa" w:w="100"/>
-            </w:tcMar>
-            <w:vAlign w:val="top"/>
-          </w:tcPr>
-          <w:p>
-            <w:pPr>
-              <w:spacing w:after="40" w:before="40"/>
-            </w:pPr>
-            <w:r>
-              <w:rPr>
-                <w:rFonts w:ascii="Times New Roman" w:cs="Times New Roman" w:eastAsia="Times New Roman" w:hAnsi="Times New Roman"/>
-                <w:sz w:val="22"/>
-                <w:szCs w:val="22"/>
-              </w:rPr>
-              <w:t xml:space="preserve"/>
+            <w:tcW w:type="dxa" w:w="9638"/>
+            <w:gridSpan w:val="4"/>
+            <w:tcBorders>
+              <w:top w:val="single" w:color="808080" w:sz="4"/>
+              <w:left w:val="single" w:color="808080" w:sz="4"/>
+              <w:bottom w:val="single" w:color="808080" w:sz="4"/>
+              <w:right w:val="single" w:color="808080" w:sz="4"/>
+            </w:tcBorders>
+            <w:shd w:fill="F2F2F2" w:color="auto" w:val="clear"/>
+            <w:tcMar>
+              <w:top w:type="dxa" w:w="60"/>
+              <w:left w:type="dxa" w:w="100"/>
+              <w:bottom w:type="dxa" w:w="60"/>
+              <w:right w:type="dxa" w:w="100"/>
+            </w:tcMar>
+            <w:vAlign w:val="top"/>
+          </w:tcPr>
+          <w:p>
+            <w:pPr>
+              <w:keepNext/>
+              <w:spacing w:after="40" w:before="40"/>
+            </w:pPr>
+            <w:r>
+              <w:rPr>
+                <w:rFonts w:ascii="Times New Roman" w:cs="Times New Roman" w:eastAsia="Times New Roman" w:hAnsi="Times New Roman"/>
+                <w:b/>
+                <w:bCs/>
+                <w:sz w:val="22"/>
+                <w:szCs w:val="22"/>
+              </w:rPr>
+              <w:t xml:space="preserve">8. Недостающая документация по программе FAT (документы раздела 1 программы, не вошедшие в предъявленный комплект)</w:t>
             </w:r>
           </w:p>
         </w:tc>
@@ -6684,37 +6607,114 @@
         </w:trPr>
         <w:tc>
           <w:tcPr>
-            <w:tcW w:type="dxa" w:w="9638"/>
-            <w:gridSpan w:val="4"/>
-            <w:tcBorders>
-              <w:top w:val="single" w:color="808080" w:sz="4"/>
-              <w:left w:val="single" w:color="808080" w:sz="4"/>
-              <w:bottom w:val="single" w:color="808080" w:sz="4"/>
-              <w:right w:val="single" w:color="808080" w:sz="4"/>
-            </w:tcBorders>
-            <w:shd w:fill="F2F2F2" w:color="auto" w:val="clear"/>
-            <w:tcMar>
-              <w:top w:type="dxa" w:w="60"/>
-              <w:left w:type="dxa" w:w="100"/>
-              <w:bottom w:type="dxa" w:w="60"/>
-              <w:right w:type="dxa" w:w="100"/>
-            </w:tcMar>
-            <w:vAlign w:val="top"/>
-          </w:tcPr>
-          <w:p>
-            <w:pPr>
-              <w:keepNext/>
-              <w:spacing w:after="40" w:before="40"/>
-            </w:pPr>
-            <w:r>
-              <w:rPr>
-                <w:rFonts w:ascii="Times New Roman" w:cs="Times New Roman" w:eastAsia="Times New Roman" w:hAnsi="Times New Roman"/>
-                <w:b/>
-                <w:bCs/>
-                <w:sz w:val="22"/>
-                <w:szCs w:val="22"/>
-              </w:rPr>
-              <w:t xml:space="preserve">8. Недостающая документация по программе FAT (документы раздела 1 программы, не вошедшие в предъявленный комплект)</w:t>
+            <w:tcW w:type="dxa" w:w="700"/>
+            <w:tcBorders>
+              <w:top w:val="single" w:color="808080" w:sz="4"/>
+              <w:left w:val="single" w:color="808080" w:sz="4"/>
+              <w:bottom w:val="single" w:color="808080" w:sz="4"/>
+              <w:right w:val="single" w:color="808080" w:sz="4"/>
+            </w:tcBorders>
+            <w:tcMar>
+              <w:top w:type="dxa" w:w="60"/>
+              <w:left w:type="dxa" w:w="100"/>
+              <w:bottom w:type="dxa" w:w="60"/>
+              <w:right w:type="dxa" w:w="100"/>
+            </w:tcMar>
+            <w:vAlign w:val="top"/>
+          </w:tcPr>
+          <w:p>
+            <w:pPr>
+              <w:spacing w:after="40" w:before="40"/>
+              <w:jc w:val="center"/>
+            </w:pPr>
+            <w:r>
+              <w:rPr>
+                <w:rFonts w:ascii="Times New Roman" w:cs="Times New Roman" w:eastAsia="Times New Roman" w:hAnsi="Times New Roman"/>
+                <w:sz w:val="22"/>
+                <w:szCs w:val="22"/>
+              </w:rPr>
+              <w:t xml:space="preserve">8.1</w:t>
+            </w:r>
+          </w:p>
+        </w:tc>
+        <w:tc>
+          <w:tcPr>
+            <w:tcW w:type="dxa" w:w="6138"/>
+            <w:tcBorders>
+              <w:top w:val="single" w:color="808080" w:sz="4"/>
+              <w:left w:val="single" w:color="808080" w:sz="4"/>
+              <w:bottom w:val="single" w:color="808080" w:sz="4"/>
+              <w:right w:val="single" w:color="808080" w:sz="4"/>
+            </w:tcBorders>
+            <w:tcMar>
+              <w:top w:type="dxa" w:w="60"/>
+              <w:left w:type="dxa" w:w="100"/>
+              <w:bottom w:type="dxa" w:w="60"/>
+              <w:right w:type="dxa" w:w="100"/>
+            </w:tcMar>
+            <w:vAlign w:val="top"/>
+          </w:tcPr>
+          <w:p>
+            <w:pPr>
+              <w:spacing w:after="40" w:before="40"/>
+            </w:pPr>
+            <w:r>
+              <w:rPr>
+                <w:rFonts w:ascii="Times New Roman" w:cs="Times New Roman" w:eastAsia="Times New Roman" w:hAnsi="Times New Roman"/>
+                <w:sz w:val="22"/>
+                <w:szCs w:val="22"/>
+              </w:rPr>
+              <w:t xml:space="preserve">Чертёж байпасных трубных вставок вместо E-101 и E-201 (п. 1 программы FAT)</w:t>
+            </w:r>
+          </w:p>
+        </w:tc>
+        <w:tc>
+          <w:tcPr>
+            <w:tcW w:type="dxa" w:w="1000"/>
+            <w:tcBorders>
+              <w:top w:val="single" w:color="808080" w:sz="4"/>
+              <w:left w:val="single" w:color="808080" w:sz="4"/>
+              <w:bottom w:val="single" w:color="808080" w:sz="4"/>
+              <w:right w:val="single" w:color="808080" w:sz="4"/>
+            </w:tcBorders>
+            <w:tcMar>
+              <w:top w:type="dxa" w:w="60"/>
+              <w:left w:type="dxa" w:w="100"/>
+              <w:bottom w:type="dxa" w:w="60"/>
+              <w:right w:type="dxa" w:w="100"/>
+            </w:tcMar>
+            <w:vAlign w:val="top"/>
+          </w:tcPr>
+          <w:p/>
+        </w:tc>
+        <w:tc>
+          <w:tcPr>
+            <w:tcW w:type="dxa" w:w="1800"/>
+            <w:tcBorders>
+              <w:top w:val="single" w:color="808080" w:sz="4"/>
+              <w:left w:val="single" w:color="808080" w:sz="4"/>
+              <w:bottom w:val="single" w:color="808080" w:sz="4"/>
+              <w:right w:val="single" w:color="808080" w:sz="4"/>
+            </w:tcBorders>
+            <w:tcMar>
+              <w:top w:type="dxa" w:w="60"/>
+              <w:left w:type="dxa" w:w="100"/>
+              <w:bottom w:type="dxa" w:w="60"/>
+              <w:right w:type="dxa" w:w="100"/>
+            </w:tcMar>
+            <w:vAlign w:val="top"/>
+          </w:tcPr>
+          <w:p>
+            <w:pPr>
+              <w:spacing w:after="40" w:before="40"/>
+            </w:pPr>
+            <w:r>
+              <w:rPr>
+                <w:rFonts w:ascii="Times New Roman" w:cs="Times New Roman" w:eastAsia="Times New Roman" w:hAnsi="Times New Roman"/>
+                <w:sz w:val="22"/>
+                <w:szCs w:val="22"/>
+              </w:rPr>
+              <w:t xml:space="preserve"/>
             </w:r>
           </w:p>
         </w:tc>
@@ -6751,7 +6751,7 @@
                 <w:sz w:val="22"/>
                 <w:szCs w:val="22"/>
               </w:rPr>
-              <w:t xml:space="preserve">8.1</w:t>
+              <w:t xml:space="preserve">8.2</w:t>
             </w:r>
           </w:p>
         </w:tc>
@@ -6782,7 +6782,7 @@
                 <w:sz w:val="22"/>
                 <w:szCs w:val="22"/>
               </w:rPr>
-              <w:t xml:space="preserve">Чертёж байпасных трубных вставок вместо E-101 и E-201 (п. 1 программы FAT)</w:t>
+              <w:t xml:space="preserve">Упаковочный лист и перечень ЗИП (п. 2 программы FAT)</w:t>
             </w:r>
           </w:p>
         </w:tc>
@@ -6869,7 +6869,7 @@
                 <w:sz w:val="22"/>
                 <w:szCs w:val="22"/>
               </w:rPr>
-              <w:t xml:space="preserve">8.2</w:t>
+              <w:t xml:space="preserve">8.3</w:t>
             </w:r>
           </w:p>
         </w:tc>
@@ -6900,7 +6900,7 @@
                 <w:sz w:val="22"/>
                 <w:szCs w:val="22"/>
               </w:rPr>
-              <w:t xml:space="preserve">Упаковочный лист и перечень ЗИП (п. 2 программы FAT)</w:t>
+              <w:t xml:space="preserve">Чертёж и спецификация ротора и скребковой системы E-102 и E-202, сертификат на материал скребков (п. 3 программы FAT)</w:t>
             </w:r>
           </w:p>
         </w:tc>
@@ -6987,7 +6987,7 @@
                 <w:sz w:val="22"/>
                 <w:szCs w:val="22"/>
               </w:rPr>
-              <w:t xml:space="preserve">8.3</w:t>
+              <w:t xml:space="preserve">8.4</w:t>
             </w:r>
           </w:p>
         </w:tc>
@@ -7018,7 +7018,91 @@
                 <w:sz w:val="22"/>
                 <w:szCs w:val="22"/>
               </w:rPr>
-              <w:t xml:space="preserve">Чертёж и спецификация ротора и скребковой системы E-102 и E-202, сертификат на материал скребков (п. 3 программы FAT)</w:t>
+              <w:t xml:space="preserve">Паспорта аппаратов (п. 4 программы FAT):</w:t>
+            </w:r>
+          </w:p>
+          <w:p>
+            <w:pPr>
+              <w:spacing w:after="20" w:before="20"/>
+              <w:ind w:left="284"/>
+            </w:pPr>
+            <w:r>
+              <w:rPr>
+                <w:rFonts w:ascii="Times New Roman" w:cs="Times New Roman" w:eastAsia="Times New Roman" w:hAnsi="Times New Roman"/>
+                <w:sz w:val="22"/>
+                <w:szCs w:val="22"/>
+              </w:rPr>
+              <w:t xml:space="preserve">– E-101 — подогреватель 3 м² (1-я ступень);</w:t>
+            </w:r>
+          </w:p>
+          <w:p>
+            <w:pPr>
+              <w:spacing w:after="20" w:before="20"/>
+              <w:ind w:left="284"/>
+            </w:pPr>
+            <w:r>
+              <w:rPr>
+                <w:rFonts w:ascii="Times New Roman" w:cs="Times New Roman" w:eastAsia="Times New Roman" w:hAnsi="Times New Roman"/>
+                <w:sz w:val="22"/>
+                <w:szCs w:val="22"/>
+              </w:rPr>
+              <w:t xml:space="preserve">– V-103 — сборник лёгкой фазы 50 л;</w:t>
+            </w:r>
+          </w:p>
+          <w:p>
+            <w:pPr>
+              <w:spacing w:after="20" w:before="20"/>
+              <w:ind w:left="284"/>
+            </w:pPr>
+            <w:r>
+              <w:rPr>
+                <w:rFonts w:ascii="Times New Roman" w:cs="Times New Roman" w:eastAsia="Times New Roman" w:hAnsi="Times New Roman"/>
+                <w:sz w:val="22"/>
+                <w:szCs w:val="22"/>
+              </w:rPr>
+              <w:t xml:space="preserve">– V-203 — сборник конденсата ловушек 20 л;</w:t>
+            </w:r>
+          </w:p>
+          <w:p>
+            <w:pPr>
+              <w:spacing w:after="20" w:before="20"/>
+              <w:ind w:left="284"/>
+            </w:pPr>
+            <w:r>
+              <w:rPr>
+                <w:rFonts w:ascii="Times New Roman" w:cs="Times New Roman" w:eastAsia="Times New Roman" w:hAnsi="Times New Roman"/>
+                <w:sz w:val="22"/>
+                <w:szCs w:val="22"/>
+              </w:rPr>
+              <w:t xml:space="preserve">– E-102 — тонкоплёночный испаритель GXZ-2;</w:t>
+            </w:r>
+          </w:p>
+          <w:p>
+            <w:pPr>
+              <w:spacing w:after="20" w:before="20"/>
+              <w:ind w:left="284"/>
+            </w:pPr>
+            <w:r>
+              <w:rPr>
+                <w:rFonts w:ascii="Times New Roman" w:cs="Times New Roman" w:eastAsia="Times New Roman" w:hAnsi="Times New Roman"/>
+                <w:sz w:val="22"/>
+                <w:szCs w:val="22"/>
+              </w:rPr>
+              <w:t xml:space="preserve">– E-202 — короткопутевой испаритель DZQ-2;</w:t>
+            </w:r>
+          </w:p>
+          <w:p>
+            <w:pPr>
+              <w:spacing w:after="20" w:before="20"/>
+              <w:ind w:left="284"/>
+            </w:pPr>
+            <w:r>
+              <w:rPr>
+                <w:rFonts w:ascii="Times New Roman" w:cs="Times New Roman" w:eastAsia="Times New Roman" w:hAnsi="Times New Roman"/>
+                <w:sz w:val="22"/>
+                <w:szCs w:val="22"/>
+              </w:rPr>
+              <w:t xml:space="preserve">– E-204 — собственный паспорт (в предъявленный вложены акт ОТК и протоколы гидроиспытаний от E-201).</w:t>
             </w:r>
           </w:p>
         </w:tc>
@@ -7105,7 +7189,7 @@
                 <w:sz w:val="22"/>
                 <w:szCs w:val="22"/>
               </w:rPr>
-              <w:t xml:space="preserve">8.4</w:t>
+              <w:t xml:space="preserve">8.5</w:t>
             </w:r>
           </w:p>
         </w:tc>
@@ -7136,7 +7220,7 @@
                 <w:sz w:val="22"/>
                 <w:szCs w:val="22"/>
               </w:rPr>
-              <w:t xml:space="preserve">Паспорта аппаратов (п. 4 программы FAT):</w:t>
+              <w:t xml:space="preserve">Сертификаты на материалы (п. 5 программы FAT):</w:t>
             </w:r>
           </w:p>
           <w:p>
@@ -7150,7 +7234,7 @@
                 <w:sz w:val="22"/>
                 <w:szCs w:val="22"/>
               </w:rPr>
-              <w:t xml:space="preserve">– E-101 — подогреватель 3 м² (1-я ступень);</w:t>
+              <w:t xml:space="preserve">– аппаратов E-101, V-103, V-203, E-102, E-202;</w:t>
             </w:r>
           </w:p>
           <w:p>
@@ -7164,7 +7248,7 @@
                 <w:sz w:val="22"/>
                 <w:szCs w:val="22"/>
               </w:rPr>
-              <w:t xml:space="preserve">– V-103 — сборник лёгкой фазы 50 л;</w:t>
+              <w:t xml:space="preserve">– крепежа — по всем аппаратам;</w:t>
             </w:r>
           </w:p>
           <w:p>
@@ -7178,49 +7262,7 @@
                 <w:sz w:val="22"/>
                 <w:szCs w:val="22"/>
               </w:rPr>
-              <w:t xml:space="preserve">– V-203 — сборник конденсата ловушек 20 л;</w:t>
-            </w:r>
-          </w:p>
-          <w:p>
-            <w:pPr>
-              <w:spacing w:after="20" w:before="20"/>
-              <w:ind w:left="284"/>
-            </w:pPr>
-            <w:r>
-              <w:rPr>
-                <w:rFonts w:ascii="Times New Roman" w:cs="Times New Roman" w:eastAsia="Times New Roman" w:hAnsi="Times New Roman"/>
-                <w:sz w:val="22"/>
-                <w:szCs w:val="22"/>
-              </w:rPr>
-              <w:t xml:space="preserve">– E-102 — тонкоплёночный испаритель GXZ-2;</w:t>
-            </w:r>
-          </w:p>
-          <w:p>
-            <w:pPr>
-              <w:spacing w:after="20" w:before="20"/>
-              <w:ind w:left="284"/>
-            </w:pPr>
-            <w:r>
-              <w:rPr>
-                <w:rFonts w:ascii="Times New Roman" w:cs="Times New Roman" w:eastAsia="Times New Roman" w:hAnsi="Times New Roman"/>
-                <w:sz w:val="22"/>
-                <w:szCs w:val="22"/>
-              </w:rPr>
-              <w:t xml:space="preserve">– E-202 — короткопутевой испаритель DZQ-2;</w:t>
-            </w:r>
-          </w:p>
-          <w:p>
-            <w:pPr>
-              <w:spacing w:after="20" w:before="20"/>
-              <w:ind w:left="284"/>
-            </w:pPr>
-            <w:r>
-              <w:rPr>
-                <w:rFonts w:ascii="Times New Roman" w:cs="Times New Roman" w:eastAsia="Times New Roman" w:hAnsi="Times New Roman"/>
-                <w:sz w:val="22"/>
-                <w:szCs w:val="22"/>
-              </w:rPr>
-              <w:t xml:space="preserve">– E-204 — собственный паспорт (в предъявленный вложены акт ОТК и протоколы гидроиспытаний от E-201).</w:t>
+              <w:t xml:space="preserve">– уплотнений — по всем аппаратам.</w:t>
             </w:r>
           </w:p>
         </w:tc>
@@ -7307,7 +7349,7 @@
                 <w:sz w:val="22"/>
                 <w:szCs w:val="22"/>
               </w:rPr>
-              <w:t xml:space="preserve">8.5</w:t>
+              <w:t xml:space="preserve">8.6</w:t>
             </w:r>
           </w:p>
         </w:tc>
@@ -7338,49 +7380,7 @@
                 <w:sz w:val="22"/>
                 <w:szCs w:val="22"/>
               </w:rPr>
-              <w:t xml:space="preserve">Сертификаты на материалы (п. 5 программы FAT):</w:t>
-            </w:r>
-          </w:p>
-          <w:p>
-            <w:pPr>
-              <w:spacing w:after="20" w:before="20"/>
-              <w:ind w:left="284"/>
-            </w:pPr>
-            <w:r>
-              <w:rPr>
-                <w:rFonts w:ascii="Times New Roman" w:cs="Times New Roman" w:eastAsia="Times New Roman" w:hAnsi="Times New Roman"/>
-                <w:sz w:val="22"/>
-                <w:szCs w:val="22"/>
-              </w:rPr>
-              <w:t xml:space="preserve">– аппаратов E-101, V-103, V-203, E-102, E-202;</w:t>
-            </w:r>
-          </w:p>
-          <w:p>
-            <w:pPr>
-              <w:spacing w:after="20" w:before="20"/>
-              <w:ind w:left="284"/>
-            </w:pPr>
-            <w:r>
-              <w:rPr>
-                <w:rFonts w:ascii="Times New Roman" w:cs="Times New Roman" w:eastAsia="Times New Roman" w:hAnsi="Times New Roman"/>
-                <w:sz w:val="22"/>
-                <w:szCs w:val="22"/>
-              </w:rPr>
-              <w:t xml:space="preserve">– крепежа — по всем аппаратам;</w:t>
-            </w:r>
-          </w:p>
-          <w:p>
-            <w:pPr>
-              <w:spacing w:after="20" w:before="20"/>
-              <w:ind w:left="284"/>
-            </w:pPr>
-            <w:r>
-              <w:rPr>
-                <w:rFonts w:ascii="Times New Roman" w:cs="Times New Roman" w:eastAsia="Times New Roman" w:hAnsi="Times New Roman"/>
-                <w:sz w:val="22"/>
-                <w:szCs w:val="22"/>
-              </w:rPr>
-              <w:t xml:space="preserve">– уплотнений — по всем аппаратам.</w:t>
+              <w:t xml:space="preserve">Протоколы неразрушающего контроля: E-101, V-103, V-203, E-102, E-202 (п. 6 программы FAT)</w:t>
             </w:r>
           </w:p>
         </w:tc>
@@ -7467,7 +7467,7 @@
                 <w:sz w:val="22"/>
                 <w:szCs w:val="22"/>
               </w:rPr>
-              <w:t xml:space="preserve">8.6</w:t>
+              <w:t xml:space="preserve">8.7</w:t>
             </w:r>
           </w:p>
         </w:tc>
@@ -7498,7 +7498,7 @@
                 <w:sz w:val="22"/>
                 <w:szCs w:val="22"/>
               </w:rPr>
-              <w:t xml:space="preserve">Протоколы неразрушающего контроля: E-101, V-103, V-203, E-102, E-202 (п. 6 программы FAT)</w:t>
+              <w:t xml:space="preserve">Протоколы гидроиспытаний: E-101, V-103, V-203, E-102 и E-202 (рубашки), E-204; подтверждение сушки после испытаний (п. 7 программы FAT)</w:t>
             </w:r>
           </w:p>
         </w:tc>
@@ -7585,7 +7585,7 @@
                 <w:sz w:val="22"/>
                 <w:szCs w:val="22"/>
               </w:rPr>
-              <w:t xml:space="preserve">8.7</w:t>
+              <w:t xml:space="preserve">8.8</w:t>
             </w:r>
           </w:p>
         </w:tc>
@@ -7616,7 +7616,7 @@
                 <w:sz w:val="22"/>
                 <w:szCs w:val="22"/>
               </w:rPr>
-              <w:t xml:space="preserve">Протоколы гидроиспытаний: E-101, V-103, V-203, E-102 и E-202 (рубашки), E-204; подтверждение сушки после испытаний (п. 7 программы FAT)</w:t>
+              <w:t xml:space="preserve">Протоколы заводских испытаний E-102 и E-202 у изготовителя (LIMA) (п. 8 программы FAT)</w:t>
             </w:r>
           </w:p>
         </w:tc>
@@ -7703,7 +7703,7 @@
                 <w:sz w:val="22"/>
                 <w:szCs w:val="22"/>
               </w:rPr>
-              <w:t xml:space="preserve">8.8</w:t>
+              <w:t xml:space="preserve">8.9</w:t>
             </w:r>
           </w:p>
         </w:tc>
@@ -7734,7 +7734,91 @@
                 <w:sz w:val="22"/>
                 <w:szCs w:val="22"/>
               </w:rPr>
-              <w:t xml:space="preserve">Протоколы заводских испытаний E-102 и E-202 у изготовителя (LIMA) (п. 8 программы FAT)</w:t>
+              <w:t xml:space="preserve">Паспорта и сертификаты на комплектующие (п. 9 программы FAT):</w:t>
+            </w:r>
+          </w:p>
+          <w:p>
+            <w:pPr>
+              <w:spacing w:after="20" w:before="20"/>
+              <w:ind w:left="284"/>
+            </w:pPr>
+            <w:r>
+              <w:rPr>
+                <w:rFonts w:ascii="Times New Roman" w:cs="Times New Roman" w:eastAsia="Times New Roman" w:hAnsi="Times New Roman"/>
+                <w:sz w:val="22"/>
+                <w:szCs w:val="22"/>
+              </w:rPr>
+              <w:t xml:space="preserve">– двигатели (Ex) испарителей, насосов, вакуумных агрегатов;</w:t>
+            </w:r>
+          </w:p>
+          <w:p>
+            <w:pPr>
+              <w:spacing w:after="20" w:before="20"/>
+              <w:ind w:left="284"/>
+            </w:pPr>
+            <w:r>
+              <w:rPr>
+                <w:rFonts w:ascii="Times New Roman" w:cs="Times New Roman" w:eastAsia="Times New Roman" w:hAnsi="Times New Roman"/>
+                <w:sz w:val="22"/>
+                <w:szCs w:val="22"/>
+              </w:rPr>
+              <w:t xml:space="preserve">– редукторы GRF59;</w:t>
+            </w:r>
+          </w:p>
+          <w:p>
+            <w:pPr>
+              <w:spacing w:after="20" w:before="20"/>
+              <w:ind w:left="284"/>
+            </w:pPr>
+            <w:r>
+              <w:rPr>
+                <w:rFonts w:ascii="Times New Roman" w:cs="Times New Roman" w:eastAsia="Times New Roman" w:hAnsi="Times New Roman"/>
+                <w:sz w:val="22"/>
+                <w:szCs w:val="22"/>
+              </w:rPr>
+              <w:t xml:space="preserve">– торцевые уплотнения;</w:t>
+            </w:r>
+          </w:p>
+          <w:p>
+            <w:pPr>
+              <w:spacing w:after="20" w:before="20"/>
+              <w:ind w:left="284"/>
+            </w:pPr>
+            <w:r>
+              <w:rPr>
+                <w:rFonts w:ascii="Times New Roman" w:cs="Times New Roman" w:eastAsia="Times New Roman" w:hAnsi="Times New Roman"/>
+                <w:sz w:val="22"/>
+                <w:szCs w:val="22"/>
+              </w:rPr>
+              <w:t xml:space="preserve">– шестерённые насосы P-101, P-102, P-103, P-202, P-203;</w:t>
+            </w:r>
+          </w:p>
+          <w:p>
+            <w:pPr>
+              <w:spacing w:after="20" w:before="20"/>
+              <w:ind w:left="284"/>
+            </w:pPr>
+            <w:r>
+              <w:rPr>
+                <w:rFonts w:ascii="Times New Roman" w:cs="Times New Roman" w:eastAsia="Times New Roman" w:hAnsi="Times New Roman"/>
+                <w:sz w:val="22"/>
+                <w:szCs w:val="22"/>
+              </w:rPr>
+              <w:t xml:space="preserve">– вакуумный насос VPM-104 и агрегат TCVPM-TK200-JZ150/70-LG50 — паспорта (предъявлены только руководства по эксплуатации);</w:t>
+            </w:r>
+          </w:p>
+          <w:p>
+            <w:pPr>
+              <w:spacing w:after="20" w:before="20"/>
+              <w:ind w:left="284"/>
+            </w:pPr>
+            <w:r>
+              <w:rPr>
+                <w:rFonts w:ascii="Times New Roman" w:cs="Times New Roman" w:eastAsia="Times New Roman" w:hAnsi="Times New Roman"/>
+                <w:sz w:val="22"/>
+                <w:szCs w:val="22"/>
+              </w:rPr>
+              <w:t xml:space="preserve">– чиллеры TCLT-30-AT-40KW, TCHT-30-AT-12KW, TCHT-30-AT.</w:t>
             </w:r>
           </w:p>
         </w:tc>
@@ -7821,7 +7905,7 @@
                 <w:sz w:val="22"/>
                 <w:szCs w:val="22"/>
               </w:rPr>
-              <w:t xml:space="preserve">8.9</w:t>
+              <w:t xml:space="preserve">8.10</w:t>
             </w:r>
           </w:p>
         </w:tc>
@@ -7852,209 +7936,7 @@
                 <w:sz w:val="22"/>
                 <w:szCs w:val="22"/>
               </w:rPr>
-              <w:t xml:space="preserve">Паспорта и сертификаты на комплектующие (п. 9 программы FAT):</w:t>
-            </w:r>
-          </w:p>
-          <w:p>
-            <w:pPr>
-              <w:spacing w:after="20" w:before="20"/>
-              <w:ind w:left="284"/>
-            </w:pPr>
-            <w:r>
-              <w:rPr>
-                <w:rFonts w:ascii="Times New Roman" w:cs="Times New Roman" w:eastAsia="Times New Roman" w:hAnsi="Times New Roman"/>
-                <w:sz w:val="22"/>
-                <w:szCs w:val="22"/>
-              </w:rPr>
-              <w:t xml:space="preserve">– двигатели (Ex) испарителей, насосов, вакуумных агрегатов;</w:t>
-            </w:r>
-          </w:p>
-          <w:p>
-            <w:pPr>
-              <w:spacing w:after="20" w:before="20"/>
-              <w:ind w:left="284"/>
-            </w:pPr>
-            <w:r>
-              <w:rPr>
-                <w:rFonts w:ascii="Times New Roman" w:cs="Times New Roman" w:eastAsia="Times New Roman" w:hAnsi="Times New Roman"/>
-                <w:sz w:val="22"/>
-                <w:szCs w:val="22"/>
-              </w:rPr>
-              <w:t xml:space="preserve">– редукторы GRF59;</w:t>
-            </w:r>
-          </w:p>
-          <w:p>
-            <w:pPr>
-              <w:spacing w:after="20" w:before="20"/>
-              <w:ind w:left="284"/>
-            </w:pPr>
-            <w:r>
-              <w:rPr>
-                <w:rFonts w:ascii="Times New Roman" w:cs="Times New Roman" w:eastAsia="Times New Roman" w:hAnsi="Times New Roman"/>
-                <w:sz w:val="22"/>
-                <w:szCs w:val="22"/>
-              </w:rPr>
-              <w:t xml:space="preserve">– торцевые уплотнения;</w:t>
-            </w:r>
-          </w:p>
-          <w:p>
-            <w:pPr>
-              <w:spacing w:after="20" w:before="20"/>
-              <w:ind w:left="284"/>
-            </w:pPr>
-            <w:r>
-              <w:rPr>
-                <w:rFonts w:ascii="Times New Roman" w:cs="Times New Roman" w:eastAsia="Times New Roman" w:hAnsi="Times New Roman"/>
-                <w:sz w:val="22"/>
-                <w:szCs w:val="22"/>
-              </w:rPr>
-              <w:t xml:space="preserve">– шестерённые насосы P-101, P-102, P-103, P-202, P-203;</w:t>
-            </w:r>
-          </w:p>
-          <w:p>
-            <w:pPr>
-              <w:spacing w:after="20" w:before="20"/>
-              <w:ind w:left="284"/>
-            </w:pPr>
-            <w:r>
-              <w:rPr>
-                <w:rFonts w:ascii="Times New Roman" w:cs="Times New Roman" w:eastAsia="Times New Roman" w:hAnsi="Times New Roman"/>
-                <w:sz w:val="22"/>
-                <w:szCs w:val="22"/>
-              </w:rPr>
-              <w:t xml:space="preserve">– вакуумный насос VPM-104 и агрегат TCVPM-TK200-JZ150/70-LG50 — паспорта (предъявлены только руководства по эксплуатации);</w:t>
-            </w:r>
-          </w:p>
-          <w:p>
-            <w:pPr>
-              <w:spacing w:after="20" w:before="20"/>
-              <w:ind w:left="284"/>
-            </w:pPr>
-            <w:r>
-              <w:rPr>
-                <w:rFonts w:ascii="Times New Roman" w:cs="Times New Roman" w:eastAsia="Times New Roman" w:hAnsi="Times New Roman"/>
-                <w:sz w:val="22"/>
-                <w:szCs w:val="22"/>
-              </w:rPr>
-              <w:t xml:space="preserve">– чиллеры TCLT-30-AT-40KW, TCHT-30-AT-12KW, TCHT-30-AT.</w:t>
-            </w:r>
-          </w:p>
-        </w:tc>
-        <w:tc>
-          <w:tcPr>
-            <w:tcW w:type="dxa" w:w="1000"/>
-            <w:tcBorders>
-              <w:top w:val="single" w:color="808080" w:sz="4"/>
-              <w:left w:val="single" w:color="808080" w:sz="4"/>
-              <w:bottom w:val="single" w:color="808080" w:sz="4"/>
-              <w:right w:val="single" w:color="808080" w:sz="4"/>
-            </w:tcBorders>
-            <w:tcMar>
-              <w:top w:type="dxa" w:w="60"/>
-              <w:left w:type="dxa" w:w="100"/>
-              <w:bottom w:type="dxa" w:w="60"/>
-              <w:right w:type="dxa" w:w="100"/>
-            </w:tcMar>
-            <w:vAlign w:val="top"/>
-          </w:tcPr>
-          <w:p/>
-        </w:tc>
-        <w:tc>
-          <w:tcPr>
-            <w:tcW w:type="dxa" w:w="1800"/>
-            <w:tcBorders>
-              <w:top w:val="single" w:color="808080" w:sz="4"/>
-              <w:left w:val="single" w:color="808080" w:sz="4"/>
-              <w:bottom w:val="single" w:color="808080" w:sz="4"/>
-              <w:right w:val="single" w:color="808080" w:sz="4"/>
-            </w:tcBorders>
-            <w:tcMar>
-              <w:top w:type="dxa" w:w="60"/>
-              <w:left w:type="dxa" w:w="100"/>
-              <w:bottom w:type="dxa" w:w="60"/>
-              <w:right w:type="dxa" w:w="100"/>
-            </w:tcMar>
-            <w:vAlign w:val="top"/>
-          </w:tcPr>
-          <w:p>
-            <w:pPr>
-              <w:spacing w:after="40" w:before="40"/>
-            </w:pPr>
-            <w:r>
-              <w:rPr>
-                <w:rFonts w:ascii="Times New Roman" w:cs="Times New Roman" w:eastAsia="Times New Roman" w:hAnsi="Times New Roman"/>
-                <w:sz w:val="22"/>
-                <w:szCs w:val="22"/>
-              </w:rPr>
-              <w:t xml:space="preserve"/>
-            </w:r>
-          </w:p>
-        </w:tc>
-      </w:tr>
-      <w:tr>
-        <w:trPr>
-          <w:cantSplit/>
-        </w:trPr>
-        <w:tc>
-          <w:tcPr>
-            <w:tcW w:type="dxa" w:w="700"/>
-            <w:tcBorders>
-              <w:top w:val="single" w:color="808080" w:sz="4"/>
-              <w:left w:val="single" w:color="808080" w:sz="4"/>
-              <w:bottom w:val="single" w:color="808080" w:sz="4"/>
-              <w:right w:val="single" w:color="808080" w:sz="4"/>
-            </w:tcBorders>
-            <w:tcMar>
-              <w:top w:type="dxa" w:w="60"/>
-              <w:left w:type="dxa" w:w="100"/>
-              <w:bottom w:type="dxa" w:w="60"/>
-              <w:right w:type="dxa" w:w="100"/>
-            </w:tcMar>
-            <w:vAlign w:val="top"/>
-          </w:tcPr>
-          <w:p>
-            <w:pPr>
-              <w:spacing w:after="40" w:before="40"/>
-              <w:jc w:val="center"/>
-            </w:pPr>
-            <w:r>
-              <w:rPr>
-                <w:rFonts w:ascii="Times New Roman" w:cs="Times New Roman" w:eastAsia="Times New Roman" w:hAnsi="Times New Roman"/>
-                <w:sz w:val="22"/>
-                <w:szCs w:val="22"/>
-              </w:rPr>
-              <w:t xml:space="preserve">8.10</w:t>
-            </w:r>
-          </w:p>
-        </w:tc>
-        <w:tc>
-          <w:tcPr>
-            <w:tcW w:type="dxa" w:w="6138"/>
-            <w:tcBorders>
-              <w:top w:val="single" w:color="808080" w:sz="4"/>
-              <w:left w:val="single" w:color="808080" w:sz="4"/>
-              <w:bottom w:val="single" w:color="808080" w:sz="4"/>
-              <w:right w:val="single" w:color="808080" w:sz="4"/>
-            </w:tcBorders>
-            <w:tcMar>
-              <w:top w:type="dxa" w:w="60"/>
-              <w:left w:type="dxa" w:w="100"/>
-              <w:bottom w:type="dxa" w:w="60"/>
-              <w:right w:type="dxa" w:w="100"/>
-            </w:tcMar>
-            <w:vAlign w:val="top"/>
-          </w:tcPr>
-          <w:p>
-            <w:pPr>
-              <w:spacing w:after="40" w:before="40"/>
-            </w:pPr>
-            <w:r>
-              <w:rPr>
-                <w:rFonts w:ascii="Times New Roman" w:cs="Times New Roman" w:eastAsia="Times New Roman" w:hAnsi="Times New Roman"/>
-                <w:sz w:val="22"/>
-                <w:szCs w:val="22"/>
-              </w:rPr>
-              <w:t xml:space="preserve">КИП (п. 9 программы FAT):</w:t>
+              <w:t xml:space="preserve">КИП (п. 10 программы FAT):</w:t>
             </w:r>
           </w:p>
           <w:p>
@@ -9184,7 +9066,7 @@
                 <w:sz w:val="20"/>
                 <w:szCs w:val="20"/>
               </w:rPr>
-              <w:t xml:space="preserve">Зазор между поручнями лестницы и поручнем перил (п. 3.4)</w:t>
+              <w:t xml:space="preserve">Зазор между поручнями лестницы и поручнем перил (п. 3.3)</w:t>
             </w:r>
           </w:p>
         </w:tc>
@@ -9271,7 +9153,7 @@
                 <w:sz w:val="20"/>
                 <w:szCs w:val="20"/>
               </w:rPr>
-              <w:t xml:space="preserve">Ограждение лестницы — требуемая высота 2 м от пола (п. 3.5)</w:t>
+              <w:t xml:space="preserve">Ограждение лестницы — требуемая высота 2 м от пола (п. 3.4)</w:t>
             </w:r>
           </w:p>
         </w:tc>
@@ -9363,7 +9245,7 @@
                 <w:sz w:val="20"/>
                 <w:szCs w:val="20"/>
               </w:rPr>
-              <w:t xml:space="preserve">Бортовое ограждение площадки — требуемая высота 150 мм (п. 3.6)</w:t>
+              <w:t xml:space="preserve">Бортовое ограждение площадки — требуемая высота 150 мм (п. 3.5)</w:t>
             </w:r>
           </w:p>
         </w:tc>
@@ -9450,7 +9332,7 @@
                 <w:sz w:val="20"/>
                 <w:szCs w:val="20"/>
               </w:rPr>
-              <w:t xml:space="preserve">Не загнуты лепестки стопорных шайб (п. 3.9)</w:t>
+              <w:t xml:space="preserve">Не загнуты лепестки стопорных шайб (п. 3.8)</w:t>
             </w:r>
           </w:p>
         </w:tc>
@@ -9542,7 +9424,7 @@
                 <w:sz w:val="20"/>
                 <w:szCs w:val="20"/>
               </w:rPr>
-              <w:t xml:space="preserve">Конфликт колбы затворной жидкости с фланцем (п. 3.10)</w:t>
+              <w:t xml:space="preserve">Конфликт колбы затворной жидкости с фланцем (п. 3.9)</w:t>
             </w:r>
           </w:p>
         </w:tc>
@@ -9629,7 +9511,7 @@
                 <w:sz w:val="20"/>
                 <w:szCs w:val="20"/>
               </w:rPr>
-              <w:t xml:space="preserve">Винтовой насос на short path (п. 3.11)</w:t>
+              <w:t xml:space="preserve">Винтовой насос на short path (п. 3.10)</w:t>
             </w:r>
           </w:p>
         </w:tc>

</xml_diff>